<commit_message>
Make some edits to ClojureCLR Compiler NOtes.docx
</commit_message>
<xml_diff>
--- a/docs/ClojureCLR Compiler Notes.docx
+++ b/docs/ClojureCLR Compiler Notes.docx
@@ -4110,63 +4110,33 @@
     <w:p>
       <w:pPr>
         <w:pStyle w:val="Heading2"/>
-        <w:rPr>
-          <w:lang w:val="fr-FR"/>
-        </w:rPr>
-      </w:pPr>
-      <w:r>
-        <w:rPr>
-          <w:lang w:val="fr-FR"/>
-        </w:rPr>
+      </w:pPr>
+      <w:r>
         <w:lastRenderedPageBreak/>
-        <w:t xml:space="preserve">Usage </w:t>
-      </w:r>
-      <w:proofErr w:type="spellStart"/>
-      <w:r>
-        <w:rPr>
-          <w:lang w:val="fr-FR"/>
-        </w:rPr>
-        <w:t>a</w:t>
-      </w:r>
-      <w:r>
-        <w:rPr>
-          <w:lang w:val="fr-FR"/>
-        </w:rPr>
-        <w:t>nalysis</w:t>
-      </w:r>
-      <w:proofErr w:type="spellEnd"/>
-    </w:p>
-    <w:p>
-      <w:pPr>
-        <w:rPr>
-          <w:rFonts w:ascii="Lucida Sans" w:hAnsi="Lucida Sans"/>
-          <w:lang w:val="fr-FR"/>
-        </w:rPr>
-      </w:pPr>
-      <w:proofErr w:type="spellStart"/>
-      <w:r>
-        <w:rPr>
-          <w:rFonts w:ascii="Lucida Sans" w:hAnsi="Lucida Sans"/>
-          <w:lang w:val="fr-FR"/>
+        <w:t>Usage analysis</w:t>
+      </w:r>
+    </w:p>
+    <w:p>
+      <w:pPr>
+        <w:rPr>
+          <w:rFonts w:ascii="Lucida Sans" w:hAnsi="Lucida Sans"/>
+        </w:rPr>
+      </w:pPr>
+      <w:r>
+        <w:rPr>
+          <w:rFonts w:ascii="Lucida Sans" w:hAnsi="Lucida Sans"/>
         </w:rPr>
         <w:t>LocalEnvVar</w:t>
       </w:r>
-      <w:proofErr w:type="spellEnd"/>
-      <w:r>
-        <w:rPr>
-          <w:lang w:val="fr-FR"/>
-        </w:rPr>
+      <w:r>
         <w:t xml:space="preserve"> + </w:t>
       </w:r>
-      <w:proofErr w:type="spellStart"/>
-      <w:r>
-        <w:rPr>
-          <w:rFonts w:ascii="Lucida Sans" w:hAnsi="Lucida Sans"/>
-          <w:lang w:val="fr-FR"/>
+      <w:r>
+        <w:rPr>
+          <w:rFonts w:ascii="Lucida Sans" w:hAnsi="Lucida Sans"/>
         </w:rPr>
         <w:t>NextLocalNumVar</w:t>
       </w:r>
-      <w:proofErr w:type="spellEnd"/>
     </w:p>
     <w:p>
       <w:r>
@@ -4174,14 +4144,12 @@
       </w:r>
     </w:p>
     <w:p>
-      <w:proofErr w:type="spellStart"/>
       <w:r>
         <w:rPr>
           <w:rFonts w:ascii="Lucida Sans" w:hAnsi="Lucida Sans"/>
         </w:rPr>
         <w:t>LocalEnvVar</w:t>
       </w:r>
-      <w:proofErr w:type="spellEnd"/>
       <w:r>
         <w:t xml:space="preserve"> i</w:t>
       </w:r>
@@ -4191,14 +4159,12 @@
       <w:r>
         <w:t xml:space="preserve"> </w:t>
       </w:r>
-      <w:proofErr w:type="spellStart"/>
       <w:r>
         <w:rPr>
           <w:rFonts w:ascii="Lucida Sans" w:hAnsi="Lucida Sans"/>
         </w:rPr>
         <w:t>IPersistentMap</w:t>
       </w:r>
-      <w:proofErr w:type="spellEnd"/>
       <w:r>
         <w:t xml:space="preserve">, mapping </w:t>
       </w:r>
@@ -4211,7 +4177,6 @@
       <w:r>
         <w:t xml:space="preserve">s to </w:t>
       </w:r>
-      <w:proofErr w:type="spellStart"/>
       <w:r>
         <w:rPr>
           <w:rFonts w:ascii="Lucida Sans" w:hAnsi="Lucida Sans"/>
@@ -4221,66 +4186,15 @@
       <w:r>
         <w:t>s</w:t>
       </w:r>
-      <w:proofErr w:type="spellEnd"/>
-    </w:p>
-    <w:p>
-      <w:r>
-        <w:t xml:space="preserve">Binding for </w:t>
-      </w:r>
-      <w:proofErr w:type="spellStart"/>
-      <w:r>
-        <w:t>LocalEnvVar</w:t>
-      </w:r>
-      <w:proofErr w:type="spellEnd"/>
-      <w:r>
-        <w:t xml:space="preserve"> modified in </w:t>
-      </w:r>
-      <w:proofErr w:type="spellStart"/>
-      <w:r>
-        <w:t>CompilerRegisterLocalInternal</w:t>
-      </w:r>
-      <w:proofErr w:type="spellEnd"/>
-      <w:r>
-        <w:t xml:space="preserve"> (Called by a host of </w:t>
-      </w:r>
-      <w:proofErr w:type="spellStart"/>
-      <w:r>
-        <w:t>CompilerRegisterLocalXXX</w:t>
-      </w:r>
-      <w:proofErr w:type="spellEnd"/>
-      <w:r>
-        <w:t xml:space="preserve"> methods.)  This also calls </w:t>
-      </w:r>
-      <w:proofErr w:type="spellStart"/>
-      <w:r>
-        <w:t>Compiler.GetAndIncLocalNum</w:t>
-      </w:r>
-      <w:proofErr w:type="spellEnd"/>
-      <w:r>
-        <w:t xml:space="preserve">, which modifies </w:t>
-      </w:r>
-      <w:proofErr w:type="spellStart"/>
-      <w:r>
-        <w:t>NextLocalNumVar</w:t>
-      </w:r>
-      <w:proofErr w:type="spellEnd"/>
-    </w:p>
-    <w:p>
-      <w:proofErr w:type="spellStart"/>
-      <w:r>
-        <w:t>LocalEnvVar</w:t>
-      </w:r>
-      <w:proofErr w:type="spellEnd"/>
-      <w:r>
-        <w:t xml:space="preserve"> accessed in </w:t>
-      </w:r>
-      <w:proofErr w:type="spellStart"/>
-      <w:r>
-        <w:t>Compiler.ReferenceLocal</w:t>
-      </w:r>
-      <w:proofErr w:type="spellEnd"/>
-      <w:r>
-        <w:t xml:space="preserve"> for binding lookup.</w:t>
+    </w:p>
+    <w:p>
+      <w:r>
+        <w:t>Binding for LocalEnvVar modified in CompilerRegisterLocalInternal (Called by a host of CompilerRegisterLocalXXX methods.)  This also calls Compiler.GetAndIncLocalNum, which modifies NextLocalNumVar</w:t>
+      </w:r>
+    </w:p>
+    <w:p>
+      <w:r>
+        <w:t>LocalEnvVar accessed in Compiler.ReferenceLocal for binding lookup.</w:t>
       </w:r>
     </w:p>
     <w:p>
@@ -4290,116 +4204,29 @@
     </w:p>
     <w:p>
       <w:r>
-        <w:t xml:space="preserve">In </w:t>
-      </w:r>
-      <w:proofErr w:type="spellStart"/>
-      <w:r>
-        <w:t>HostExpr.MaybeType</w:t>
-      </w:r>
-      <w:proofErr w:type="spellEnd"/>
-      <w:r>
-        <w:t xml:space="preserve"> – When </w:t>
-      </w:r>
-      <w:proofErr w:type="spellStart"/>
-      <w:r>
-        <w:t>MaybeType</w:t>
-      </w:r>
-      <w:proofErr w:type="spellEnd"/>
-      <w:r>
-        <w:t xml:space="preserve"> is passed a symbol, make sure it does not have a local binding before calling </w:t>
-      </w:r>
-      <w:proofErr w:type="spellStart"/>
-      <w:r>
-        <w:t>RT.classForName</w:t>
-      </w:r>
-      <w:proofErr w:type="spellEnd"/>
-      <w:r>
-        <w:t>.</w:t>
-      </w:r>
-    </w:p>
-    <w:p>
-      <w:r>
-        <w:t xml:space="preserve">Bound to null in:  </w:t>
-      </w:r>
-      <w:proofErr w:type="spellStart"/>
-      <w:r>
-        <w:t>Compiler.Compile</w:t>
-      </w:r>
-      <w:proofErr w:type="spellEnd"/>
-      <w:r>
-        <w:t xml:space="preserve">, </w:t>
-      </w:r>
-      <w:proofErr w:type="spellStart"/>
-      <w:r>
-        <w:t>Compiler.load</w:t>
-      </w:r>
-      <w:proofErr w:type="spellEnd"/>
-    </w:p>
-    <w:p>
-      <w:r>
-        <w:t xml:space="preserve">Bound to self (pushed new binding) in: </w:t>
-      </w:r>
-      <w:proofErr w:type="spellStart"/>
-      <w:r>
-        <w:t>FnMethod.Parse</w:t>
-      </w:r>
-      <w:proofErr w:type="spellEnd"/>
-      <w:r>
-        <w:t xml:space="preserve">, </w:t>
-      </w:r>
-      <w:proofErr w:type="spellStart"/>
-      <w:r>
-        <w:t>LetExpr.Parser.Parse</w:t>
-      </w:r>
-      <w:proofErr w:type="spellEnd"/>
-      <w:r>
-        <w:t xml:space="preserve">, </w:t>
-      </w:r>
-      <w:proofErr w:type="spellStart"/>
-      <w:r>
-        <w:t>LetFnExpr.Parser.Parse</w:t>
-      </w:r>
-      <w:proofErr w:type="spellEnd"/>
-      <w:r>
-        <w:t xml:space="preserve">, </w:t>
-      </w:r>
-      <w:proofErr w:type="spellStart"/>
-      <w:r>
-        <w:t>NewInstanceMethod.Parse</w:t>
-      </w:r>
-      <w:proofErr w:type="spellEnd"/>
-      <w:r>
-        <w:t xml:space="preserve">, </w:t>
-      </w:r>
-      <w:proofErr w:type="spellStart"/>
-      <w:r>
-        <w:t>TryExpr.Parser.Parse</w:t>
-      </w:r>
-      <w:proofErr w:type="spellEnd"/>
+        <w:t>In HostExpr.MaybeType – When MaybeType is passed a symbol, make sure it does not have a local binding before calling RT.classForName.</w:t>
+      </w:r>
+    </w:p>
+    <w:p>
+      <w:r>
+        <w:t>Bound to null in:  Compiler.Compile, Compiler.load</w:t>
+      </w:r>
+    </w:p>
+    <w:p>
+      <w:r>
+        <w:t>Bound to self (pushed new binding) in: FnMethod.Parse, LetExpr.Parser.Parse, LetFnExpr.Parser.Parse, NewInstanceMethod.Parse, TryExpr.Parser.Parse</w:t>
+      </w:r>
     </w:p>
     <w:p>
       <w:r>
         <w:t xml:space="preserve">Bound to </w:t>
       </w:r>
       <w:r>
-        <w:t xml:space="preserve">the fields discovered in parsing a </w:t>
-      </w:r>
-      <w:proofErr w:type="spellStart"/>
-      <w:r>
-        <w:t>deftype</w:t>
-      </w:r>
-      <w:proofErr w:type="spellEnd"/>
-      <w:r>
-        <w:t xml:space="preserve"> or reify form</w:t>
-      </w:r>
-      <w:r>
-        <w:t xml:space="preserve"> in </w:t>
-      </w:r>
-      <w:proofErr w:type="spellStart"/>
-      <w:r>
-        <w:t>NewInstanceExpr.Build</w:t>
-      </w:r>
-      <w:proofErr w:type="spellEnd"/>
+        <w:t>the fields discovered in parsing a deftype or reify form</w:t>
+      </w:r>
+      <w:r>
+        <w:t xml:space="preserve"> in NewInstanceExpr.Build</w:t>
+      </w:r>
       <w:r>
         <w:t>, for use in parsing the methods.</w:t>
       </w:r>
@@ -4432,11 +4259,9 @@
             <w:pPr>
               <w:jc w:val="both"/>
             </w:pPr>
-            <w:proofErr w:type="spellStart"/>
             <w:r>
               <w:t>MethodVar</w:t>
             </w:r>
-            <w:proofErr w:type="spellEnd"/>
           </w:p>
         </w:tc>
         <w:tc>
@@ -4445,10 +4270,7 @@
           </w:tcPr>
           <w:p>
             <w:r>
-              <w:t>N</w:t>
-            </w:r>
-            <w:r>
-              <w:t>ull</w:t>
+              <w:t>Null</w:t>
             </w:r>
             <w:r>
               <w:t xml:space="preserve"> </w:t>
@@ -4471,11 +4293,9 @@
             <w:pPr>
               <w:jc w:val="both"/>
             </w:pPr>
-            <w:proofErr w:type="spellStart"/>
             <w:r>
               <w:t>LocalEnvVar</w:t>
             </w:r>
-            <w:proofErr w:type="spellEnd"/>
           </w:p>
         </w:tc>
         <w:tc>
@@ -4504,11 +4324,9 @@
             <w:pPr>
               <w:jc w:val="both"/>
             </w:pPr>
-            <w:proofErr w:type="spellStart"/>
             <w:r>
               <w:t>LoopLocalsVar</w:t>
             </w:r>
-            <w:proofErr w:type="spellEnd"/>
           </w:p>
         </w:tc>
         <w:tc>
@@ -4537,11 +4355,9 @@
             <w:pPr>
               <w:jc w:val="both"/>
             </w:pPr>
-            <w:proofErr w:type="spellStart"/>
             <w:r>
               <w:t>NextLocalNumVar</w:t>
             </w:r>
-            <w:proofErr w:type="spellEnd"/>
           </w:p>
         </w:tc>
         <w:tc>
@@ -4594,11 +4410,9 @@
             <w:pPr>
               <w:jc w:val="both"/>
             </w:pPr>
-            <w:proofErr w:type="spellStart"/>
             <w:r>
               <w:t>ConstantsVar</w:t>
             </w:r>
-            <w:proofErr w:type="spellEnd"/>
           </w:p>
         </w:tc>
         <w:tc>
@@ -4606,11 +4420,9 @@
             <w:tcW w:w="2898" w:type="dxa"/>
           </w:tcPr>
           <w:p>
-            <w:proofErr w:type="spellStart"/>
             <w:r>
               <w:t>PersistentVector.EMPTY</w:t>
             </w:r>
-            <w:proofErr w:type="spellEnd"/>
           </w:p>
         </w:tc>
         <w:tc>
@@ -4629,11 +4441,9 @@
             <w:pPr>
               <w:jc w:val="both"/>
             </w:pPr>
-            <w:proofErr w:type="spellStart"/>
             <w:r>
               <w:t>ConstantIdsVar</w:t>
             </w:r>
-            <w:proofErr w:type="spellEnd"/>
           </w:p>
         </w:tc>
         <w:tc>
@@ -4642,15 +4452,7 @@
           </w:tcPr>
           <w:p>
             <w:r>
-              <w:t xml:space="preserve">new </w:t>
-            </w:r>
-            <w:proofErr w:type="spellStart"/>
-            <w:r>
-              <w:t>IdentityHashMap</w:t>
-            </w:r>
-            <w:proofErr w:type="spellEnd"/>
-            <w:r>
-              <w:t>()</w:t>
+              <w:t>new IdentityHashMap()</w:t>
             </w:r>
           </w:p>
         </w:tc>
@@ -4670,11 +4472,9 @@
             <w:pPr>
               <w:jc w:val="both"/>
             </w:pPr>
-            <w:proofErr w:type="spellStart"/>
             <w:r>
               <w:t>KeywordsVar</w:t>
             </w:r>
-            <w:proofErr w:type="spellEnd"/>
           </w:p>
         </w:tc>
         <w:tc>
@@ -4682,11 +4482,9 @@
             <w:tcW w:w="2898" w:type="dxa"/>
           </w:tcPr>
           <w:p>
-            <w:proofErr w:type="spellStart"/>
             <w:r>
               <w:t>PersistentHashMap.EMPTY</w:t>
             </w:r>
-            <w:proofErr w:type="spellEnd"/>
           </w:p>
         </w:tc>
         <w:tc>
@@ -4705,11 +4503,9 @@
             <w:pPr>
               <w:jc w:val="both"/>
             </w:pPr>
-            <w:proofErr w:type="spellStart"/>
             <w:r>
               <w:t>VarsVar</w:t>
             </w:r>
-            <w:proofErr w:type="spellEnd"/>
           </w:p>
         </w:tc>
         <w:tc>
@@ -4717,11 +4513,9 @@
             <w:tcW w:w="2898" w:type="dxa"/>
           </w:tcPr>
           <w:p>
-            <w:proofErr w:type="spellStart"/>
             <w:r>
               <w:t>PersistentHashMap.EMPTY</w:t>
             </w:r>
-            <w:proofErr w:type="spellEnd"/>
           </w:p>
         </w:tc>
         <w:tc>
@@ -4764,11 +4558,9 @@
             <w:pPr>
               <w:jc w:val="both"/>
             </w:pPr>
-            <w:proofErr w:type="spellStart"/>
             <w:r>
               <w:t>CompilerContextVar</w:t>
             </w:r>
-            <w:proofErr w:type="spellEnd"/>
           </w:p>
         </w:tc>
         <w:tc>
@@ -4797,11 +4589,9 @@
             <w:pPr>
               <w:jc w:val="both"/>
             </w:pPr>
-            <w:proofErr w:type="spellStart"/>
             <w:r>
               <w:t>CompilerActiveVar</w:t>
             </w:r>
-            <w:proofErr w:type="spellEnd"/>
           </w:p>
         </w:tc>
         <w:tc>
@@ -4929,21 +4719,12 @@
                 <w:szCs w:val="16"/>
               </w:rPr>
             </w:pPr>
-            <w:proofErr w:type="spellStart"/>
-            <w:r>
-              <w:rPr>
-                <w:sz w:val="16"/>
-                <w:szCs w:val="16"/>
-              </w:rPr>
-              <w:t>FnMethod</w:t>
-            </w:r>
-            <w:proofErr w:type="spellEnd"/>
-            <w:r>
-              <w:rPr>
-                <w:sz w:val="16"/>
-                <w:szCs w:val="16"/>
-              </w:rPr>
-              <w:t>.</w:t>
+            <w:r>
+              <w:rPr>
+                <w:sz w:val="16"/>
+                <w:szCs w:val="16"/>
+              </w:rPr>
+              <w:t>FnMethod.</w:t>
             </w:r>
           </w:p>
           <w:p>
@@ -4978,23 +4759,7 @@
                 <w:sz w:val="16"/>
                 <w:szCs w:val="16"/>
               </w:rPr>
-              <w:t>Let(</w:t>
-            </w:r>
-            <w:proofErr w:type="spellStart"/>
-            <w:r>
-              <w:rPr>
-                <w:sz w:val="16"/>
-                <w:szCs w:val="16"/>
-              </w:rPr>
-              <w:t>fn</w:t>
-            </w:r>
-            <w:proofErr w:type="spellEnd"/>
-            <w:r>
-              <w:rPr>
-                <w:sz w:val="16"/>
-                <w:szCs w:val="16"/>
-              </w:rPr>
-              <w:t>)Expr:</w:t>
+              <w:t>Let(fn)Expr:</w:t>
             </w:r>
           </w:p>
           <w:p>
@@ -5139,21 +4904,12 @@
                 <w:szCs w:val="16"/>
               </w:rPr>
             </w:pPr>
-            <w:proofErr w:type="spellStart"/>
-            <w:r>
-              <w:rPr>
-                <w:sz w:val="16"/>
-                <w:szCs w:val="16"/>
-              </w:rPr>
-              <w:t>TryExpr</w:t>
-            </w:r>
-            <w:proofErr w:type="spellEnd"/>
-            <w:r>
-              <w:rPr>
-                <w:sz w:val="16"/>
-                <w:szCs w:val="16"/>
-              </w:rPr>
-              <w:t>.</w:t>
+            <w:r>
+              <w:rPr>
+                <w:sz w:val="16"/>
+                <w:szCs w:val="16"/>
+              </w:rPr>
+              <w:t>TryExpr.</w:t>
             </w:r>
           </w:p>
           <w:p>
@@ -5198,21 +4954,12 @@
                 <w:szCs w:val="16"/>
               </w:rPr>
             </w:pPr>
-            <w:proofErr w:type="spellStart"/>
-            <w:r>
-              <w:rPr>
-                <w:sz w:val="16"/>
-                <w:szCs w:val="16"/>
-              </w:rPr>
-              <w:t>FnExpr</w:t>
-            </w:r>
-            <w:proofErr w:type="spellEnd"/>
-            <w:r>
-              <w:rPr>
-                <w:sz w:val="16"/>
-                <w:szCs w:val="16"/>
-              </w:rPr>
-              <w:t>:</w:t>
+            <w:r>
+              <w:rPr>
+                <w:sz w:val="16"/>
+                <w:szCs w:val="16"/>
+              </w:rPr>
+              <w:t>FnExpr:</w:t>
             </w:r>
           </w:p>
           <w:p>
@@ -5245,7 +4992,6 @@
                 <w:szCs w:val="16"/>
               </w:rPr>
             </w:pPr>
-            <w:proofErr w:type="spellStart"/>
             <w:r>
               <w:rPr>
                 <w:sz w:val="16"/>
@@ -5253,7 +4999,6 @@
               </w:rPr>
               <w:t>MethodVar</w:t>
             </w:r>
-            <w:proofErr w:type="spellEnd"/>
           </w:p>
         </w:tc>
         <w:tc>
@@ -5409,7 +5154,6 @@
                 <w:szCs w:val="16"/>
               </w:rPr>
             </w:pPr>
-            <w:proofErr w:type="spellStart"/>
             <w:r>
               <w:rPr>
                 <w:sz w:val="16"/>
@@ -5417,7 +5161,6 @@
               </w:rPr>
               <w:t>LocalEnvVar</w:t>
             </w:r>
-            <w:proofErr w:type="spellEnd"/>
           </w:p>
         </w:tc>
         <w:tc>
@@ -5587,7 +5330,6 @@
                 <w:szCs w:val="16"/>
               </w:rPr>
             </w:pPr>
-            <w:proofErr w:type="spellStart"/>
             <w:r>
               <w:rPr>
                 <w:sz w:val="16"/>
@@ -5595,7 +5337,6 @@
               </w:rPr>
               <w:t>LoopLocalsVar</w:t>
             </w:r>
-            <w:proofErr w:type="spellEnd"/>
           </w:p>
         </w:tc>
         <w:tc>
@@ -5744,7 +5485,6 @@
                 <w:szCs w:val="16"/>
               </w:rPr>
             </w:pPr>
-            <w:proofErr w:type="spellStart"/>
             <w:r>
               <w:rPr>
                 <w:sz w:val="16"/>
@@ -5752,7 +5492,6 @@
               </w:rPr>
               <w:t>NextLocalNumVar</w:t>
             </w:r>
-            <w:proofErr w:type="spellEnd"/>
           </w:p>
         </w:tc>
         <w:tc>
@@ -5826,7 +5565,6 @@
                 <w:szCs w:val="16"/>
               </w:rPr>
             </w:pPr>
-            <w:proofErr w:type="spellStart"/>
             <w:r>
               <w:rPr>
                 <w:sz w:val="16"/>
@@ -5834,7 +5572,6 @@
               </w:rPr>
               <w:t>currentval</w:t>
             </w:r>
-            <w:proofErr w:type="spellEnd"/>
           </w:p>
         </w:tc>
         <w:tc>
@@ -5886,17 +5623,8 @@
                 <w:sz w:val="16"/>
                 <w:szCs w:val="16"/>
               </w:rPr>
-              <w:t xml:space="preserve">Current </w:t>
-            </w:r>
-            <w:proofErr w:type="spellStart"/>
-            <w:r>
-              <w:rPr>
-                <w:sz w:val="16"/>
-                <w:szCs w:val="16"/>
-              </w:rPr>
-              <w:t>val</w:t>
-            </w:r>
-            <w:proofErr w:type="spellEnd"/>
+              <w:t>Current val</w:t>
+            </w:r>
           </w:p>
         </w:tc>
         <w:tc>
@@ -6046,7 +5774,6 @@
                 <w:szCs w:val="16"/>
               </w:rPr>
             </w:pPr>
-            <w:proofErr w:type="spellStart"/>
             <w:r>
               <w:rPr>
                 <w:sz w:val="16"/>
@@ -6054,7 +5781,6 @@
               </w:rPr>
               <w:t>ConstantsVar</w:t>
             </w:r>
-            <w:proofErr w:type="spellEnd"/>
           </w:p>
         </w:tc>
         <w:tc>
@@ -6196,7 +5922,6 @@
                 <w:szCs w:val="16"/>
               </w:rPr>
             </w:pPr>
-            <w:proofErr w:type="spellStart"/>
             <w:r>
               <w:rPr>
                 <w:sz w:val="16"/>
@@ -6204,7 +5929,6 @@
               </w:rPr>
               <w:t>ConstantIdsVar</w:t>
             </w:r>
-            <w:proofErr w:type="spellEnd"/>
           </w:p>
         </w:tc>
         <w:tc>
@@ -6346,7 +6070,6 @@
                 <w:szCs w:val="16"/>
               </w:rPr>
             </w:pPr>
-            <w:proofErr w:type="spellStart"/>
             <w:r>
               <w:rPr>
                 <w:sz w:val="16"/>
@@ -6354,7 +6077,6 @@
               </w:rPr>
               <w:t>KeywordsVar</w:t>
             </w:r>
-            <w:proofErr w:type="spellEnd"/>
           </w:p>
         </w:tc>
         <w:tc>
@@ -6496,7 +6218,6 @@
                 <w:szCs w:val="16"/>
               </w:rPr>
             </w:pPr>
-            <w:proofErr w:type="spellStart"/>
             <w:r>
               <w:rPr>
                 <w:sz w:val="16"/>
@@ -6504,7 +6225,6 @@
               </w:rPr>
               <w:t>VarsVar</w:t>
             </w:r>
-            <w:proofErr w:type="spellEnd"/>
           </w:p>
         </w:tc>
         <w:tc>
@@ -6646,7 +6366,6 @@
                 <w:szCs w:val="16"/>
               </w:rPr>
             </w:pPr>
-            <w:proofErr w:type="spellStart"/>
             <w:r>
               <w:rPr>
                 <w:sz w:val="16"/>
@@ -6654,7 +6373,6 @@
               </w:rPr>
               <w:t>KewordCallsitesVar</w:t>
             </w:r>
-            <w:proofErr w:type="spellEnd"/>
           </w:p>
         </w:tc>
         <w:tc>
@@ -6789,7 +6507,6 @@
                 <w:szCs w:val="16"/>
               </w:rPr>
             </w:pPr>
-            <w:proofErr w:type="spellStart"/>
             <w:r>
               <w:rPr>
                 <w:sz w:val="16"/>
@@ -6797,7 +6514,6 @@
               </w:rPr>
               <w:t>ProtocolCallsitesVar</w:t>
             </w:r>
-            <w:proofErr w:type="spellEnd"/>
           </w:p>
         </w:tc>
         <w:tc>
@@ -6932,7 +6648,6 @@
                 <w:szCs w:val="16"/>
               </w:rPr>
             </w:pPr>
-            <w:proofErr w:type="spellStart"/>
             <w:r>
               <w:rPr>
                 <w:sz w:val="16"/>
@@ -6940,7 +6655,6 @@
               </w:rPr>
               <w:t>VarCallsitesVar</w:t>
             </w:r>
-            <w:proofErr w:type="spellEnd"/>
           </w:p>
         </w:tc>
         <w:tc>
@@ -7082,7 +6796,6 @@
                 <w:szCs w:val="16"/>
               </w:rPr>
             </w:pPr>
-            <w:proofErr w:type="spellStart"/>
             <w:r>
               <w:rPr>
                 <w:sz w:val="16"/>
@@ -7090,7 +6803,6 @@
               </w:rPr>
               <w:t>NoRecurVar</w:t>
             </w:r>
-            <w:proofErr w:type="spellEnd"/>
           </w:p>
         </w:tc>
         <w:tc>
@@ -7232,7 +6944,6 @@
                 <w:szCs w:val="16"/>
               </w:rPr>
             </w:pPr>
-            <w:proofErr w:type="spellStart"/>
             <w:r>
               <w:rPr>
                 <w:sz w:val="16"/>
@@ -7240,7 +6951,6 @@
               </w:rPr>
               <w:t>LoopLabelVar</w:t>
             </w:r>
-            <w:proofErr w:type="spellEnd"/>
           </w:p>
         </w:tc>
         <w:tc>
@@ -7293,7 +7003,6 @@
                 <w:szCs w:val="16"/>
               </w:rPr>
             </w:pPr>
-            <w:proofErr w:type="spellStart"/>
             <w:r>
               <w:rPr>
                 <w:sz w:val="16"/>
@@ -7301,7 +7010,6 @@
               </w:rPr>
               <w:t>loopLabel</w:t>
             </w:r>
-            <w:proofErr w:type="spellEnd"/>
           </w:p>
         </w:tc>
         <w:tc>
@@ -7490,7 +7198,6 @@
                 <w:szCs w:val="16"/>
               </w:rPr>
             </w:pPr>
-            <w:proofErr w:type="spellStart"/>
             <w:r>
               <w:rPr>
                 <w:sz w:val="16"/>
@@ -7498,7 +7205,6 @@
               </w:rPr>
               <w:t>CompilerContextVar</w:t>
             </w:r>
-            <w:proofErr w:type="spellEnd"/>
           </w:p>
         </w:tc>
         <w:tc>
@@ -7640,7 +7346,6 @@
                 <w:szCs w:val="16"/>
               </w:rPr>
             </w:pPr>
-            <w:proofErr w:type="spellStart"/>
             <w:r>
               <w:rPr>
                 <w:sz w:val="16"/>
@@ -7648,7 +7353,6 @@
               </w:rPr>
               <w:t>CompilerActiveVar</w:t>
             </w:r>
-            <w:proofErr w:type="spellEnd"/>
           </w:p>
         </w:tc>
         <w:tc>
@@ -7903,7 +7607,6 @@
                 <w:szCs w:val="16"/>
               </w:rPr>
             </w:pPr>
-            <w:proofErr w:type="spellStart"/>
             <w:r>
               <w:rPr>
                 <w:sz w:val="16"/>
@@ -7911,7 +7614,6 @@
               </w:rPr>
               <w:t>MethodReturnContextVar</w:t>
             </w:r>
-            <w:proofErr w:type="spellEnd"/>
           </w:p>
         </w:tc>
         <w:tc>
@@ -8180,7 +7882,6 @@
                 <w:szCs w:val="16"/>
               </w:rPr>
             </w:pPr>
-            <w:proofErr w:type="spellStart"/>
             <w:r>
               <w:rPr>
                 <w:sz w:val="16"/>
@@ -8188,7 +7889,6 @@
               </w:rPr>
               <w:t>CompileStubSymVar</w:t>
             </w:r>
-            <w:proofErr w:type="spellEnd"/>
           </w:p>
         </w:tc>
         <w:tc>
@@ -8316,7 +8016,6 @@
                 <w:szCs w:val="16"/>
               </w:rPr>
             </w:pPr>
-            <w:proofErr w:type="spellStart"/>
             <w:r>
               <w:rPr>
                 <w:sz w:val="16"/>
@@ -8324,7 +8023,6 @@
               </w:rPr>
               <w:t>CompileStubClassVar</w:t>
             </w:r>
-            <w:proofErr w:type="spellEnd"/>
           </w:p>
         </w:tc>
         <w:tc>
@@ -8390,7 +8088,6 @@
                 <w:szCs w:val="16"/>
               </w:rPr>
             </w:pPr>
-            <w:proofErr w:type="spellStart"/>
             <w:r>
               <w:rPr>
                 <w:sz w:val="16"/>
@@ -8398,7 +8095,6 @@
               </w:rPr>
               <w:t>tagName</w:t>
             </w:r>
-            <w:proofErr w:type="spellEnd"/>
           </w:p>
         </w:tc>
         <w:tc>
@@ -8454,7 +8150,6 @@
                 <w:szCs w:val="16"/>
               </w:rPr>
             </w:pPr>
-            <w:proofErr w:type="spellStart"/>
             <w:r>
               <w:rPr>
                 <w:sz w:val="16"/>
@@ -8462,7 +8157,6 @@
               </w:rPr>
               <w:t>CompilingDefTypeVar</w:t>
             </w:r>
-            <w:proofErr w:type="spellEnd"/>
           </w:p>
         </w:tc>
         <w:tc>
@@ -8710,7 +8404,6 @@
                 <w:szCs w:val="16"/>
               </w:rPr>
             </w:pPr>
-            <w:proofErr w:type="spellStart"/>
             <w:r>
               <w:rPr>
                 <w:sz w:val="16"/>
@@ -8718,7 +8411,6 @@
               </w:rPr>
               <w:t>InCatchFinallyVar</w:t>
             </w:r>
-            <w:proofErr w:type="spellEnd"/>
           </w:p>
         </w:tc>
         <w:tc>
@@ -8886,21 +8578,12 @@
                 <w:szCs w:val="16"/>
               </w:rPr>
             </w:pPr>
-            <w:proofErr w:type="spellStart"/>
-            <w:r>
-              <w:rPr>
-                <w:sz w:val="16"/>
-                <w:szCs w:val="16"/>
-              </w:rPr>
-              <w:t>ObjExpr</w:t>
-            </w:r>
-            <w:proofErr w:type="spellEnd"/>
-            <w:r>
-              <w:rPr>
-                <w:sz w:val="16"/>
-                <w:szCs w:val="16"/>
-              </w:rPr>
-              <w:t>.</w:t>
+            <w:r>
+              <w:rPr>
+                <w:sz w:val="16"/>
+                <w:szCs w:val="16"/>
+              </w:rPr>
+              <w:t>ObjExpr.</w:t>
             </w:r>
           </w:p>
           <w:p>
@@ -9024,7 +8707,6 @@
                 <w:szCs w:val="16"/>
               </w:rPr>
             </w:pPr>
-            <w:proofErr w:type="spellStart"/>
             <w:r>
               <w:rPr>
                 <w:sz w:val="16"/>
@@ -9032,7 +8714,6 @@
               </w:rPr>
               <w:t>CompilerContextVar</w:t>
             </w:r>
-            <w:proofErr w:type="spellEnd"/>
           </w:p>
         </w:tc>
         <w:tc>
@@ -9160,7 +8841,6 @@
                 <w:szCs w:val="16"/>
               </w:rPr>
             </w:pPr>
-            <w:proofErr w:type="spellStart"/>
             <w:r>
               <w:rPr>
                 <w:sz w:val="16"/>
@@ -9168,7 +8848,6 @@
               </w:rPr>
               <w:t>CompileStubOrigClassVar</w:t>
             </w:r>
-            <w:proofErr w:type="spellEnd"/>
           </w:p>
         </w:tc>
         <w:tc>
@@ -9182,7 +8861,6 @@
                 <w:szCs w:val="16"/>
               </w:rPr>
             </w:pPr>
-            <w:proofErr w:type="spellStart"/>
             <w:r>
               <w:rPr>
                 <w:sz w:val="16"/>
@@ -9190,7 +8868,6 @@
               </w:rPr>
               <w:t>stubType</w:t>
             </w:r>
-            <w:proofErr w:type="spellEnd"/>
           </w:p>
         </w:tc>
         <w:tc>
@@ -9345,79 +9022,51 @@
                 <w:szCs w:val="16"/>
               </w:rPr>
             </w:pPr>
-            <w:proofErr w:type="spellStart"/>
-            <w:r>
-              <w:rPr>
-                <w:sz w:val="16"/>
-                <w:szCs w:val="16"/>
-              </w:rPr>
-              <w:t>FnMethod</w:t>
-            </w:r>
-            <w:proofErr w:type="spellEnd"/>
-            <w:r>
-              <w:rPr>
-                <w:sz w:val="16"/>
-                <w:szCs w:val="16"/>
-              </w:rPr>
-              <w:t>.</w:t>
-            </w:r>
-          </w:p>
-          <w:p>
-            <w:pPr>
-              <w:rPr>
-                <w:sz w:val="16"/>
-                <w:szCs w:val="16"/>
-              </w:rPr>
-            </w:pPr>
-            <w:proofErr w:type="spellStart"/>
-            <w:r>
-              <w:rPr>
-                <w:sz w:val="16"/>
-                <w:szCs w:val="16"/>
-              </w:rPr>
-              <w:t>DoEmitStatic</w:t>
-            </w:r>
-            <w:proofErr w:type="spellEnd"/>
-            <w:r>
-              <w:rPr>
-                <w:sz w:val="16"/>
-                <w:szCs w:val="16"/>
-              </w:rPr>
-              <w:t>,</w:t>
-            </w:r>
-          </w:p>
-          <w:p>
-            <w:pPr>
-              <w:rPr>
-                <w:sz w:val="16"/>
-                <w:szCs w:val="16"/>
-              </w:rPr>
-            </w:pPr>
-            <w:proofErr w:type="spellStart"/>
-            <w:r>
-              <w:rPr>
-                <w:sz w:val="16"/>
-                <w:szCs w:val="16"/>
-              </w:rPr>
-              <w:t>DoEmitPrim</w:t>
-            </w:r>
-            <w:proofErr w:type="spellEnd"/>
-            <w:r>
-              <w:rPr>
-                <w:sz w:val="16"/>
-                <w:szCs w:val="16"/>
-              </w:rPr>
-              <w:t>,</w:t>
-            </w:r>
-          </w:p>
-          <w:p>
-            <w:pPr>
-              <w:rPr>
-                <w:sz w:val="16"/>
-                <w:szCs w:val="16"/>
-              </w:rPr>
-            </w:pPr>
-            <w:proofErr w:type="spellStart"/>
+            <w:r>
+              <w:rPr>
+                <w:sz w:val="16"/>
+                <w:szCs w:val="16"/>
+              </w:rPr>
+              <w:t>FnMethod.</w:t>
+            </w:r>
+          </w:p>
+          <w:p>
+            <w:pPr>
+              <w:rPr>
+                <w:sz w:val="16"/>
+                <w:szCs w:val="16"/>
+              </w:rPr>
+            </w:pPr>
+            <w:r>
+              <w:rPr>
+                <w:sz w:val="16"/>
+                <w:szCs w:val="16"/>
+              </w:rPr>
+              <w:t>DoEmitStatic,</w:t>
+            </w:r>
+          </w:p>
+          <w:p>
+            <w:pPr>
+              <w:rPr>
+                <w:sz w:val="16"/>
+                <w:szCs w:val="16"/>
+              </w:rPr>
+            </w:pPr>
+            <w:r>
+              <w:rPr>
+                <w:sz w:val="16"/>
+                <w:szCs w:val="16"/>
+              </w:rPr>
+              <w:t>DoEmitPrim,</w:t>
+            </w:r>
+          </w:p>
+          <w:p>
+            <w:pPr>
+              <w:rPr>
+                <w:sz w:val="16"/>
+                <w:szCs w:val="16"/>
+              </w:rPr>
+            </w:pPr>
             <w:r>
               <w:rPr>
                 <w:sz w:val="16"/>
@@ -9425,7 +9074,6 @@
               </w:rPr>
               <w:t>DoEmit</w:t>
             </w:r>
-            <w:proofErr w:type="spellEnd"/>
           </w:p>
         </w:tc>
         <w:tc>
@@ -9504,21 +9152,12 @@
                 <w:szCs w:val="16"/>
               </w:rPr>
             </w:pPr>
-            <w:proofErr w:type="spellStart"/>
-            <w:r>
-              <w:rPr>
-                <w:sz w:val="16"/>
-                <w:szCs w:val="16"/>
-              </w:rPr>
-              <w:t>ObjMethod</w:t>
-            </w:r>
-            <w:proofErr w:type="spellEnd"/>
-            <w:r>
-              <w:rPr>
-                <w:sz w:val="16"/>
-                <w:szCs w:val="16"/>
-              </w:rPr>
-              <w:t>.</w:t>
+            <w:r>
+              <w:rPr>
+                <w:sz w:val="16"/>
+                <w:szCs w:val="16"/>
+              </w:rPr>
+              <w:t>ObjMethod.</w:t>
             </w:r>
           </w:p>
           <w:p>
@@ -9616,7 +9255,6 @@
                 <w:szCs w:val="16"/>
               </w:rPr>
             </w:pPr>
-            <w:proofErr w:type="spellStart"/>
             <w:r>
               <w:rPr>
                 <w:sz w:val="16"/>
@@ -9624,7 +9262,6 @@
               </w:rPr>
               <w:t>MethodVar</w:t>
             </w:r>
-            <w:proofErr w:type="spellEnd"/>
           </w:p>
         </w:tc>
         <w:tc>
@@ -9766,7 +9403,6 @@
                 <w:szCs w:val="16"/>
               </w:rPr>
             </w:pPr>
-            <w:proofErr w:type="spellStart"/>
             <w:r>
               <w:rPr>
                 <w:sz w:val="16"/>
@@ -9774,7 +9410,6 @@
               </w:rPr>
               <w:t>LoopLabelVar</w:t>
             </w:r>
-            <w:proofErr w:type="spellEnd"/>
           </w:p>
         </w:tc>
         <w:tc>
@@ -9788,7 +9423,6 @@
                 <w:szCs w:val="16"/>
               </w:rPr>
             </w:pPr>
-            <w:proofErr w:type="spellStart"/>
             <w:r>
               <w:rPr>
                 <w:sz w:val="16"/>
@@ -9796,7 +9430,6 @@
               </w:rPr>
               <w:t>Looplabel</w:t>
             </w:r>
-            <w:proofErr w:type="spellEnd"/>
           </w:p>
         </w:tc>
         <w:tc>
@@ -9810,7 +9443,6 @@
                 <w:szCs w:val="16"/>
               </w:rPr>
             </w:pPr>
-            <w:proofErr w:type="spellStart"/>
             <w:r>
               <w:rPr>
                 <w:sz w:val="16"/>
@@ -9818,7 +9450,6 @@
               </w:rPr>
               <w:t>loopLabel</w:t>
             </w:r>
-            <w:proofErr w:type="spellEnd"/>
           </w:p>
         </w:tc>
         <w:tc>
@@ -9832,7 +9463,6 @@
                 <w:szCs w:val="16"/>
               </w:rPr>
             </w:pPr>
-            <w:proofErr w:type="spellStart"/>
             <w:r>
               <w:rPr>
                 <w:sz w:val="16"/>
@@ -9840,7 +9470,6 @@
               </w:rPr>
               <w:t>loopLabel</w:t>
             </w:r>
-            <w:proofErr w:type="spellEnd"/>
           </w:p>
         </w:tc>
         <w:tc>
@@ -12037,6 +11666,683 @@
     </w:tbl>
     <w:p/>
     <w:p/>
+    <w:p/>
+    <w:p>
+      <w:r>
+        <w:br w:type="page"/>
+      </w:r>
+    </w:p>
+    <w:p>
+      <w:pPr>
+        <w:pStyle w:val="Heading1"/>
+      </w:pPr>
+      <w:r>
+        <w:lastRenderedPageBreak/>
+        <w:t>Function data</w:t>
+      </w:r>
+    </w:p>
+    <w:p/>
+    <w:p>
+      <w:pPr>
+        <w:pStyle w:val="Heading2"/>
+      </w:pPr>
+      <w:r>
+        <w:t>ObjExpr</w:t>
+      </w:r>
+    </w:p>
+    <w:p/>
+    <w:tbl>
+      <w:tblPr>
+        <w:tblStyle w:val="TableGrid"/>
+        <w:tblW w:w="9525" w:type="dxa"/>
+        <w:tblLook w:val="04A0" w:firstRow="1" w:lastRow="0" w:firstColumn="1" w:lastColumn="0" w:noHBand="0" w:noVBand="1"/>
+      </w:tblPr>
+      <w:tblGrid>
+        <w:gridCol w:w="1665"/>
+        <w:gridCol w:w="1770"/>
+        <w:gridCol w:w="1790"/>
+        <w:gridCol w:w="1887"/>
+        <w:gridCol w:w="3668"/>
+      </w:tblGrid>
+      <w:tr>
+        <w:tc>
+          <w:tcPr>
+            <w:tcW w:w="1643" w:type="dxa"/>
+          </w:tcPr>
+          <w:p>
+            <w:r>
+              <w:t>Field</w:t>
+            </w:r>
+          </w:p>
+        </w:tc>
+        <w:tc>
+          <w:tcPr>
+            <w:tcW w:w="1701" w:type="dxa"/>
+          </w:tcPr>
+          <w:p>
+            <w:r>
+              <w:t>Description</w:t>
+            </w:r>
+          </w:p>
+        </w:tc>
+        <w:tc>
+          <w:tcPr>
+            <w:tcW w:w="1720" w:type="dxa"/>
+          </w:tcPr>
+          <w:p>
+            <w:r>
+              <w:t>FnExpr</w:t>
+            </w:r>
+          </w:p>
+        </w:tc>
+        <w:tc>
+          <w:tcPr>
+            <w:tcW w:w="1813" w:type="dxa"/>
+          </w:tcPr>
+          <w:p>
+            <w:r>
+              <w:t>NewInstanceExpr</w:t>
+            </w:r>
+          </w:p>
+        </w:tc>
+        <w:tc>
+          <w:tcPr>
+            <w:tcW w:w="2648" w:type="dxa"/>
+          </w:tcPr>
+          <w:p>
+            <w:r>
+              <w:t>ObjExpr</w:t>
+            </w:r>
+            <w:r>
+              <w:t xml:space="preserve"> or other</w:t>
+            </w:r>
+          </w:p>
+        </w:tc>
+      </w:tr>
+      <w:tr>
+        <w:tc>
+          <w:tcPr>
+            <w:tcW w:w="1643" w:type="dxa"/>
+          </w:tcPr>
+          <w:p>
+            <w:r>
+              <w:t>InternalName</w:t>
+            </w:r>
+          </w:p>
+        </w:tc>
+        <w:tc>
+          <w:tcPr>
+            <w:tcW w:w="1701" w:type="dxa"/>
+          </w:tcPr>
+          <w:p>
+            <w:r>
+              <w:t>Used as class name</w:t>
+            </w:r>
+          </w:p>
+          <w:p>
+            <w:r>
+              <w:t>Usually same as Name except for the __init</w:t>
+            </w:r>
+          </w:p>
+        </w:tc>
+        <w:tc>
+          <w:tcPr>
+            <w:tcW w:w="1720" w:type="dxa"/>
+          </w:tcPr>
+          <w:p>
+            <w:r>
+              <w:t>ComputeNames</w:t>
+            </w:r>
+          </w:p>
+        </w:tc>
+        <w:tc>
+          <w:tcPr>
+            <w:tcW w:w="1813" w:type="dxa"/>
+          </w:tcPr>
+          <w:p>
+            <w:r>
+              <w:t>Build</w:t>
+            </w:r>
+          </w:p>
+        </w:tc>
+        <w:tc>
+          <w:tcPr>
+            <w:tcW w:w="2648" w:type="dxa"/>
+          </w:tcPr>
+          <w:p>
+            <w:r>
+              <w:t>-</w:t>
+            </w:r>
+          </w:p>
+        </w:tc>
+      </w:tr>
+      <w:tr>
+        <w:tc>
+          <w:tcPr>
+            <w:tcW w:w="1643" w:type="dxa"/>
+          </w:tcPr>
+          <w:p>
+            <w:r>
+              <w:t>Name</w:t>
+            </w:r>
+          </w:p>
+        </w:tc>
+        <w:tc>
+          <w:tcPr>
+            <w:tcW w:w="1701" w:type="dxa"/>
+          </w:tcPr>
+          <w:p>
+            <w:r>
+              <w:t>It’s complicated</w:t>
+            </w:r>
+          </w:p>
+        </w:tc>
+        <w:tc>
+          <w:tcPr>
+            <w:tcW w:w="1720" w:type="dxa"/>
+          </w:tcPr>
+          <w:p>
+            <w:r>
+              <w:t>ComputeNames</w:t>
+            </w:r>
+          </w:p>
+        </w:tc>
+        <w:tc>
+          <w:tcPr>
+            <w:tcW w:w="1813" w:type="dxa"/>
+          </w:tcPr>
+          <w:p>
+            <w:r>
+              <w:t>Build</w:t>
+            </w:r>
+          </w:p>
+        </w:tc>
+        <w:tc>
+          <w:tcPr>
+            <w:tcW w:w="2648" w:type="dxa"/>
+          </w:tcPr>
+          <w:p>
+            <w:r>
+              <w:t>-</w:t>
+            </w:r>
+          </w:p>
+        </w:tc>
+      </w:tr>
+      <w:tr>
+        <w:tc>
+          <w:tcPr>
+            <w:tcW w:w="1643" w:type="dxa"/>
+          </w:tcPr>
+          <w:p>
+            <w:r>
+              <w:t>ThisName</w:t>
+            </w:r>
+          </w:p>
+        </w:tc>
+        <w:tc>
+          <w:tcPr>
+            <w:tcW w:w="1701" w:type="dxa"/>
+          </w:tcPr>
+          <w:p>
+            <w:pPr>
+              <w:jc w:val="center"/>
+            </w:pPr>
+            <w:r>
+              <w:t>Name of the _this_ variable</w:t>
+            </w:r>
+          </w:p>
+          <w:p>
+            <w:pPr>
+              <w:jc w:val="center"/>
+            </w:pPr>
+            <w:r>
+              <w:t>Will be registered as a local in FnMethod.Parse</w:t>
+            </w:r>
+          </w:p>
+        </w:tc>
+        <w:tc>
+          <w:tcPr>
+            <w:tcW w:w="1720" w:type="dxa"/>
+          </w:tcPr>
+          <w:p>
+            <w:r>
+              <w:t>Parse</w:t>
+            </w:r>
+          </w:p>
+        </w:tc>
+        <w:tc>
+          <w:tcPr>
+            <w:tcW w:w="1813" w:type="dxa"/>
+          </w:tcPr>
+          <w:p>
+            <w:r>
+              <w:t>Build</w:t>
+            </w:r>
+          </w:p>
+        </w:tc>
+        <w:tc>
+          <w:tcPr>
+            <w:tcW w:w="2648" w:type="dxa"/>
+          </w:tcPr>
+          <w:p/>
+        </w:tc>
+      </w:tr>
+      <w:tr>
+        <w:tc>
+          <w:tcPr>
+            <w:tcW w:w="1643" w:type="dxa"/>
+          </w:tcPr>
+          <w:p>
+            <w:r>
+              <w:t>_tag</w:t>
+            </w:r>
+          </w:p>
+        </w:tc>
+        <w:tc>
+          <w:tcPr>
+            <w:tcW w:w="1701" w:type="dxa"/>
+          </w:tcPr>
+          <w:p>
+            <w:r>
+              <w:t>The return type tag</w:t>
+            </w:r>
+          </w:p>
+        </w:tc>
+        <w:tc>
+          <w:tcPr>
+            <w:tcW w:w="1720" w:type="dxa"/>
+          </w:tcPr>
+          <w:p>
+            <w:r>
+              <w:t>Tag of form</w:t>
+            </w:r>
+          </w:p>
+        </w:tc>
+        <w:tc>
+          <w:tcPr>
+            <w:tcW w:w="1813" w:type="dxa"/>
+          </w:tcPr>
+          <w:p>
+            <w:r>
+              <w:t>Set to null</w:t>
+            </w:r>
+          </w:p>
+        </w:tc>
+        <w:tc>
+          <w:tcPr>
+            <w:tcW w:w="2648" w:type="dxa"/>
+          </w:tcPr>
+          <w:p>
+            <w:r>
+              <w:t>ctor</w:t>
+            </w:r>
+          </w:p>
+        </w:tc>
+      </w:tr>
+      <w:tr>
+        <w:tc>
+          <w:tcPr>
+            <w:tcW w:w="1643" w:type="dxa"/>
+          </w:tcPr>
+          <w:p>
+            <w:r>
+              <w:t>Src</w:t>
+            </w:r>
+          </w:p>
+        </w:tc>
+        <w:tc>
+          <w:tcPr>
+            <w:tcW w:w="1701" w:type="dxa"/>
+          </w:tcPr>
+          <w:p>
+            <w:r>
+              <w:t>Source code of the function</w:t>
+            </w:r>
+          </w:p>
+        </w:tc>
+        <w:tc>
+          <w:tcPr>
+            <w:tcW w:w="1720" w:type="dxa"/>
+          </w:tcPr>
+          <w:p>
+            <w:r>
+              <w:t>Set in Parse</w:t>
+            </w:r>
+          </w:p>
+        </w:tc>
+        <w:tc>
+          <w:tcPr>
+            <w:tcW w:w="1813" w:type="dxa"/>
+          </w:tcPr>
+          <w:p>
+            <w:r>
+              <w:t>Set in Build</w:t>
+            </w:r>
+          </w:p>
+        </w:tc>
+        <w:tc>
+          <w:tcPr>
+            <w:tcW w:w="2648" w:type="dxa"/>
+          </w:tcPr>
+          <w:p>
+            <w:r>
+              <w:t>Used in EmitLoadNsInitForDefType</w:t>
+            </w:r>
+          </w:p>
+        </w:tc>
+      </w:tr>
+      <w:tr>
+        <w:tc>
+          <w:tcPr>
+            <w:tcW w:w="1643" w:type="dxa"/>
+          </w:tcPr>
+          <w:p>
+            <w:r>
+              <w:t>Opts</w:t>
+            </w:r>
+          </w:p>
+        </w:tc>
+        <w:tc>
+          <w:tcPr>
+            <w:tcW w:w="1701" w:type="dxa"/>
+          </w:tcPr>
+          <w:p/>
+        </w:tc>
+        <w:tc>
+          <w:tcPr>
+            <w:tcW w:w="1720" w:type="dxa"/>
+          </w:tcPr>
+          <w:p/>
+        </w:tc>
+        <w:tc>
+          <w:tcPr>
+            <w:tcW w:w="1813" w:type="dxa"/>
+          </w:tcPr>
+          <w:p>
+            <w:r>
+              <w:t>Set in Build</w:t>
+            </w:r>
+          </w:p>
+        </w:tc>
+        <w:tc>
+          <w:tcPr>
+            <w:tcW w:w="2648" w:type="dxa"/>
+          </w:tcPr>
+          <w:p>
+            <w:r>
+              <w:t>Checked for :load-ns true to decide if call EmitLoadNsInitForDefType</w:t>
+            </w:r>
+          </w:p>
+        </w:tc>
+      </w:tr>
+      <w:tr>
+        <w:tc>
+          <w:tcPr>
+            <w:tcW w:w="1643" w:type="dxa"/>
+          </w:tcPr>
+          <w:p>
+            <w:r>
+              <w:t>Closes</w:t>
+            </w:r>
+          </w:p>
+        </w:tc>
+        <w:tc>
+          <w:tcPr>
+            <w:tcW w:w="1701" w:type="dxa"/>
+          </w:tcPr>
+          <w:p>
+            <w:r>
+              <w:t xml:space="preserve">Map, but key=value.  Key/Value </w:t>
+            </w:r>
+            <w:r>
+              <w:t xml:space="preserve">= </w:t>
+            </w:r>
+            <w:r>
+              <w:t xml:space="preserve"> local binding </w:t>
+            </w:r>
+            <w:r>
+              <w:t xml:space="preserve">from outer scope </w:t>
+            </w:r>
+            <w:r>
+              <w:t xml:space="preserve">that is </w:t>
+            </w:r>
+            <w:r>
+              <w:t>used</w:t>
+            </w:r>
+            <w:r>
+              <w:t>.</w:t>
+            </w:r>
+          </w:p>
+        </w:tc>
+        <w:tc>
+          <w:tcPr>
+            <w:tcW w:w="1720" w:type="dxa"/>
+          </w:tcPr>
+          <w:p/>
+        </w:tc>
+        <w:tc>
+          <w:tcPr>
+            <w:tcW w:w="1813" w:type="dxa"/>
+          </w:tcPr>
+          <w:p/>
+        </w:tc>
+        <w:tc>
+          <w:tcPr>
+            <w:tcW w:w="2648" w:type="dxa"/>
+          </w:tcPr>
+          <w:p>
+            <w:r>
+              <w:t>CtorTypes == used to build the constructor</w:t>
+            </w:r>
+          </w:p>
+          <w:p>
+            <w:r>
+              <w:t xml:space="preserve">EmitLocal/EmitUnboxedLocal – </w:t>
+            </w:r>
+          </w:p>
+          <w:p>
+            <w:r>
+              <w:t>Compiler.ClosesOver – adds up the line.</w:t>
+            </w:r>
+          </w:p>
+        </w:tc>
+      </w:tr>
+      <w:tr>
+        <w:tc>
+          <w:tcPr>
+            <w:tcW w:w="1643" w:type="dxa"/>
+          </w:tcPr>
+          <w:p>
+            <w:r>
+              <w:t>Keywords</w:t>
+            </w:r>
+          </w:p>
+        </w:tc>
+        <w:tc>
+          <w:tcPr>
+            <w:tcW w:w="1701" w:type="dxa"/>
+          </w:tcPr>
+          <w:p>
+            <w:r>
+              <w:t xml:space="preserve">Any keywords referenced. </w:t>
+            </w:r>
+          </w:p>
+        </w:tc>
+        <w:tc>
+          <w:tcPr>
+            <w:tcW w:w="1720" w:type="dxa"/>
+          </w:tcPr>
+          <w:p>
+            <w:r>
+              <w:t>Inited from KeywordsVar</w:t>
+            </w:r>
+          </w:p>
+        </w:tc>
+        <w:tc>
+          <w:tcPr>
+            <w:tcW w:w="1813" w:type="dxa"/>
+          </w:tcPr>
+          <w:p>
+            <w:r>
+              <w:t>Inited from KeywordsVar</w:t>
+            </w:r>
+          </w:p>
+        </w:tc>
+        <w:tc>
+          <w:tcPr>
+            <w:tcW w:w="2648" w:type="dxa"/>
+          </w:tcPr>
+          <w:p>
+            <w:r>
+              <w:t>KeywordsVar added to by Compiler.RegisterKeyword – this calls RegisterConstant on the keyword, which returns an id.  Keyword-&gt;id goes into the map.</w:t>
+            </w:r>
+          </w:p>
+        </w:tc>
+      </w:tr>
+      <w:tr>
+        <w:tc>
+          <w:tcPr>
+            <w:tcW w:w="1643" w:type="dxa"/>
+          </w:tcPr>
+          <w:p>
+            <w:r>
+              <w:t>Vars</w:t>
+            </w:r>
+          </w:p>
+        </w:tc>
+        <w:tc>
+          <w:tcPr>
+            <w:tcW w:w="1701" w:type="dxa"/>
+          </w:tcPr>
+          <w:p/>
+        </w:tc>
+        <w:tc>
+          <w:tcPr>
+            <w:tcW w:w="1720" w:type="dxa"/>
+          </w:tcPr>
+          <w:p/>
+        </w:tc>
+        <w:tc>
+          <w:tcPr>
+            <w:tcW w:w="1813" w:type="dxa"/>
+          </w:tcPr>
+          <w:p/>
+        </w:tc>
+        <w:tc>
+          <w:tcPr>
+            <w:tcW w:w="2648" w:type="dxa"/>
+          </w:tcPr>
+          <w:p>
+            <w:r>
+              <w:t>Used in ObjExpr.EmitVar and ObjExpr.EmitVarValue</w:t>
+            </w:r>
+          </w:p>
+          <w:p/>
+          <w:p>
+            <w:r>
+              <w:t>Set by Compiler.RegisterVar.</w:t>
+            </w:r>
+          </w:p>
+          <w:p>
+            <w:r>
+              <w:t>RegisterVar called by Compiler.LookupVar  and Compiler.AnalyzeSymbol and DefExpr.Parse (need to look at this).</w:t>
+            </w:r>
+          </w:p>
+        </w:tc>
+      </w:tr>
+      <w:tr>
+        <w:tc>
+          <w:tcPr>
+            <w:tcW w:w="1643" w:type="dxa"/>
+          </w:tcPr>
+          <w:p>
+            <w:r>
+              <w:lastRenderedPageBreak/>
+              <w:t>Constants</w:t>
+            </w:r>
+          </w:p>
+        </w:tc>
+        <w:tc>
+          <w:tcPr>
+            <w:tcW w:w="1701" w:type="dxa"/>
+          </w:tcPr>
+          <w:p/>
+        </w:tc>
+        <w:tc>
+          <w:tcPr>
+            <w:tcW w:w="1720" w:type="dxa"/>
+          </w:tcPr>
+          <w:p/>
+        </w:tc>
+        <w:tc>
+          <w:tcPr>
+            <w:tcW w:w="1813" w:type="dxa"/>
+          </w:tcPr>
+          <w:p/>
+        </w:tc>
+        <w:tc>
+          <w:tcPr>
+            <w:tcW w:w="2648" w:type="dxa"/>
+          </w:tcPr>
+          <w:p>
+            <w:r>
+              <w:t>Used in ObjExpr.EmitConstants, ObjExpr.EmitStaticConstructorBody, ObjExpr.EmitConstantFieldInits, ObjExpr.EmitConstantFieldDefs</w:t>
+            </w:r>
+          </w:p>
+          <w:p/>
+          <w:p>
+            <w:r>
+              <w:t>Set by Compiler.RegisterConstant.</w:t>
+            </w:r>
+          </w:p>
+          <w:p>
+            <w:r>
+              <w:t>Compiler.RegisterConstant called by Compiler.RegisterVar, Compiler.RegisterKeyword, ConstantExpr constructor, NumberExpr constructor.</w:t>
+            </w:r>
+          </w:p>
+        </w:tc>
+      </w:tr>
+      <w:tr>
+        <w:tc>
+          <w:tcPr>
+            <w:tcW w:w="1643" w:type="dxa"/>
+          </w:tcPr>
+          <w:p>
+            <w:r>
+              <w:t>ConstantFields</w:t>
+            </w:r>
+          </w:p>
+        </w:tc>
+        <w:tc>
+          <w:tcPr>
+            <w:tcW w:w="1701" w:type="dxa"/>
+          </w:tcPr>
+          <w:p>
+            <w:r>
+              <w:t>Map from int (id of Constant) to FieldBuilder.</w:t>
+            </w:r>
+          </w:p>
+        </w:tc>
+        <w:tc>
+          <w:tcPr>
+            <w:tcW w:w="1720" w:type="dxa"/>
+          </w:tcPr>
+          <w:p/>
+        </w:tc>
+        <w:tc>
+          <w:tcPr>
+            <w:tcW w:w="1813" w:type="dxa"/>
+          </w:tcPr>
+          <w:p/>
+        </w:tc>
+        <w:tc>
+          <w:tcPr>
+            <w:tcW w:w="2648" w:type="dxa"/>
+          </w:tcPr>
+          <w:p/>
+        </w:tc>
+      </w:tr>
+    </w:tbl>
     <w:p/>
     <w:p/>
     <w:sectPr>
@@ -14345,6 +14651,7 @@
   <w:style w:type="character" w:default="1" w:styleId="DefaultParagraphFont">
     <w:name w:val="Default Paragraph Font"/>
     <w:uiPriority w:val="1"/>
+    <w:semiHidden/>
     <w:unhideWhenUsed/>
   </w:style>
   <w:style w:type="table" w:default="1" w:styleId="TableNormal">

</xml_diff>

<commit_message>
More edits on ClojureCLR Compiler Notes
</commit_message>
<xml_diff>
--- a/docs/ClojureCLR Compiler Notes.docx
+++ b/docs/ClojureCLR Compiler Notes.docx
@@ -11690,660 +11690,2388 @@
         <w:t>ObjExpr</w:t>
       </w:r>
     </w:p>
+    <w:p>
+      <w:pPr>
+        <w:pStyle w:val="Heading3"/>
+      </w:pPr>
+      <w:r>
+        <w:t>Names</w:t>
+      </w:r>
+    </w:p>
+    <w:p>
+      <w:pPr>
+        <w:pStyle w:val="ListParagraph"/>
+        <w:numPr>
+          <w:ilvl w:val="0"/>
+          <w:numId w:val="16"/>
+        </w:numPr>
+        <w:rPr>
+          <w:rFonts w:ascii="Lucida Sans" w:hAnsi="Lucida Sans"/>
+        </w:rPr>
+      </w:pPr>
+      <w:r>
+        <w:rPr>
+          <w:rFonts w:ascii="Lucida Sans" w:hAnsi="Lucida Sans"/>
+        </w:rPr>
+        <w:t>InternalName</w:t>
+      </w:r>
+    </w:p>
+    <w:p>
+      <w:pPr>
+        <w:pStyle w:val="ListParagraph"/>
+        <w:numPr>
+          <w:ilvl w:val="1"/>
+          <w:numId w:val="16"/>
+        </w:numPr>
+        <w:rPr>
+          <w:rFonts w:ascii="Lucida Sans" w:hAnsi="Lucida Sans"/>
+        </w:rPr>
+      </w:pPr>
+      <w:r>
+        <w:rPr>
+          <w:rFonts w:ascii="Lucida Sans" w:hAnsi="Lucida Sans"/>
+        </w:rPr>
+        <w:t>Used as class name</w:t>
+      </w:r>
+    </w:p>
+    <w:p>
+      <w:pPr>
+        <w:pStyle w:val="ListParagraph"/>
+        <w:numPr>
+          <w:ilvl w:val="1"/>
+          <w:numId w:val="16"/>
+        </w:numPr>
+        <w:rPr>
+          <w:rFonts w:ascii="Lucida Sans" w:hAnsi="Lucida Sans"/>
+        </w:rPr>
+      </w:pPr>
+      <w:r>
+        <w:rPr>
+          <w:rFonts w:ascii="Lucida Sans" w:hAnsi="Lucida Sans"/>
+        </w:rPr>
+        <w:t>Usually the same Name (except for the _init class)</w:t>
+      </w:r>
+    </w:p>
+    <w:p>
+      <w:pPr>
+        <w:pStyle w:val="ListParagraph"/>
+        <w:numPr>
+          <w:ilvl w:val="1"/>
+          <w:numId w:val="16"/>
+        </w:numPr>
+        <w:rPr>
+          <w:rFonts w:ascii="Lucida Sans" w:hAnsi="Lucida Sans"/>
+        </w:rPr>
+      </w:pPr>
+      <w:r>
+        <w:rPr>
+          <w:rFonts w:ascii="Lucida Sans" w:hAnsi="Lucida Sans"/>
+        </w:rPr>
+        <w:t>Set in FnExpr.ComputeName and NewInstanceExpr.Build</w:t>
+      </w:r>
+    </w:p>
+    <w:p>
+      <w:pPr>
+        <w:pStyle w:val="ListParagraph"/>
+        <w:numPr>
+          <w:ilvl w:val="0"/>
+          <w:numId w:val="16"/>
+        </w:numPr>
+        <w:rPr>
+          <w:rFonts w:ascii="Lucida Sans" w:hAnsi="Lucida Sans"/>
+        </w:rPr>
+      </w:pPr>
+      <w:r>
+        <w:rPr>
+          <w:rFonts w:ascii="Lucida Sans" w:hAnsi="Lucida Sans"/>
+        </w:rPr>
+        <w:t>Name</w:t>
+      </w:r>
+    </w:p>
+    <w:p>
+      <w:pPr>
+        <w:pStyle w:val="ListParagraph"/>
+        <w:numPr>
+          <w:ilvl w:val="1"/>
+          <w:numId w:val="16"/>
+        </w:numPr>
+        <w:rPr>
+          <w:rFonts w:ascii="Lucida Sans" w:hAnsi="Lucida Sans"/>
+        </w:rPr>
+      </w:pPr>
+      <w:r>
+        <w:rPr>
+          <w:rFonts w:ascii="Lucida Sans" w:hAnsi="Lucida Sans"/>
+        </w:rPr>
+        <w:t>It’s complicated.</w:t>
+      </w:r>
+    </w:p>
+    <w:p>
+      <w:pPr>
+        <w:pStyle w:val="ListParagraph"/>
+        <w:numPr>
+          <w:ilvl w:val="1"/>
+          <w:numId w:val="16"/>
+        </w:numPr>
+        <w:rPr>
+          <w:rFonts w:ascii="Lucida Sans" w:hAnsi="Lucida Sans"/>
+        </w:rPr>
+      </w:pPr>
+      <w:r>
+        <w:rPr>
+          <w:rFonts w:ascii="Lucida Sans" w:hAnsi="Lucida Sans"/>
+        </w:rPr>
+        <w:t>Set in FnExpr.ComputeNames and NewInstanceExpr.Build</w:t>
+      </w:r>
+    </w:p>
+    <w:p>
+      <w:pPr>
+        <w:pStyle w:val="ListParagraph"/>
+        <w:numPr>
+          <w:ilvl w:val="0"/>
+          <w:numId w:val="16"/>
+        </w:numPr>
+        <w:rPr>
+          <w:rFonts w:ascii="Lucida Sans" w:hAnsi="Lucida Sans"/>
+        </w:rPr>
+      </w:pPr>
+      <w:r>
+        <w:rPr>
+          <w:rFonts w:ascii="Lucida Sans" w:hAnsi="Lucida Sans"/>
+        </w:rPr>
+        <w:t>ThisName</w:t>
+      </w:r>
+    </w:p>
+    <w:p>
+      <w:pPr>
+        <w:pStyle w:val="ListParagraph"/>
+        <w:numPr>
+          <w:ilvl w:val="1"/>
+          <w:numId w:val="16"/>
+        </w:numPr>
+        <w:rPr>
+          <w:rFonts w:ascii="Lucida Sans" w:hAnsi="Lucida Sans"/>
+        </w:rPr>
+      </w:pPr>
+      <w:r>
+        <w:rPr>
+          <w:rFonts w:ascii="Lucida Sans" w:hAnsi="Lucida Sans"/>
+        </w:rPr>
+        <w:t xml:space="preserve">Name of the </w:t>
+      </w:r>
+      <w:r>
+        <w:rPr>
+          <w:rFonts w:ascii="Lucida Sans" w:hAnsi="Lucida Sans"/>
+          <w:i/>
+          <w:iCs/>
+        </w:rPr>
+        <w:t>this</w:t>
+      </w:r>
+      <w:r>
+        <w:t xml:space="preserve"> variable.  Will be registered as a local in FnMethod.Parse</w:t>
+      </w:r>
+    </w:p>
+    <w:p>
+      <w:pPr>
+        <w:pStyle w:val="ListParagraph"/>
+        <w:numPr>
+          <w:ilvl w:val="1"/>
+          <w:numId w:val="16"/>
+        </w:numPr>
+        <w:rPr>
+          <w:rFonts w:ascii="Lucida Sans" w:hAnsi="Lucida Sans"/>
+        </w:rPr>
+      </w:pPr>
+      <w:r>
+        <w:t xml:space="preserve">See also </w:t>
+      </w:r>
+      <w:r>
+        <w:rPr>
+          <w:rFonts w:ascii="Lucida Sans" w:hAnsi="Lucida Sans"/>
+        </w:rPr>
+        <w:t>FnExpr.ComputeNames and NewInstanceExpr.Build</w:t>
+      </w:r>
+    </w:p>
+    <w:p>
+      <w:pPr>
+        <w:rPr>
+          <w:rFonts w:ascii="Lucida Sans" w:hAnsi="Lucida Sans"/>
+        </w:rPr>
+      </w:pPr>
+    </w:p>
+    <w:p>
+      <w:pPr>
+        <w:pStyle w:val="Heading3"/>
+      </w:pPr>
+      <w:r>
+        <w:t>Miscellaneous</w:t>
+      </w:r>
+    </w:p>
+    <w:p>
+      <w:pPr>
+        <w:pStyle w:val="ListParagraph"/>
+        <w:numPr>
+          <w:ilvl w:val="0"/>
+          <w:numId w:val="17"/>
+        </w:numPr>
+        <w:rPr>
+          <w:rFonts w:ascii="Lucida Sans" w:hAnsi="Lucida Sans"/>
+        </w:rPr>
+      </w:pPr>
+      <w:r>
+        <w:rPr>
+          <w:rFonts w:ascii="Lucida Sans" w:hAnsi="Lucida Sans"/>
+        </w:rPr>
+        <w:t>_tag</w:t>
+      </w:r>
+    </w:p>
+    <w:p>
+      <w:pPr>
+        <w:pStyle w:val="ListParagraph"/>
+        <w:numPr>
+          <w:ilvl w:val="1"/>
+          <w:numId w:val="17"/>
+        </w:numPr>
+        <w:rPr>
+          <w:rFonts w:ascii="Lucida Sans" w:hAnsi="Lucida Sans"/>
+        </w:rPr>
+      </w:pPr>
+      <w:r>
+        <w:rPr>
+          <w:rFonts w:ascii="Lucida Sans" w:hAnsi="Lucida Sans"/>
+        </w:rPr>
+        <w:t>The return type tag</w:t>
+      </w:r>
+    </w:p>
+    <w:p>
+      <w:pPr>
+        <w:pStyle w:val="ListParagraph"/>
+        <w:numPr>
+          <w:ilvl w:val="1"/>
+          <w:numId w:val="17"/>
+        </w:numPr>
+        <w:rPr>
+          <w:rFonts w:ascii="Lucida Sans" w:hAnsi="Lucida Sans"/>
+        </w:rPr>
+      </w:pPr>
+      <w:r>
+        <w:rPr>
+          <w:rFonts w:ascii="Lucida Sans" w:hAnsi="Lucida Sans"/>
+        </w:rPr>
+        <w:t>FnExpr: comes from the ^tag on the form</w:t>
+      </w:r>
+    </w:p>
+    <w:p>
+      <w:pPr>
+        <w:pStyle w:val="ListParagraph"/>
+        <w:numPr>
+          <w:ilvl w:val="1"/>
+          <w:numId w:val="17"/>
+        </w:numPr>
+        <w:rPr>
+          <w:rFonts w:ascii="Lucida Sans" w:hAnsi="Lucida Sans"/>
+        </w:rPr>
+      </w:pPr>
+      <w:r>
+        <w:rPr>
+          <w:rFonts w:ascii="Lucida Sans" w:hAnsi="Lucida Sans"/>
+        </w:rPr>
+        <w:t>NewInstance sets it to null</w:t>
+      </w:r>
+    </w:p>
+    <w:p>
+      <w:pPr>
+        <w:pStyle w:val="ListParagraph"/>
+        <w:numPr>
+          <w:ilvl w:val="0"/>
+          <w:numId w:val="17"/>
+        </w:numPr>
+        <w:rPr>
+          <w:rFonts w:ascii="Lucida Sans" w:hAnsi="Lucida Sans"/>
+        </w:rPr>
+      </w:pPr>
+      <w:r>
+        <w:rPr>
+          <w:rFonts w:ascii="Lucida Sans" w:hAnsi="Lucida Sans"/>
+        </w:rPr>
+        <w:t>Src</w:t>
+      </w:r>
+      <w:r>
+        <w:rPr>
+          <w:rFonts w:ascii="Lucida Sans" w:hAnsi="Lucida Sans"/>
+        </w:rPr>
+        <w:tab/>
+      </w:r>
+    </w:p>
+    <w:p>
+      <w:pPr>
+        <w:pStyle w:val="ListParagraph"/>
+        <w:numPr>
+          <w:ilvl w:val="1"/>
+          <w:numId w:val="17"/>
+        </w:numPr>
+        <w:rPr>
+          <w:rFonts w:ascii="Lucida Sans" w:hAnsi="Lucida Sans"/>
+        </w:rPr>
+      </w:pPr>
+      <w:r>
+        <w:rPr>
+          <w:rFonts w:ascii="Lucida Sans" w:hAnsi="Lucida Sans"/>
+        </w:rPr>
+        <w:t>Source code of the function</w:t>
+      </w:r>
+    </w:p>
+    <w:p>
+      <w:pPr>
+        <w:pStyle w:val="ListParagraph"/>
+        <w:numPr>
+          <w:ilvl w:val="1"/>
+          <w:numId w:val="17"/>
+        </w:numPr>
+        <w:rPr>
+          <w:rFonts w:ascii="Lucida Sans" w:hAnsi="Lucida Sans"/>
+        </w:rPr>
+      </w:pPr>
+      <w:r>
+        <w:rPr>
+          <w:rFonts w:ascii="Lucida Sans" w:hAnsi="Lucida Sans"/>
+        </w:rPr>
+        <w:t>Set in FnExpr.Parse and NewInstanceExpr.Build</w:t>
+      </w:r>
+    </w:p>
+    <w:p>
+      <w:pPr>
+        <w:pStyle w:val="ListParagraph"/>
+        <w:numPr>
+          <w:ilvl w:val="1"/>
+          <w:numId w:val="17"/>
+        </w:numPr>
+        <w:rPr>
+          <w:rFonts w:ascii="Lucida Sans" w:hAnsi="Lucida Sans"/>
+        </w:rPr>
+      </w:pPr>
+      <w:r>
+        <w:rPr>
+          <w:rFonts w:ascii="Lucida Sans" w:hAnsi="Lucida Sans"/>
+        </w:rPr>
+        <w:t>Used in EmitLoadNsInitForDefType – that’s it.</w:t>
+      </w:r>
+    </w:p>
+    <w:p>
+      <w:pPr>
+        <w:pStyle w:val="ListParagraph"/>
+        <w:numPr>
+          <w:ilvl w:val="0"/>
+          <w:numId w:val="17"/>
+        </w:numPr>
+        <w:rPr>
+          <w:rFonts w:ascii="Lucida Sans" w:hAnsi="Lucida Sans"/>
+        </w:rPr>
+      </w:pPr>
+      <w:r>
+        <w:rPr>
+          <w:rFonts w:ascii="Lucida Sans" w:hAnsi="Lucida Sans"/>
+        </w:rPr>
+        <w:t>Opts</w:t>
+      </w:r>
+    </w:p>
+    <w:p>
+      <w:pPr>
+        <w:pStyle w:val="ListParagraph"/>
+        <w:numPr>
+          <w:ilvl w:val="1"/>
+          <w:numId w:val="17"/>
+        </w:numPr>
+        <w:rPr>
+          <w:rFonts w:ascii="Lucida Sans" w:hAnsi="Lucida Sans"/>
+        </w:rPr>
+      </w:pPr>
+      <w:r>
+        <w:rPr>
+          <w:rFonts w:ascii="Lucida Sans" w:hAnsi="Lucida Sans"/>
+        </w:rPr>
+        <w:t>Options map from deftype</w:t>
+      </w:r>
+    </w:p>
+    <w:p>
+      <w:pPr>
+        <w:pStyle w:val="ListParagraph"/>
+        <w:numPr>
+          <w:ilvl w:val="1"/>
+          <w:numId w:val="17"/>
+        </w:numPr>
+        <w:rPr>
+          <w:rFonts w:ascii="Lucida Sans" w:hAnsi="Lucida Sans"/>
+        </w:rPr>
+      </w:pPr>
+      <w:r>
+        <w:rPr>
+          <w:rFonts w:ascii="Lucida Sans" w:hAnsi="Lucida Sans"/>
+        </w:rPr>
+        <w:t>Only set in NewInstanceExpr.Build</w:t>
+      </w:r>
+    </w:p>
+    <w:p>
+      <w:pPr>
+        <w:pStyle w:val="ListParagraph"/>
+        <w:numPr>
+          <w:ilvl w:val="1"/>
+          <w:numId w:val="17"/>
+        </w:numPr>
+        <w:rPr>
+          <w:rFonts w:ascii="Lucida Sans" w:hAnsi="Lucida Sans"/>
+        </w:rPr>
+      </w:pPr>
+      <w:r>
+        <w:rPr>
+          <w:rFonts w:ascii="Lucida Sans" w:hAnsi="Lucida Sans"/>
+        </w:rPr>
+        <w:t>Only checked to see if :load-ns is true.</w:t>
+      </w:r>
+    </w:p>
+    <w:p>
+      <w:pPr>
+        <w:shd w:val="clear" w:color="auto" w:fill="F8F8F8"/>
+        <w:tabs>
+          <w:tab w:val="left" w:pos="916"/>
+          <w:tab w:val="left" w:pos="1832"/>
+          <w:tab w:val="left" w:pos="2748"/>
+          <w:tab w:val="left" w:pos="3664"/>
+          <w:tab w:val="left" w:pos="4580"/>
+          <w:tab w:val="left" w:pos="5496"/>
+          <w:tab w:val="left" w:pos="6412"/>
+          <w:tab w:val="left" w:pos="7328"/>
+          <w:tab w:val="left" w:pos="8244"/>
+          <w:tab w:val="left" w:pos="9160"/>
+          <w:tab w:val="left" w:pos="10076"/>
+          <w:tab w:val="left" w:pos="10992"/>
+          <w:tab w:val="left" w:pos="11908"/>
+          <w:tab w:val="left" w:pos="12824"/>
+          <w:tab w:val="left" w:pos="13740"/>
+          <w:tab w:val="left" w:pos="14656"/>
+        </w:tabs>
+        <w:wordWrap w:val="0"/>
+        <w:spacing w:after="0" w:line="336" w:lineRule="atLeast"/>
+        <w:ind w:left="1080"/>
+        <w:rPr>
+          <w:rFonts w:ascii="Consolas" w:eastAsia="Times New Roman" w:hAnsi="Consolas" w:cs="Courier New"/>
+          <w:color w:val="555555"/>
+          <w:kern w:val="0"/>
+          <w:sz w:val="23"/>
+          <w:szCs w:val="23"/>
+          <w14:ligatures w14:val="none"/>
+        </w:rPr>
+      </w:pPr>
+      <w:r>
+        <w:rPr>
+          <w:rFonts w:ascii="Consolas" w:eastAsia="Times New Roman" w:hAnsi="Consolas" w:cs="Courier New"/>
+          <w:color w:val="555555"/>
+          <w:kern w:val="0"/>
+          <w:sz w:val="23"/>
+          <w:szCs w:val="23"/>
+          <w14:ligatures w14:val="none"/>
+        </w:rPr>
+        <w:t>- if true, importing the type class will cause the</w:t>
+      </w:r>
+    </w:p>
+    <w:p>
+      <w:pPr>
+        <w:shd w:val="clear" w:color="auto" w:fill="F8F8F8"/>
+        <w:tabs>
+          <w:tab w:val="left" w:pos="916"/>
+          <w:tab w:val="left" w:pos="1832"/>
+          <w:tab w:val="left" w:pos="2748"/>
+          <w:tab w:val="left" w:pos="3664"/>
+          <w:tab w:val="left" w:pos="4580"/>
+          <w:tab w:val="left" w:pos="5496"/>
+          <w:tab w:val="left" w:pos="6412"/>
+          <w:tab w:val="left" w:pos="7328"/>
+          <w:tab w:val="left" w:pos="8244"/>
+          <w:tab w:val="left" w:pos="9160"/>
+          <w:tab w:val="left" w:pos="10076"/>
+          <w:tab w:val="left" w:pos="10992"/>
+          <w:tab w:val="left" w:pos="11908"/>
+          <w:tab w:val="left" w:pos="12824"/>
+          <w:tab w:val="left" w:pos="13740"/>
+          <w:tab w:val="left" w:pos="14656"/>
+        </w:tabs>
+        <w:wordWrap w:val="0"/>
+        <w:spacing w:after="0" w:line="336" w:lineRule="atLeast"/>
+        <w:ind w:left="1080"/>
+        <w:rPr>
+          <w:rFonts w:ascii="Consolas" w:eastAsia="Times New Roman" w:hAnsi="Consolas" w:cs="Courier New"/>
+          <w:color w:val="555555"/>
+          <w:kern w:val="0"/>
+          <w:sz w:val="23"/>
+          <w:szCs w:val="23"/>
+          <w14:ligatures w14:val="none"/>
+        </w:rPr>
+      </w:pPr>
+      <w:r>
+        <w:rPr>
+          <w:rFonts w:ascii="Consolas" w:eastAsia="Times New Roman" w:hAnsi="Consolas" w:cs="Courier New"/>
+          <w:color w:val="555555"/>
+          <w:kern w:val="0"/>
+          <w:sz w:val="23"/>
+          <w:szCs w:val="23"/>
+          <w14:ligatures w14:val="none"/>
+        </w:rPr>
+        <w:t xml:space="preserve">           namespace in which the type was defined to be loaded.</w:t>
+      </w:r>
+    </w:p>
+    <w:p>
+      <w:pPr>
+        <w:shd w:val="clear" w:color="auto" w:fill="F8F8F8"/>
+        <w:tabs>
+          <w:tab w:val="left" w:pos="916"/>
+          <w:tab w:val="left" w:pos="1832"/>
+          <w:tab w:val="left" w:pos="2748"/>
+          <w:tab w:val="left" w:pos="3664"/>
+          <w:tab w:val="left" w:pos="4580"/>
+          <w:tab w:val="left" w:pos="5496"/>
+          <w:tab w:val="left" w:pos="6412"/>
+          <w:tab w:val="left" w:pos="7328"/>
+          <w:tab w:val="left" w:pos="8244"/>
+          <w:tab w:val="left" w:pos="9160"/>
+          <w:tab w:val="left" w:pos="10076"/>
+          <w:tab w:val="left" w:pos="10992"/>
+          <w:tab w:val="left" w:pos="11908"/>
+          <w:tab w:val="left" w:pos="12824"/>
+          <w:tab w:val="left" w:pos="13740"/>
+          <w:tab w:val="left" w:pos="14656"/>
+        </w:tabs>
+        <w:wordWrap w:val="0"/>
+        <w:spacing w:after="0" w:line="336" w:lineRule="atLeast"/>
+        <w:ind w:left="1080"/>
+        <w:rPr>
+          <w:rFonts w:ascii="Consolas" w:eastAsia="Times New Roman" w:hAnsi="Consolas" w:cs="Courier New"/>
+          <w:color w:val="555555"/>
+          <w:kern w:val="0"/>
+          <w:sz w:val="23"/>
+          <w:szCs w:val="23"/>
+          <w14:ligatures w14:val="none"/>
+        </w:rPr>
+      </w:pPr>
+      <w:r>
+        <w:rPr>
+          <w:rFonts w:ascii="Consolas" w:eastAsia="Times New Roman" w:hAnsi="Consolas" w:cs="Courier New"/>
+          <w:color w:val="555555"/>
+          <w:kern w:val="0"/>
+          <w:sz w:val="23"/>
+          <w:szCs w:val="23"/>
+          <w14:ligatures w14:val="none"/>
+        </w:rPr>
+        <w:t xml:space="preserve">           Defaults to false.</w:t>
+      </w:r>
+    </w:p>
+    <w:p>
+      <w:pPr>
+        <w:shd w:val="clear" w:color="auto" w:fill="F8F8F8"/>
+        <w:tabs>
+          <w:tab w:val="left" w:pos="916"/>
+          <w:tab w:val="left" w:pos="1832"/>
+          <w:tab w:val="left" w:pos="2748"/>
+          <w:tab w:val="left" w:pos="3664"/>
+          <w:tab w:val="left" w:pos="4580"/>
+          <w:tab w:val="left" w:pos="5496"/>
+          <w:tab w:val="left" w:pos="6412"/>
+          <w:tab w:val="left" w:pos="7328"/>
+          <w:tab w:val="left" w:pos="8244"/>
+          <w:tab w:val="left" w:pos="9160"/>
+          <w:tab w:val="left" w:pos="10076"/>
+          <w:tab w:val="left" w:pos="10992"/>
+          <w:tab w:val="left" w:pos="11908"/>
+          <w:tab w:val="left" w:pos="12824"/>
+          <w:tab w:val="left" w:pos="13740"/>
+          <w:tab w:val="left" w:pos="14656"/>
+        </w:tabs>
+        <w:wordWrap w:val="0"/>
+        <w:spacing w:after="0" w:line="336" w:lineRule="atLeast"/>
+        <w:ind w:left="1080"/>
+        <w:rPr>
+          <w:rFonts w:ascii="Consolas" w:eastAsia="Times New Roman" w:hAnsi="Consolas" w:cs="Courier New"/>
+          <w:color w:val="555555"/>
+          <w:kern w:val="0"/>
+          <w:sz w:val="23"/>
+          <w:szCs w:val="23"/>
+          <w14:ligatures w14:val="none"/>
+        </w:rPr>
+      </w:pPr>
+      <w:r>
+        <w:rPr>
+          <w:rFonts w:ascii="Consolas" w:eastAsia="Times New Roman" w:hAnsi="Consolas" w:cs="Courier New"/>
+          <w:color w:val="555555"/>
+          <w:kern w:val="0"/>
+          <w:sz w:val="23"/>
+          <w:szCs w:val="23"/>
+          <w14:ligatures w14:val="none"/>
+        </w:rPr>
+        <w:t xml:space="preserve"> </w:t>
+      </w:r>
+    </w:p>
+    <w:p>
+      <w:pPr>
+        <w:pStyle w:val="ListParagraph"/>
+        <w:numPr>
+          <w:ilvl w:val="0"/>
+          <w:numId w:val="20"/>
+        </w:numPr>
+      </w:pPr>
+      <w:r>
+        <w:t>SpanMap</w:t>
+      </w:r>
+    </w:p>
+    <w:p>
+      <w:pPr>
+        <w:pStyle w:val="ListParagraph"/>
+        <w:numPr>
+          <w:ilvl w:val="1"/>
+          <w:numId w:val="20"/>
+        </w:numPr>
+      </w:pPr>
+      <w:r>
+        <w:t>The file span the function occupies</w:t>
+      </w:r>
+    </w:p>
+    <w:p>
+      <w:pPr>
+        <w:pStyle w:val="ListParagraph"/>
+        <w:numPr>
+          <w:ilvl w:val="1"/>
+          <w:numId w:val="20"/>
+        </w:numPr>
+      </w:pPr>
+      <w:r>
+        <w:t>Set in the FnExpr.Parse and NewInstanceExpr.Build</w:t>
+      </w:r>
+    </w:p>
+    <w:p>
+      <w:pPr>
+        <w:pStyle w:val="ListParagraph"/>
+        <w:numPr>
+          <w:ilvl w:val="1"/>
+          <w:numId w:val="20"/>
+        </w:numPr>
+      </w:pPr>
+      <w:r>
+        <w:t>Used to set some debug info</w:t>
+      </w:r>
+    </w:p>
+    <w:p>
+      <w:pPr>
+        <w:pStyle w:val="ListParagraph"/>
+        <w:numPr>
+          <w:ilvl w:val="0"/>
+          <w:numId w:val="20"/>
+        </w:numPr>
+      </w:pPr>
+      <w:r>
+        <w:t>ClassMeta</w:t>
+      </w:r>
+    </w:p>
+    <w:p>
+      <w:pPr>
+        <w:pStyle w:val="ListParagraph"/>
+        <w:numPr>
+          <w:ilvl w:val="1"/>
+          <w:numId w:val="20"/>
+        </w:numPr>
+      </w:pPr>
+      <w:r>
+        <w:t>Extraction of attributes from deftype metadata</w:t>
+      </w:r>
+    </w:p>
+    <w:p>
+      <w:pPr>
+        <w:pStyle w:val="ListParagraph"/>
+        <w:numPr>
+          <w:ilvl w:val="0"/>
+          <w:numId w:val="20"/>
+        </w:numPr>
+      </w:pPr>
+      <w:r>
+        <w:t>MetaField</w:t>
+      </w:r>
+    </w:p>
+    <w:p>
+      <w:pPr>
+        <w:pStyle w:val="ListParagraph"/>
+        <w:numPr>
+          <w:ilvl w:val="1"/>
+          <w:numId w:val="20"/>
+        </w:numPr>
+      </w:pPr>
+      <w:r>
+        <w:lastRenderedPageBreak/>
+        <w:t>A FieldBuilder. For a field named “__meta” to hold metadata</w:t>
+      </w:r>
+    </w:p>
+    <w:p>
+      <w:pPr>
+        <w:pStyle w:val="ListParagraph"/>
+        <w:numPr>
+          <w:ilvl w:val="1"/>
+          <w:numId w:val="20"/>
+        </w:numPr>
+      </w:pPr>
+      <w:r>
+        <w:t>NewInstanceExpr only</w:t>
+      </w:r>
+    </w:p>
+    <w:p>
+      <w:pPr>
+        <w:pStyle w:val="ListParagraph"/>
+        <w:numPr>
+          <w:ilvl w:val="1"/>
+          <w:numId w:val="20"/>
+        </w:numPr>
+      </w:pPr>
+      <w:r>
+        <w:t>ObjExpr.SupportsMeta =&gt; IsDefType – all over the code for generating constructors and the like.  Also to provide support code for IObj and IMeta implementations.</w:t>
+      </w:r>
+    </w:p>
+    <w:p>
+      <w:pPr>
+        <w:pStyle w:val="ListParagraph"/>
+        <w:numPr>
+          <w:ilvl w:val="1"/>
+          <w:numId w:val="20"/>
+        </w:numPr>
+      </w:pPr>
+      <w:r>
+        <w:t>ObjExpr.SupportsMeta overridden in FnExpr – depends on whether the form has metadata to attach</w:t>
+      </w:r>
+    </w:p>
+    <w:p>
+      <w:pPr>
+        <w:ind w:left="1080"/>
+      </w:pPr>
+    </w:p>
+    <w:p>
+      <w:pPr>
+        <w:pStyle w:val="Heading3"/>
+      </w:pPr>
+    </w:p>
+    <w:p>
+      <w:pPr>
+        <w:pStyle w:val="Heading3"/>
+      </w:pPr>
+      <w:r>
+        <w:t>Body analysis</w:t>
+      </w:r>
+    </w:p>
+    <w:p>
+      <w:pPr>
+        <w:rPr>
+          <w:rFonts w:ascii="Lucida Sans" w:hAnsi="Lucida Sans"/>
+        </w:rPr>
+      </w:pPr>
+    </w:p>
+    <w:p>
+      <w:pPr>
+        <w:rPr>
+          <w:rFonts w:ascii="Lucida Sans" w:hAnsi="Lucida Sans"/>
+        </w:rPr>
+      </w:pPr>
+      <w:r>
+        <w:rPr>
+          <w:rFonts w:ascii="Lucida Sans" w:hAnsi="Lucida Sans"/>
+        </w:rPr>
+        <w:t>As forms in the body are analyzed, they contribute to certain data structures in the containing function.</w:t>
+      </w:r>
+    </w:p>
+    <w:p>
+      <w:pPr>
+        <w:pStyle w:val="ListParagraph"/>
+        <w:numPr>
+          <w:ilvl w:val="0"/>
+          <w:numId w:val="18"/>
+        </w:numPr>
+        <w:rPr>
+          <w:rFonts w:ascii="Lucida Sans" w:hAnsi="Lucida Sans"/>
+        </w:rPr>
+      </w:pPr>
+      <w:r>
+        <w:rPr>
+          <w:rFonts w:ascii="Lucida Sans" w:hAnsi="Lucida Sans"/>
+        </w:rPr>
+        <w:t>Closes</w:t>
+      </w:r>
+    </w:p>
+    <w:p>
+      <w:pPr>
+        <w:pStyle w:val="ListParagraph"/>
+        <w:numPr>
+          <w:ilvl w:val="1"/>
+          <w:numId w:val="18"/>
+        </w:numPr>
+        <w:rPr>
+          <w:rFonts w:ascii="Lucida Sans" w:hAnsi="Lucida Sans"/>
+        </w:rPr>
+      </w:pPr>
+      <w:r>
+        <w:rPr>
+          <w:rFonts w:ascii="Lucida Sans" w:hAnsi="Lucida Sans"/>
+        </w:rPr>
+        <w:t>Map, with key=value.</w:t>
+      </w:r>
+    </w:p>
+    <w:p>
+      <w:pPr>
+        <w:pStyle w:val="ListParagraph"/>
+        <w:numPr>
+          <w:ilvl w:val="1"/>
+          <w:numId w:val="18"/>
+        </w:numPr>
+        <w:rPr>
+          <w:rFonts w:ascii="Lucida Sans" w:hAnsi="Lucida Sans"/>
+        </w:rPr>
+      </w:pPr>
+      <w:r>
+        <w:rPr>
+          <w:rFonts w:ascii="Lucida Sans" w:hAnsi="Lucida Sans"/>
+        </w:rPr>
+        <w:t>Key/value = Loca binding from outer scope that is being used.</w:t>
+      </w:r>
+    </w:p>
+    <w:p>
+      <w:pPr>
+        <w:pStyle w:val="ListParagraph"/>
+        <w:numPr>
+          <w:ilvl w:val="1"/>
+          <w:numId w:val="18"/>
+        </w:numPr>
+        <w:rPr>
+          <w:rFonts w:ascii="Lucida Sans" w:hAnsi="Lucida Sans"/>
+        </w:rPr>
+      </w:pPr>
+      <w:r>
+        <w:rPr>
+          <w:rFonts w:ascii="Lucida Sans" w:hAnsi="Lucida Sans"/>
+        </w:rPr>
+        <w:t>ObjExpr.CtorType – used to build the constructor</w:t>
+      </w:r>
+    </w:p>
+    <w:p>
+      <w:pPr>
+        <w:pStyle w:val="ListParagraph"/>
+        <w:numPr>
+          <w:ilvl w:val="1"/>
+          <w:numId w:val="18"/>
+        </w:numPr>
+        <w:rPr>
+          <w:rFonts w:ascii="Lucida Sans" w:hAnsi="Lucida Sans"/>
+        </w:rPr>
+      </w:pPr>
+      <w:r>
+        <w:rPr>
+          <w:rFonts w:ascii="Lucida Sans" w:hAnsi="Lucida Sans"/>
+        </w:rPr>
+        <w:t>ObjExpr.EmitLocal, ObjExpr.EmitUnboxedLocal – consult to emit reference to a local</w:t>
+      </w:r>
+    </w:p>
+    <w:p>
+      <w:pPr>
+        <w:pStyle w:val="ListParagraph"/>
+        <w:numPr>
+          <w:ilvl w:val="1"/>
+          <w:numId w:val="18"/>
+        </w:numPr>
+        <w:rPr>
+          <w:rFonts w:ascii="Lucida Sans" w:hAnsi="Lucida Sans"/>
+        </w:rPr>
+      </w:pPr>
+      <w:r>
+        <w:rPr>
+          <w:rFonts w:ascii="Lucida Sans" w:hAnsi="Lucida Sans"/>
+        </w:rPr>
+        <w:t>Entries added by Compiler.ClosesOver.  This will move up the chain of enclosing functions</w:t>
+      </w:r>
+    </w:p>
+    <w:p>
+      <w:pPr>
+        <w:pStyle w:val="ListParagraph"/>
+        <w:numPr>
+          <w:ilvl w:val="0"/>
+          <w:numId w:val="18"/>
+        </w:numPr>
+        <w:rPr>
+          <w:rFonts w:ascii="Lucida Sans" w:hAnsi="Lucida Sans"/>
+        </w:rPr>
+      </w:pPr>
+      <w:r>
+        <w:rPr>
+          <w:rFonts w:ascii="Lucida Sans" w:hAnsi="Lucida Sans"/>
+        </w:rPr>
+        <w:t>Keywords</w:t>
+      </w:r>
+    </w:p>
+    <w:p>
+      <w:pPr>
+        <w:pStyle w:val="ListParagraph"/>
+        <w:numPr>
+          <w:ilvl w:val="1"/>
+          <w:numId w:val="18"/>
+        </w:numPr>
+        <w:rPr>
+          <w:rFonts w:ascii="Lucida Sans" w:hAnsi="Lucida Sans"/>
+        </w:rPr>
+      </w:pPr>
+      <w:r>
+        <w:rPr>
+          <w:rFonts w:ascii="Lucida Sans" w:hAnsi="Lucida Sans"/>
+        </w:rPr>
+        <w:t>Map from keyword to int (constant reference)</w:t>
+      </w:r>
+    </w:p>
+    <w:p>
+      <w:pPr>
+        <w:pStyle w:val="ListParagraph"/>
+        <w:numPr>
+          <w:ilvl w:val="1"/>
+          <w:numId w:val="18"/>
+        </w:numPr>
+        <w:rPr>
+          <w:rFonts w:ascii="Lucida Sans" w:hAnsi="Lucida Sans"/>
+        </w:rPr>
+      </w:pPr>
+      <w:r>
+        <w:rPr>
+          <w:rFonts w:ascii="Lucida Sans" w:hAnsi="Lucida Sans"/>
+        </w:rPr>
+        <w:t>Track</w:t>
+      </w:r>
+      <w:r>
+        <w:rPr>
+          <w:rFonts w:ascii="Lucida Sans" w:hAnsi="Lucida Sans"/>
+        </w:rPr>
+        <w:t>s all keywords references.</w:t>
+      </w:r>
+    </w:p>
+    <w:p>
+      <w:pPr>
+        <w:pStyle w:val="ListParagraph"/>
+        <w:numPr>
+          <w:ilvl w:val="1"/>
+          <w:numId w:val="18"/>
+        </w:numPr>
+        <w:rPr>
+          <w:rFonts w:ascii="Lucida Sans" w:hAnsi="Lucida Sans"/>
+        </w:rPr>
+      </w:pPr>
+      <w:r>
+        <w:rPr>
+          <w:rFonts w:ascii="Lucida Sans" w:hAnsi="Lucida Sans"/>
+        </w:rPr>
+        <w:t>Compiler.RegisterKeyword in turn calls Compiler.RegisterConstant on the keyword, which returns an id.</w:t>
+      </w:r>
+    </w:p>
+    <w:p>
+      <w:pPr>
+        <w:shd w:val="clear" w:color="auto" w:fill="F8F8F8"/>
+        <w:tabs>
+          <w:tab w:val="left" w:pos="916"/>
+          <w:tab w:val="left" w:pos="1832"/>
+          <w:tab w:val="left" w:pos="2748"/>
+          <w:tab w:val="left" w:pos="3664"/>
+          <w:tab w:val="left" w:pos="4580"/>
+          <w:tab w:val="left" w:pos="5496"/>
+          <w:tab w:val="left" w:pos="6412"/>
+          <w:tab w:val="left" w:pos="7328"/>
+          <w:tab w:val="left" w:pos="8244"/>
+          <w:tab w:val="left" w:pos="9160"/>
+          <w:tab w:val="left" w:pos="10076"/>
+          <w:tab w:val="left" w:pos="10992"/>
+          <w:tab w:val="left" w:pos="11908"/>
+          <w:tab w:val="left" w:pos="12824"/>
+          <w:tab w:val="left" w:pos="13740"/>
+          <w:tab w:val="left" w:pos="14656"/>
+        </w:tabs>
+        <w:wordWrap w:val="0"/>
+        <w:spacing w:after="0" w:line="336" w:lineRule="atLeast"/>
+        <w:ind w:left="1080"/>
+        <w:rPr>
+          <w:rFonts w:ascii="Consolas" w:eastAsia="Times New Roman" w:hAnsi="Consolas" w:cs="Courier New"/>
+          <w:color w:val="555555"/>
+          <w:kern w:val="0"/>
+          <w:sz w:val="23"/>
+          <w:szCs w:val="23"/>
+          <w14:ligatures w14:val="none"/>
+        </w:rPr>
+      </w:pPr>
+      <w:r>
+        <w:rPr>
+          <w:rFonts w:ascii="Consolas" w:eastAsia="Times New Roman" w:hAnsi="Consolas" w:cs="Courier New"/>
+          <w:color w:val="555555"/>
+          <w:kern w:val="0"/>
+          <w:sz w:val="23"/>
+          <w:szCs w:val="23"/>
+          <w14:ligatures w14:val="none"/>
+        </w:rPr>
+        <w:t>- if true, importing the type class will cause the</w:t>
+      </w:r>
+    </w:p>
+    <w:p>
+      <w:pPr>
+        <w:shd w:val="clear" w:color="auto" w:fill="F8F8F8"/>
+        <w:tabs>
+          <w:tab w:val="left" w:pos="916"/>
+          <w:tab w:val="left" w:pos="1832"/>
+          <w:tab w:val="left" w:pos="2748"/>
+          <w:tab w:val="left" w:pos="3664"/>
+          <w:tab w:val="left" w:pos="4580"/>
+          <w:tab w:val="left" w:pos="5496"/>
+          <w:tab w:val="left" w:pos="6412"/>
+          <w:tab w:val="left" w:pos="7328"/>
+          <w:tab w:val="left" w:pos="8244"/>
+          <w:tab w:val="left" w:pos="9160"/>
+          <w:tab w:val="left" w:pos="10076"/>
+          <w:tab w:val="left" w:pos="10992"/>
+          <w:tab w:val="left" w:pos="11908"/>
+          <w:tab w:val="left" w:pos="12824"/>
+          <w:tab w:val="left" w:pos="13740"/>
+          <w:tab w:val="left" w:pos="14656"/>
+        </w:tabs>
+        <w:wordWrap w:val="0"/>
+        <w:spacing w:after="0" w:line="336" w:lineRule="atLeast"/>
+        <w:ind w:left="1080"/>
+        <w:rPr>
+          <w:rFonts w:ascii="Consolas" w:eastAsia="Times New Roman" w:hAnsi="Consolas" w:cs="Courier New"/>
+          <w:color w:val="555555"/>
+          <w:kern w:val="0"/>
+          <w:sz w:val="23"/>
+          <w:szCs w:val="23"/>
+          <w14:ligatures w14:val="none"/>
+        </w:rPr>
+      </w:pPr>
+      <w:r>
+        <w:rPr>
+          <w:rFonts w:ascii="Consolas" w:eastAsia="Times New Roman" w:hAnsi="Consolas" w:cs="Courier New"/>
+          <w:color w:val="555555"/>
+          <w:kern w:val="0"/>
+          <w:sz w:val="23"/>
+          <w:szCs w:val="23"/>
+          <w14:ligatures w14:val="none"/>
+        </w:rPr>
+        <w:t xml:space="preserve">           namespace in which the type was defined to be loaded.</w:t>
+      </w:r>
+    </w:p>
+    <w:p>
+      <w:pPr>
+        <w:shd w:val="clear" w:color="auto" w:fill="F8F8F8"/>
+        <w:tabs>
+          <w:tab w:val="left" w:pos="916"/>
+          <w:tab w:val="left" w:pos="1832"/>
+          <w:tab w:val="left" w:pos="2748"/>
+          <w:tab w:val="left" w:pos="3664"/>
+          <w:tab w:val="left" w:pos="4580"/>
+          <w:tab w:val="left" w:pos="5496"/>
+          <w:tab w:val="left" w:pos="6412"/>
+          <w:tab w:val="left" w:pos="7328"/>
+          <w:tab w:val="left" w:pos="8244"/>
+          <w:tab w:val="left" w:pos="9160"/>
+          <w:tab w:val="left" w:pos="10076"/>
+          <w:tab w:val="left" w:pos="10992"/>
+          <w:tab w:val="left" w:pos="11908"/>
+          <w:tab w:val="left" w:pos="12824"/>
+          <w:tab w:val="left" w:pos="13740"/>
+          <w:tab w:val="left" w:pos="14656"/>
+        </w:tabs>
+        <w:wordWrap w:val="0"/>
+        <w:spacing w:after="0" w:line="336" w:lineRule="atLeast"/>
+        <w:ind w:left="1080"/>
+        <w:rPr>
+          <w:rFonts w:ascii="Consolas" w:eastAsia="Times New Roman" w:hAnsi="Consolas" w:cs="Courier New"/>
+          <w:color w:val="555555"/>
+          <w:kern w:val="0"/>
+          <w:sz w:val="23"/>
+          <w:szCs w:val="23"/>
+          <w14:ligatures w14:val="none"/>
+        </w:rPr>
+      </w:pPr>
+      <w:r>
+        <w:rPr>
+          <w:rFonts w:ascii="Consolas" w:eastAsia="Times New Roman" w:hAnsi="Consolas" w:cs="Courier New"/>
+          <w:color w:val="555555"/>
+          <w:kern w:val="0"/>
+          <w:sz w:val="23"/>
+          <w:szCs w:val="23"/>
+          <w14:ligatures w14:val="none"/>
+        </w:rPr>
+        <w:t xml:space="preserve">           Defaults to false.</w:t>
+      </w:r>
+    </w:p>
+    <w:p>
+      <w:pPr>
+        <w:shd w:val="clear" w:color="auto" w:fill="F8F8F8"/>
+        <w:tabs>
+          <w:tab w:val="left" w:pos="916"/>
+          <w:tab w:val="left" w:pos="1832"/>
+          <w:tab w:val="left" w:pos="2748"/>
+          <w:tab w:val="left" w:pos="3664"/>
+          <w:tab w:val="left" w:pos="4580"/>
+          <w:tab w:val="left" w:pos="5496"/>
+          <w:tab w:val="left" w:pos="6412"/>
+          <w:tab w:val="left" w:pos="7328"/>
+          <w:tab w:val="left" w:pos="8244"/>
+          <w:tab w:val="left" w:pos="9160"/>
+          <w:tab w:val="left" w:pos="10076"/>
+          <w:tab w:val="left" w:pos="10992"/>
+          <w:tab w:val="left" w:pos="11908"/>
+          <w:tab w:val="left" w:pos="12824"/>
+          <w:tab w:val="left" w:pos="13740"/>
+          <w:tab w:val="left" w:pos="14656"/>
+        </w:tabs>
+        <w:wordWrap w:val="0"/>
+        <w:spacing w:after="0" w:line="336" w:lineRule="atLeast"/>
+        <w:ind w:left="1080"/>
+        <w:rPr>
+          <w:rFonts w:ascii="Consolas" w:eastAsia="Times New Roman" w:hAnsi="Consolas" w:cs="Courier New"/>
+          <w:color w:val="555555"/>
+          <w:kern w:val="0"/>
+          <w:sz w:val="23"/>
+          <w:szCs w:val="23"/>
+          <w14:ligatures w14:val="none"/>
+        </w:rPr>
+      </w:pPr>
+      <w:r>
+        <w:rPr>
+          <w:rFonts w:ascii="Consolas" w:eastAsia="Times New Roman" w:hAnsi="Consolas" w:cs="Courier New"/>
+          <w:color w:val="555555"/>
+          <w:kern w:val="0"/>
+          <w:sz w:val="23"/>
+          <w:szCs w:val="23"/>
+          <w14:ligatures w14:val="none"/>
+        </w:rPr>
+        <w:t xml:space="preserve"> Each spec consists of a proto</w:t>
+      </w:r>
+    </w:p>
+    <w:p>
+      <w:pPr>
+        <w:pStyle w:val="ListParagraph"/>
+        <w:numPr>
+          <w:ilvl w:val="0"/>
+          <w:numId w:val="18"/>
+        </w:numPr>
+        <w:rPr>
+          <w:rFonts w:ascii="Lucida Sans" w:hAnsi="Lucida Sans"/>
+        </w:rPr>
+      </w:pPr>
+      <w:r>
+        <w:rPr>
+          <w:rFonts w:ascii="Lucida Sans" w:hAnsi="Lucida Sans"/>
+        </w:rPr>
+        <w:t>Vars</w:t>
+      </w:r>
+    </w:p>
+    <w:p>
+      <w:pPr>
+        <w:pStyle w:val="ListParagraph"/>
+        <w:numPr>
+          <w:ilvl w:val="1"/>
+          <w:numId w:val="18"/>
+        </w:numPr>
+        <w:rPr>
+          <w:rFonts w:ascii="Lucida Sans" w:hAnsi="Lucida Sans"/>
+        </w:rPr>
+      </w:pPr>
+      <w:r>
+        <w:rPr>
+          <w:rFonts w:ascii="Lucida Sans" w:hAnsi="Lucida Sans"/>
+        </w:rPr>
+        <w:t>List of Vars</w:t>
+      </w:r>
+    </w:p>
+    <w:p>
+      <w:pPr>
+        <w:pStyle w:val="ListParagraph"/>
+        <w:numPr>
+          <w:ilvl w:val="1"/>
+          <w:numId w:val="18"/>
+        </w:numPr>
+        <w:rPr>
+          <w:rFonts w:ascii="Lucida Sans" w:hAnsi="Lucida Sans"/>
+        </w:rPr>
+      </w:pPr>
+      <w:r>
+        <w:rPr>
+          <w:rFonts w:ascii="Lucida Sans" w:hAnsi="Lucida Sans"/>
+        </w:rPr>
+        <w:t>Added by Compiler.RegisterVar, which is called by Compiler.LookupVar, Compiler.AnalyzeSymbo, and DefExpr.Parse</w:t>
+      </w:r>
+    </w:p>
+    <w:p>
+      <w:pPr>
+        <w:pStyle w:val="ListParagraph"/>
+        <w:numPr>
+          <w:ilvl w:val="1"/>
+          <w:numId w:val="18"/>
+        </w:numPr>
+        <w:rPr>
+          <w:rFonts w:ascii="Lucida Sans" w:hAnsi="Lucida Sans"/>
+        </w:rPr>
+      </w:pPr>
+      <w:r>
+        <w:rPr>
+          <w:rFonts w:ascii="Lucida Sans" w:hAnsi="Lucida Sans"/>
+        </w:rPr>
+        <w:t>Used in ObjExpr.EmitVar and ObjExpr.EmitVarValue</w:t>
+      </w:r>
+    </w:p>
+    <w:p>
+      <w:pPr>
+        <w:pStyle w:val="ListParagraph"/>
+        <w:numPr>
+          <w:ilvl w:val="0"/>
+          <w:numId w:val="18"/>
+        </w:numPr>
+        <w:rPr>
+          <w:rFonts w:ascii="Lucida Sans" w:hAnsi="Lucida Sans"/>
+        </w:rPr>
+      </w:pPr>
+      <w:r>
+        <w:rPr>
+          <w:rFonts w:ascii="Lucida Sans" w:hAnsi="Lucida Sans"/>
+        </w:rPr>
+        <w:t>Constants</w:t>
+      </w:r>
+    </w:p>
+    <w:p>
+      <w:pPr>
+        <w:pStyle w:val="ListParagraph"/>
+        <w:numPr>
+          <w:ilvl w:val="1"/>
+          <w:numId w:val="18"/>
+        </w:numPr>
+        <w:rPr>
+          <w:rFonts w:ascii="Lucida Sans" w:hAnsi="Lucida Sans"/>
+        </w:rPr>
+      </w:pPr>
+      <w:r>
+        <w:rPr>
+          <w:rFonts w:ascii="Lucida Sans" w:hAnsi="Lucida Sans"/>
+        </w:rPr>
+        <w:t xml:space="preserve">Any constants: numbers, strings, collections, etc. </w:t>
+      </w:r>
+    </w:p>
+    <w:p>
+      <w:pPr>
+        <w:pStyle w:val="ListParagraph"/>
+        <w:numPr>
+          <w:ilvl w:val="1"/>
+          <w:numId w:val="18"/>
+        </w:numPr>
+        <w:rPr>
+          <w:rFonts w:ascii="Lucida Sans" w:hAnsi="Lucida Sans"/>
+        </w:rPr>
+      </w:pPr>
+      <w:r>
+        <w:rPr>
+          <w:rFonts w:ascii="Lucida Sans" w:hAnsi="Lucida Sans"/>
+        </w:rPr>
+        <w:t>Added to by Compiler.RegisterConstant, which is called by by Compiler.RegisterVar, Compiler.RegisterKeyword, the ConstantExpr constructor, and the NumberExpr constructor</w:t>
+      </w:r>
+    </w:p>
+    <w:p>
+      <w:pPr>
+        <w:pStyle w:val="ListParagraph"/>
+        <w:numPr>
+          <w:ilvl w:val="0"/>
+          <w:numId w:val="18"/>
+        </w:numPr>
+        <w:rPr>
+          <w:rFonts w:ascii="Lucida Sans" w:hAnsi="Lucida Sans"/>
+        </w:rPr>
+      </w:pPr>
+      <w:r>
+        <w:rPr>
+          <w:rFonts w:ascii="Lucida Sans" w:hAnsi="Lucida Sans"/>
+        </w:rPr>
+        <w:t>ConstantFields</w:t>
+      </w:r>
+    </w:p>
+    <w:p>
+      <w:pPr>
+        <w:pStyle w:val="ListParagraph"/>
+        <w:numPr>
+          <w:ilvl w:val="1"/>
+          <w:numId w:val="18"/>
+        </w:numPr>
+      </w:pPr>
+      <w:r>
+        <w:rPr>
+          <w:rFonts w:ascii="Lucida Sans" w:hAnsi="Lucida Sans"/>
+        </w:rPr>
+        <w:lastRenderedPageBreak/>
+        <w:t>Map from int (id of Constant) to FieldBuilder.   Static constructor will initialize the fields of the class accordingly.</w:t>
+      </w:r>
+    </w:p>
+    <w:p>
+      <w:pPr>
+        <w:pStyle w:val="ListParagraph"/>
+        <w:numPr>
+          <w:ilvl w:val="1"/>
+          <w:numId w:val="18"/>
+        </w:numPr>
+      </w:pPr>
+      <w:r>
+        <w:rPr>
+          <w:rFonts w:ascii="Lucida Sans" w:hAnsi="Lucida Sans"/>
+        </w:rPr>
+        <w:t>FieldBuilders assigned to a constant by ObjExpr.EmitConstantFieldDefs.</w:t>
+      </w:r>
+    </w:p>
+    <w:p>
+      <w:pPr>
+        <w:pStyle w:val="ListParagraph"/>
+        <w:numPr>
+          <w:ilvl w:val="1"/>
+          <w:numId w:val="18"/>
+        </w:numPr>
+      </w:pPr>
+      <w:r>
+        <w:rPr>
+          <w:rFonts w:ascii="Lucida Sans" w:hAnsi="Lucida Sans"/>
+        </w:rPr>
+        <w:t>That method is called from several places.  There are some issues. Read the comments.</w:t>
+      </w:r>
+    </w:p>
+    <w:p>
+      <w:pPr>
+        <w:pStyle w:val="Heading3"/>
+      </w:pPr>
+      <w:r>
+        <w:t>Compilation artifacts</w:t>
+      </w:r>
+    </w:p>
+    <w:p>
+      <w:pPr>
+        <w:pStyle w:val="ListParagraph"/>
+        <w:numPr>
+          <w:ilvl w:val="0"/>
+          <w:numId w:val="20"/>
+        </w:numPr>
+      </w:pPr>
+      <w:r>
+        <w:t>TypeBuilder</w:t>
+      </w:r>
+    </w:p>
+    <w:p>
+      <w:pPr>
+        <w:pStyle w:val="ListParagraph"/>
+        <w:numPr>
+          <w:ilvl w:val="1"/>
+          <w:numId w:val="20"/>
+        </w:numPr>
+      </w:pPr>
+      <w:r>
+        <w:t>The TypeBuilder being used to construct the function’s class.</w:t>
+      </w:r>
+    </w:p>
+    <w:p>
+      <w:pPr>
+        <w:pStyle w:val="ListParagraph"/>
+        <w:numPr>
+          <w:ilvl w:val="1"/>
+          <w:numId w:val="20"/>
+        </w:numPr>
+      </w:pPr>
+      <w:r>
+        <w:t>Accessed all over the place in order to emit code into the class.</w:t>
+      </w:r>
+    </w:p>
+    <w:p>
+      <w:pPr>
+        <w:pStyle w:val="ListParagraph"/>
+        <w:numPr>
+          <w:ilvl w:val="0"/>
+          <w:numId w:val="20"/>
+        </w:numPr>
+      </w:pPr>
+      <w:r>
+        <w:t>CompiledType</w:t>
+      </w:r>
+    </w:p>
+    <w:p>
+      <w:pPr>
+        <w:pStyle w:val="ListParagraph"/>
+        <w:numPr>
+          <w:ilvl w:val="1"/>
+          <w:numId w:val="20"/>
+        </w:numPr>
+      </w:pPr>
+      <w:r>
+        <w:t>The class built for the function</w:t>
+      </w:r>
+    </w:p>
+    <w:p>
+      <w:pPr>
+        <w:pStyle w:val="ListParagraph"/>
+        <w:numPr>
+          <w:ilvl w:val="1"/>
+          <w:numId w:val="20"/>
+        </w:numPr>
+      </w:pPr>
+      <w:r>
+        <w:t>CompiledType = TypeBuilder.CreateType();</w:t>
+      </w:r>
+    </w:p>
+    <w:p>
+      <w:pPr>
+        <w:pStyle w:val="ListParagraph"/>
+        <w:numPr>
+          <w:ilvl w:val="0"/>
+          <w:numId w:val="20"/>
+        </w:numPr>
+      </w:pPr>
+      <w:r>
+        <w:t>CtorInfo</w:t>
+      </w:r>
+    </w:p>
+    <w:p>
+      <w:pPr>
+        <w:pStyle w:val="ListParagraph"/>
+        <w:numPr>
+          <w:ilvl w:val="0"/>
+          <w:numId w:val="20"/>
+        </w:numPr>
+      </w:pPr>
+      <w:r>
+        <w:t>BasClassClosedOverCtor (NewInstanceExpr only)</w:t>
+      </w:r>
+    </w:p>
+    <w:p>
+      <w:pPr>
+        <w:pStyle w:val="ListParagraph"/>
+        <w:numPr>
+          <w:ilvl w:val="0"/>
+          <w:numId w:val="20"/>
+        </w:numPr>
+      </w:pPr>
+      <w:r>
+        <w:t>BaseClassAltCtor (NewInstanceExpr only)</w:t>
+      </w:r>
+    </w:p>
+    <w:p>
+      <w:pPr>
+        <w:pStyle w:val="ListParagraph"/>
+        <w:numPr>
+          <w:ilvl w:val="0"/>
+          <w:numId w:val="20"/>
+        </w:numPr>
+      </w:pPr>
+      <w:r>
+        <w:t>BaseClassAltCtorNoHash (NewInstanceExpr only)</w:t>
+      </w:r>
+    </w:p>
+    <w:p>
+      <w:pPr>
+        <w:pStyle w:val="ListParagraph"/>
+        <w:numPr>
+          <w:ilvl w:val="1"/>
+          <w:numId w:val="20"/>
+        </w:numPr>
+      </w:pPr>
+      <w:r>
+        <w:t>Hmm. Obviously constructors of various stripes</w:t>
+      </w:r>
+    </w:p>
+    <w:p>
+      <w:pPr>
+        <w:pStyle w:val="ListParagraph"/>
+        <w:numPr>
+          <w:ilvl w:val="0"/>
+          <w:numId w:val="20"/>
+        </w:numPr>
+      </w:pPr>
+      <w:r>
+        <w:t>BaseClass</w:t>
+      </w:r>
+    </w:p>
+    <w:p>
+      <w:pPr>
+        <w:pStyle w:val="ListParagraph"/>
+        <w:numPr>
+          <w:ilvl w:val="1"/>
+          <w:numId w:val="20"/>
+        </w:numPr>
+      </w:pPr>
+      <w:r>
+        <w:t>The output of NewInstanceExpr.CompileBaseClass</w:t>
+      </w:r>
+    </w:p>
+    <w:p>
+      <w:pPr>
+        <w:pStyle w:val="ListParagraph"/>
+        <w:numPr>
+          <w:ilvl w:val="1"/>
+          <w:numId w:val="20"/>
+        </w:numPr>
+      </w:pPr>
+      <w:r>
+        <w:t>Not used</w:t>
+      </w:r>
+    </w:p>
+    <w:p>
+      <w:pPr>
+        <w:pStyle w:val="ListParagraph"/>
+        <w:numPr>
+          <w:ilvl w:val="0"/>
+          <w:numId w:val="20"/>
+        </w:numPr>
+      </w:pPr>
+      <w:r>
+        <w:t>ClosedOverFields</w:t>
+      </w:r>
+    </w:p>
+    <w:p>
+      <w:pPr>
+        <w:pStyle w:val="ListParagraph"/>
+        <w:numPr>
+          <w:ilvl w:val="0"/>
+          <w:numId w:val="20"/>
+        </w:numPr>
+      </w:pPr>
+      <w:r>
+        <w:t>ClosedOverFieldsMap</w:t>
+      </w:r>
+    </w:p>
+    <w:p>
+      <w:pPr>
+        <w:pStyle w:val="ListParagraph"/>
+        <w:numPr>
+          <w:ilvl w:val="0"/>
+          <w:numId w:val="20"/>
+        </w:numPr>
+      </w:pPr>
+      <w:r>
+        <w:t>ClosedOverFieldsToBindingsMap</w:t>
+      </w:r>
+    </w:p>
+    <w:p>
+      <w:pPr>
+        <w:pStyle w:val="ListParagraph"/>
+        <w:numPr>
+          <w:ilvl w:val="1"/>
+          <w:numId w:val="20"/>
+        </w:numPr>
+      </w:pPr>
+      <w:r>
+        <w:t>Added to in ObjExpr.EmitClosedOverFields</w:t>
+      </w:r>
+    </w:p>
+    <w:p>
+      <w:pPr>
+        <w:pStyle w:val="ListParagraph"/>
+        <w:numPr>
+          <w:ilvl w:val="1"/>
+          <w:numId w:val="20"/>
+        </w:numPr>
+      </w:pPr>
+      <w:r>
+        <w:t>ClosedOverFields = just a list of Fieldbuilders</w:t>
+      </w:r>
+    </w:p>
+    <w:p>
+      <w:pPr>
+        <w:pStyle w:val="ListParagraph"/>
+        <w:numPr>
+          <w:ilvl w:val="1"/>
+          <w:numId w:val="20"/>
+        </w:numPr>
+      </w:pPr>
+      <w:r>
+        <w:t>ClosedOverFieldsMap = map from LocalBinding to FieldBuilder</w:t>
+      </w:r>
+    </w:p>
+    <w:p>
+      <w:pPr>
+        <w:pStyle w:val="ListParagraph"/>
+        <w:numPr>
+          <w:ilvl w:val="1"/>
+          <w:numId w:val="20"/>
+        </w:numPr>
+      </w:pPr>
+      <w:r>
+        <w:t>ClosedOverFieldsToBindingsMap = map from FieldBuilder to LocalBinding</w:t>
+      </w:r>
+    </w:p>
+    <w:p>
+      <w:pPr>
+        <w:pStyle w:val="ListParagraph"/>
+        <w:numPr>
+          <w:ilvl w:val="1"/>
+          <w:numId w:val="20"/>
+        </w:numPr>
+      </w:pPr>
+      <w:r>
+        <w:t>Used in NewInstanceExpr.DefineBasClassClosedOverConstructors, ObjExpr.EmitConstructorForNonDefType, ObjExpr.EmitLocal, ObjExpr.EmitUnboxedLocal, ObjExpr.EmitLetFnInits, ObjExpr.EmitAssignLocal, newInstanceExpr.DefineBaseClassClosedOverConstructors, ObjExpr.EmitConstructorForNonDefType</w:t>
+      </w:r>
+    </w:p>
+    <w:p>
+      <w:pPr>
+        <w:pStyle w:val="ListParagraph"/>
+        <w:numPr>
+          <w:ilvl w:val="0"/>
+          <w:numId w:val="20"/>
+        </w:numPr>
+      </w:pPr>
+      <w:r>
+        <w:t>Methods</w:t>
+      </w:r>
+    </w:p>
+    <w:p>
+      <w:pPr>
+        <w:pStyle w:val="ListParagraph"/>
+        <w:numPr>
+          <w:ilvl w:val="1"/>
+          <w:numId w:val="20"/>
+        </w:numPr>
+      </w:pPr>
+      <w:r>
+        <w:t>The methods.  Duh.</w:t>
+      </w:r>
+    </w:p>
+    <w:p>
+      <w:pPr>
+        <w:pStyle w:val="ListParagraph"/>
+        <w:numPr>
+          <w:ilvl w:val="0"/>
+          <w:numId w:val="20"/>
+        </w:numPr>
+      </w:pPr>
+      <w:r>
+        <w:t>CanBeDirect</w:t>
+      </w:r>
+    </w:p>
+    <w:p>
+      <w:pPr>
+        <w:pStyle w:val="ListParagraph"/>
+        <w:numPr>
+          <w:ilvl w:val="1"/>
+          <w:numId w:val="20"/>
+        </w:numPr>
+      </w:pPr>
+      <w:r>
+        <w:t>Bool, true if no enclosing method and no closed-overs and doesn’t use ‘this’.  For FnExprs only</w:t>
+      </w:r>
+    </w:p>
+    <w:p>
+      <w:pPr>
+        <w:pStyle w:val="ListParagraph"/>
+        <w:numPr>
+          <w:ilvl w:val="1"/>
+          <w:numId w:val="20"/>
+        </w:numPr>
+      </w:pPr>
+      <w:r>
+        <w:t>Determines naming of the class, whether we generate static invokes.</w:t>
+      </w:r>
+    </w:p>
     <w:p/>
-    <w:tbl>
-      <w:tblPr>
-        <w:tblStyle w:val="TableGrid"/>
-        <w:tblW w:w="9525" w:type="dxa"/>
-        <w:tblLook w:val="04A0" w:firstRow="1" w:lastRow="0" w:firstColumn="1" w:lastColumn="0" w:noHBand="0" w:noVBand="1"/>
-      </w:tblPr>
-      <w:tblGrid>
-        <w:gridCol w:w="1665"/>
-        <w:gridCol w:w="1770"/>
-        <w:gridCol w:w="1790"/>
-        <w:gridCol w:w="1887"/>
-        <w:gridCol w:w="3668"/>
-      </w:tblGrid>
-      <w:tr>
-        <w:tc>
-          <w:tcPr>
-            <w:tcW w:w="1643" w:type="dxa"/>
-          </w:tcPr>
-          <w:p>
-            <w:r>
-              <w:t>Field</w:t>
-            </w:r>
-          </w:p>
-        </w:tc>
-        <w:tc>
-          <w:tcPr>
-            <w:tcW w:w="1701" w:type="dxa"/>
-          </w:tcPr>
-          <w:p>
-            <w:r>
-              <w:t>Description</w:t>
-            </w:r>
-          </w:p>
-        </w:tc>
-        <w:tc>
-          <w:tcPr>
-            <w:tcW w:w="1720" w:type="dxa"/>
-          </w:tcPr>
-          <w:p>
-            <w:r>
-              <w:t>FnExpr</w:t>
-            </w:r>
-          </w:p>
-        </w:tc>
-        <w:tc>
-          <w:tcPr>
-            <w:tcW w:w="1813" w:type="dxa"/>
-          </w:tcPr>
-          <w:p>
-            <w:r>
-              <w:t>NewInstanceExpr</w:t>
-            </w:r>
-          </w:p>
-        </w:tc>
-        <w:tc>
-          <w:tcPr>
-            <w:tcW w:w="2648" w:type="dxa"/>
-          </w:tcPr>
-          <w:p>
-            <w:r>
-              <w:t>ObjExpr</w:t>
-            </w:r>
-            <w:r>
-              <w:t xml:space="preserve"> or other</w:t>
-            </w:r>
-          </w:p>
-        </w:tc>
-      </w:tr>
-      <w:tr>
-        <w:tc>
-          <w:tcPr>
-            <w:tcW w:w="1643" w:type="dxa"/>
-          </w:tcPr>
-          <w:p>
-            <w:r>
-              <w:t>InternalName</w:t>
-            </w:r>
-          </w:p>
-        </w:tc>
-        <w:tc>
-          <w:tcPr>
-            <w:tcW w:w="1701" w:type="dxa"/>
-          </w:tcPr>
-          <w:p>
-            <w:r>
-              <w:t>Used as class name</w:t>
-            </w:r>
-          </w:p>
-          <w:p>
-            <w:r>
-              <w:t>Usually same as Name except for the __init</w:t>
-            </w:r>
-          </w:p>
-        </w:tc>
-        <w:tc>
-          <w:tcPr>
-            <w:tcW w:w="1720" w:type="dxa"/>
-          </w:tcPr>
-          <w:p>
-            <w:r>
-              <w:t>ComputeNames</w:t>
-            </w:r>
-          </w:p>
-        </w:tc>
-        <w:tc>
-          <w:tcPr>
-            <w:tcW w:w="1813" w:type="dxa"/>
-          </w:tcPr>
-          <w:p>
-            <w:r>
-              <w:t>Build</w:t>
-            </w:r>
-          </w:p>
-        </w:tc>
-        <w:tc>
-          <w:tcPr>
-            <w:tcW w:w="2648" w:type="dxa"/>
-          </w:tcPr>
-          <w:p>
-            <w:r>
-              <w:t>-</w:t>
-            </w:r>
-          </w:p>
-        </w:tc>
-      </w:tr>
-      <w:tr>
-        <w:tc>
-          <w:tcPr>
-            <w:tcW w:w="1643" w:type="dxa"/>
-          </w:tcPr>
-          <w:p>
-            <w:r>
-              <w:t>Name</w:t>
-            </w:r>
-          </w:p>
-        </w:tc>
-        <w:tc>
-          <w:tcPr>
-            <w:tcW w:w="1701" w:type="dxa"/>
-          </w:tcPr>
-          <w:p>
-            <w:r>
-              <w:t>It’s complicated</w:t>
-            </w:r>
-          </w:p>
-        </w:tc>
-        <w:tc>
-          <w:tcPr>
-            <w:tcW w:w="1720" w:type="dxa"/>
-          </w:tcPr>
-          <w:p>
-            <w:r>
-              <w:t>ComputeNames</w:t>
-            </w:r>
-          </w:p>
-        </w:tc>
-        <w:tc>
-          <w:tcPr>
-            <w:tcW w:w="1813" w:type="dxa"/>
-          </w:tcPr>
-          <w:p>
-            <w:r>
-              <w:t>Build</w:t>
-            </w:r>
-          </w:p>
-        </w:tc>
-        <w:tc>
-          <w:tcPr>
-            <w:tcW w:w="2648" w:type="dxa"/>
-          </w:tcPr>
-          <w:p>
-            <w:r>
-              <w:t>-</w:t>
-            </w:r>
-          </w:p>
-        </w:tc>
-      </w:tr>
-      <w:tr>
-        <w:tc>
-          <w:tcPr>
-            <w:tcW w:w="1643" w:type="dxa"/>
-          </w:tcPr>
-          <w:p>
-            <w:r>
-              <w:t>ThisName</w:t>
-            </w:r>
-          </w:p>
-        </w:tc>
-        <w:tc>
-          <w:tcPr>
-            <w:tcW w:w="1701" w:type="dxa"/>
-          </w:tcPr>
-          <w:p>
-            <w:pPr>
-              <w:jc w:val="center"/>
-            </w:pPr>
-            <w:r>
-              <w:t>Name of the _this_ variable</w:t>
-            </w:r>
-          </w:p>
-          <w:p>
-            <w:pPr>
-              <w:jc w:val="center"/>
-            </w:pPr>
-            <w:r>
-              <w:t>Will be registered as a local in FnMethod.Parse</w:t>
-            </w:r>
-          </w:p>
-        </w:tc>
-        <w:tc>
-          <w:tcPr>
-            <w:tcW w:w="1720" w:type="dxa"/>
-          </w:tcPr>
-          <w:p>
-            <w:r>
-              <w:t>Parse</w:t>
-            </w:r>
-          </w:p>
-        </w:tc>
-        <w:tc>
-          <w:tcPr>
-            <w:tcW w:w="1813" w:type="dxa"/>
-          </w:tcPr>
-          <w:p>
-            <w:r>
-              <w:t>Build</w:t>
-            </w:r>
-          </w:p>
-        </w:tc>
-        <w:tc>
-          <w:tcPr>
-            <w:tcW w:w="2648" w:type="dxa"/>
-          </w:tcPr>
-          <w:p/>
-        </w:tc>
-      </w:tr>
-      <w:tr>
-        <w:tc>
-          <w:tcPr>
-            <w:tcW w:w="1643" w:type="dxa"/>
-          </w:tcPr>
-          <w:p>
-            <w:r>
-              <w:t>_tag</w:t>
-            </w:r>
-          </w:p>
-        </w:tc>
-        <w:tc>
-          <w:tcPr>
-            <w:tcW w:w="1701" w:type="dxa"/>
-          </w:tcPr>
-          <w:p>
-            <w:r>
-              <w:t>The return type tag</w:t>
-            </w:r>
-          </w:p>
-        </w:tc>
-        <w:tc>
-          <w:tcPr>
-            <w:tcW w:w="1720" w:type="dxa"/>
-          </w:tcPr>
-          <w:p>
-            <w:r>
-              <w:t>Tag of form</w:t>
-            </w:r>
-          </w:p>
-        </w:tc>
-        <w:tc>
-          <w:tcPr>
-            <w:tcW w:w="1813" w:type="dxa"/>
-          </w:tcPr>
-          <w:p>
-            <w:r>
-              <w:t>Set to null</w:t>
-            </w:r>
-          </w:p>
-        </w:tc>
-        <w:tc>
-          <w:tcPr>
-            <w:tcW w:w="2648" w:type="dxa"/>
-          </w:tcPr>
-          <w:p>
-            <w:r>
-              <w:t>ctor</w:t>
-            </w:r>
-          </w:p>
-        </w:tc>
-      </w:tr>
-      <w:tr>
-        <w:tc>
-          <w:tcPr>
-            <w:tcW w:w="1643" w:type="dxa"/>
-          </w:tcPr>
-          <w:p>
-            <w:r>
-              <w:t>Src</w:t>
-            </w:r>
-          </w:p>
-        </w:tc>
-        <w:tc>
-          <w:tcPr>
-            <w:tcW w:w="1701" w:type="dxa"/>
-          </w:tcPr>
-          <w:p>
-            <w:r>
-              <w:t>Source code of the function</w:t>
-            </w:r>
-          </w:p>
-        </w:tc>
-        <w:tc>
-          <w:tcPr>
-            <w:tcW w:w="1720" w:type="dxa"/>
-          </w:tcPr>
-          <w:p>
-            <w:r>
-              <w:t>Set in Parse</w:t>
-            </w:r>
-          </w:p>
-        </w:tc>
-        <w:tc>
-          <w:tcPr>
-            <w:tcW w:w="1813" w:type="dxa"/>
-          </w:tcPr>
-          <w:p>
-            <w:r>
-              <w:t>Set in Build</w:t>
-            </w:r>
-          </w:p>
-        </w:tc>
-        <w:tc>
-          <w:tcPr>
-            <w:tcW w:w="2648" w:type="dxa"/>
-          </w:tcPr>
-          <w:p>
-            <w:r>
-              <w:t>Used in EmitLoadNsInitForDefType</w:t>
-            </w:r>
-          </w:p>
-        </w:tc>
-      </w:tr>
-      <w:tr>
-        <w:tc>
-          <w:tcPr>
-            <w:tcW w:w="1643" w:type="dxa"/>
-          </w:tcPr>
-          <w:p>
-            <w:r>
-              <w:t>Opts</w:t>
-            </w:r>
-          </w:p>
-        </w:tc>
-        <w:tc>
-          <w:tcPr>
-            <w:tcW w:w="1701" w:type="dxa"/>
-          </w:tcPr>
-          <w:p/>
-        </w:tc>
-        <w:tc>
-          <w:tcPr>
-            <w:tcW w:w="1720" w:type="dxa"/>
-          </w:tcPr>
-          <w:p/>
-        </w:tc>
-        <w:tc>
-          <w:tcPr>
-            <w:tcW w:w="1813" w:type="dxa"/>
-          </w:tcPr>
-          <w:p>
-            <w:r>
-              <w:t>Set in Build</w:t>
-            </w:r>
-          </w:p>
-        </w:tc>
-        <w:tc>
-          <w:tcPr>
-            <w:tcW w:w="2648" w:type="dxa"/>
-          </w:tcPr>
-          <w:p>
-            <w:r>
-              <w:t>Checked for :load-ns true to decide if call EmitLoadNsInitForDefType</w:t>
-            </w:r>
-          </w:p>
-        </w:tc>
-      </w:tr>
-      <w:tr>
-        <w:tc>
-          <w:tcPr>
-            <w:tcW w:w="1643" w:type="dxa"/>
-          </w:tcPr>
-          <w:p>
-            <w:r>
-              <w:t>Closes</w:t>
-            </w:r>
-          </w:p>
-        </w:tc>
-        <w:tc>
-          <w:tcPr>
-            <w:tcW w:w="1701" w:type="dxa"/>
-          </w:tcPr>
-          <w:p>
-            <w:r>
-              <w:t xml:space="preserve">Map, but key=value.  Key/Value </w:t>
-            </w:r>
-            <w:r>
-              <w:t xml:space="preserve">= </w:t>
-            </w:r>
-            <w:r>
-              <w:t xml:space="preserve"> local binding </w:t>
-            </w:r>
-            <w:r>
-              <w:t xml:space="preserve">from outer scope </w:t>
-            </w:r>
-            <w:r>
-              <w:t xml:space="preserve">that is </w:t>
-            </w:r>
-            <w:r>
-              <w:t>used</w:t>
-            </w:r>
-            <w:r>
-              <w:t>.</w:t>
-            </w:r>
-          </w:p>
-        </w:tc>
-        <w:tc>
-          <w:tcPr>
-            <w:tcW w:w="1720" w:type="dxa"/>
-          </w:tcPr>
-          <w:p/>
-        </w:tc>
-        <w:tc>
-          <w:tcPr>
-            <w:tcW w:w="1813" w:type="dxa"/>
-          </w:tcPr>
-          <w:p/>
-        </w:tc>
-        <w:tc>
-          <w:tcPr>
-            <w:tcW w:w="2648" w:type="dxa"/>
-          </w:tcPr>
-          <w:p>
-            <w:r>
-              <w:t>CtorTypes == used to build the constructor</w:t>
-            </w:r>
-          </w:p>
-          <w:p>
-            <w:r>
-              <w:t xml:space="preserve">EmitLocal/EmitUnboxedLocal – </w:t>
-            </w:r>
-          </w:p>
-          <w:p>
-            <w:r>
-              <w:t>Compiler.ClosesOver – adds up the line.</w:t>
-            </w:r>
-          </w:p>
-        </w:tc>
-      </w:tr>
-      <w:tr>
-        <w:tc>
-          <w:tcPr>
-            <w:tcW w:w="1643" w:type="dxa"/>
-          </w:tcPr>
-          <w:p>
-            <w:r>
-              <w:t>Keywords</w:t>
-            </w:r>
-          </w:p>
-        </w:tc>
-        <w:tc>
-          <w:tcPr>
-            <w:tcW w:w="1701" w:type="dxa"/>
-          </w:tcPr>
-          <w:p>
-            <w:r>
-              <w:t xml:space="preserve">Any keywords referenced. </w:t>
-            </w:r>
-          </w:p>
-        </w:tc>
-        <w:tc>
-          <w:tcPr>
-            <w:tcW w:w="1720" w:type="dxa"/>
-          </w:tcPr>
-          <w:p>
-            <w:r>
-              <w:t>Inited from KeywordsVar</w:t>
-            </w:r>
-          </w:p>
-        </w:tc>
-        <w:tc>
-          <w:tcPr>
-            <w:tcW w:w="1813" w:type="dxa"/>
-          </w:tcPr>
-          <w:p>
-            <w:r>
-              <w:t>Inited from KeywordsVar</w:t>
-            </w:r>
-          </w:p>
-        </w:tc>
-        <w:tc>
-          <w:tcPr>
-            <w:tcW w:w="2648" w:type="dxa"/>
-          </w:tcPr>
-          <w:p>
-            <w:r>
-              <w:t>KeywordsVar added to by Compiler.RegisterKeyword – this calls RegisterConstant on the keyword, which returns an id.  Keyword-&gt;id goes into the map.</w:t>
-            </w:r>
-          </w:p>
-        </w:tc>
-      </w:tr>
-      <w:tr>
-        <w:tc>
-          <w:tcPr>
-            <w:tcW w:w="1643" w:type="dxa"/>
-          </w:tcPr>
-          <w:p>
-            <w:r>
-              <w:t>Vars</w:t>
-            </w:r>
-          </w:p>
-        </w:tc>
-        <w:tc>
-          <w:tcPr>
-            <w:tcW w:w="1701" w:type="dxa"/>
-          </w:tcPr>
-          <w:p/>
-        </w:tc>
-        <w:tc>
-          <w:tcPr>
-            <w:tcW w:w="1720" w:type="dxa"/>
-          </w:tcPr>
-          <w:p/>
-        </w:tc>
-        <w:tc>
-          <w:tcPr>
-            <w:tcW w:w="1813" w:type="dxa"/>
-          </w:tcPr>
-          <w:p/>
-        </w:tc>
-        <w:tc>
-          <w:tcPr>
-            <w:tcW w:w="2648" w:type="dxa"/>
-          </w:tcPr>
-          <w:p>
-            <w:r>
-              <w:t>Used in ObjExpr.EmitVar and ObjExpr.EmitVarValue</w:t>
-            </w:r>
-          </w:p>
-          <w:p/>
-          <w:p>
-            <w:r>
-              <w:t>Set by Compiler.RegisterVar.</w:t>
-            </w:r>
-          </w:p>
-          <w:p>
-            <w:r>
-              <w:t>RegisterVar called by Compiler.LookupVar  and Compiler.AnalyzeSymbol and DefExpr.Parse (need to look at this).</w:t>
-            </w:r>
-          </w:p>
-        </w:tc>
-      </w:tr>
-      <w:tr>
-        <w:tc>
-          <w:tcPr>
-            <w:tcW w:w="1643" w:type="dxa"/>
-          </w:tcPr>
-          <w:p>
-            <w:r>
-              <w:lastRenderedPageBreak/>
-              <w:t>Constants</w:t>
-            </w:r>
-          </w:p>
-        </w:tc>
-        <w:tc>
-          <w:tcPr>
-            <w:tcW w:w="1701" w:type="dxa"/>
-          </w:tcPr>
-          <w:p/>
-        </w:tc>
-        <w:tc>
-          <w:tcPr>
-            <w:tcW w:w="1720" w:type="dxa"/>
-          </w:tcPr>
-          <w:p/>
-        </w:tc>
-        <w:tc>
-          <w:tcPr>
-            <w:tcW w:w="1813" w:type="dxa"/>
-          </w:tcPr>
-          <w:p/>
-        </w:tc>
-        <w:tc>
-          <w:tcPr>
-            <w:tcW w:w="2648" w:type="dxa"/>
-          </w:tcPr>
-          <w:p>
-            <w:r>
-              <w:t>Used in ObjExpr.EmitConstants, ObjExpr.EmitStaticConstructorBody, ObjExpr.EmitConstantFieldInits, ObjExpr.EmitConstantFieldDefs</w:t>
-            </w:r>
-          </w:p>
-          <w:p/>
-          <w:p>
-            <w:r>
-              <w:t>Set by Compiler.RegisterConstant.</w:t>
-            </w:r>
-          </w:p>
-          <w:p>
-            <w:r>
-              <w:t>Compiler.RegisterConstant called by Compiler.RegisterVar, Compiler.RegisterKeyword, ConstantExpr constructor, NumberExpr constructor.</w:t>
-            </w:r>
-          </w:p>
-        </w:tc>
-      </w:tr>
-      <w:tr>
-        <w:tc>
-          <w:tcPr>
-            <w:tcW w:w="1643" w:type="dxa"/>
-          </w:tcPr>
-          <w:p>
-            <w:r>
-              <w:t>ConstantFields</w:t>
-            </w:r>
-          </w:p>
-        </w:tc>
-        <w:tc>
-          <w:tcPr>
-            <w:tcW w:w="1701" w:type="dxa"/>
-          </w:tcPr>
-          <w:p>
-            <w:r>
-              <w:t>Map from int (id of Constant) to FieldBuilder.</w:t>
-            </w:r>
-          </w:p>
-        </w:tc>
-        <w:tc>
-          <w:tcPr>
-            <w:tcW w:w="1720" w:type="dxa"/>
-          </w:tcPr>
-          <w:p/>
-        </w:tc>
-        <w:tc>
-          <w:tcPr>
-            <w:tcW w:w="1813" w:type="dxa"/>
-          </w:tcPr>
-          <w:p/>
-        </w:tc>
-        <w:tc>
-          <w:tcPr>
-            <w:tcW w:w="2648" w:type="dxa"/>
-          </w:tcPr>
-          <w:p/>
-        </w:tc>
-      </w:tr>
-    </w:tbl>
+    <w:p>
+      <w:pPr>
+        <w:pStyle w:val="ListParagraph"/>
+      </w:pPr>
+    </w:p>
+    <w:p>
+      <w:pPr>
+        <w:pStyle w:val="Heading3"/>
+      </w:pPr>
+      <w:r>
+        <w:lastRenderedPageBreak/>
+        <w:t>Callsites</w:t>
+      </w:r>
+    </w:p>
+    <w:p>
+      <w:pPr>
+        <w:pStyle w:val="ListParagraph"/>
+        <w:numPr>
+          <w:ilvl w:val="0"/>
+          <w:numId w:val="21"/>
+        </w:numPr>
+      </w:pPr>
+      <w:r>
+        <w:t>KeywordCallsites</w:t>
+      </w:r>
+    </w:p>
+    <w:p>
+      <w:pPr>
+        <w:pStyle w:val="ListParagraph"/>
+        <w:numPr>
+          <w:ilvl w:val="1"/>
+          <w:numId w:val="21"/>
+        </w:numPr>
+      </w:pPr>
+      <w:r>
+        <w:t>IPersistentVector of keywords (allows indexing)</w:t>
+      </w:r>
+    </w:p>
+    <w:p>
+      <w:pPr>
+        <w:pStyle w:val="ListParagraph"/>
+        <w:numPr>
+          <w:ilvl w:val="1"/>
+          <w:numId w:val="21"/>
+        </w:numPr>
+      </w:pPr>
+      <w:r>
+        <w:t>Values added by Compiler.RegisterKeywordCallsite, called by KeywordInvokeExpr constructor</w:t>
+      </w:r>
+    </w:p>
+    <w:p>
+      <w:pPr>
+        <w:pStyle w:val="ListParagraph"/>
+        <w:numPr>
+          <w:ilvl w:val="1"/>
+          <w:numId w:val="21"/>
+        </w:numPr>
+      </w:pPr>
+      <w:r>
+        <w:t>Used in ObjExpr.EmitKeywordCallsiteInits, EmitKeywordCallsiteDefs, EmitStaticConstructorBody</w:t>
+      </w:r>
+    </w:p>
+    <w:p>
+      <w:pPr>
+        <w:pStyle w:val="ListParagraph"/>
+        <w:numPr>
+          <w:ilvl w:val="0"/>
+          <w:numId w:val="21"/>
+        </w:numPr>
+      </w:pPr>
+      <w:r>
+        <w:t>KeywordLookupSiteFields</w:t>
+      </w:r>
+    </w:p>
+    <w:p>
+      <w:pPr>
+        <w:pStyle w:val="ListParagraph"/>
+        <w:numPr>
+          <w:ilvl w:val="1"/>
+          <w:numId w:val="21"/>
+        </w:numPr>
+      </w:pPr>
+      <w:r>
+        <w:t>List of FieldBuilders.</w:t>
+      </w:r>
+    </w:p>
+    <w:p>
+      <w:pPr>
+        <w:pStyle w:val="ListParagraph"/>
+        <w:numPr>
+          <w:ilvl w:val="1"/>
+          <w:numId w:val="21"/>
+        </w:numPr>
+      </w:pPr>
+      <w:r>
+        <w:t>Added to by ObjExpr.EmitKeywordCallsiteDefs</w:t>
+      </w:r>
+    </w:p>
+    <w:p>
+      <w:pPr>
+        <w:pStyle w:val="ListParagraph"/>
+        <w:numPr>
+          <w:ilvl w:val="1"/>
+          <w:numId w:val="21"/>
+        </w:numPr>
+      </w:pPr>
+      <w:r>
+        <w:t>Used by ObjExpr.EmitKeywordCallsiteDefs, ObjExpr.EmitKeywordCallsiteInits, KeywordInvokeExpr.Emit</w:t>
+      </w:r>
+    </w:p>
+    <w:p>
+      <w:pPr>
+        <w:pStyle w:val="ListParagraph"/>
+        <w:numPr>
+          <w:ilvl w:val="0"/>
+          <w:numId w:val="21"/>
+        </w:numPr>
+      </w:pPr>
+      <w:r>
+        <w:t>ProtocolCallsites</w:t>
+      </w:r>
+    </w:p>
+    <w:p>
+      <w:pPr>
+        <w:pStyle w:val="ListParagraph"/>
+        <w:numPr>
+          <w:ilvl w:val="1"/>
+          <w:numId w:val="21"/>
+        </w:numPr>
+      </w:pPr>
+      <w:r>
+        <w:t>IPersistentVector of Vars</w:t>
+      </w:r>
+    </w:p>
+    <w:p>
+      <w:pPr>
+        <w:pStyle w:val="ListParagraph"/>
+        <w:numPr>
+          <w:ilvl w:val="1"/>
+          <w:numId w:val="21"/>
+        </w:numPr>
+      </w:pPr>
+      <w:r>
+        <w:t>Added to by Compiler.RegisterVarCallsite</w:t>
+      </w:r>
+    </w:p>
+    <w:p>
+      <w:pPr>
+        <w:pStyle w:val="ListParagraph"/>
+        <w:numPr>
+          <w:ilvl w:val="1"/>
+          <w:numId w:val="21"/>
+        </w:numPr>
+      </w:pPr>
+      <w:r>
+        <w:t>Used by ObjeExpr.EmitProtocolCallsites to generate a FieldBuilder for each element, holding a Type.  Those FieldBuilders are stored in ObjExpr.CachedTypeFields</w:t>
+      </w:r>
+    </w:p>
+    <w:p>
+      <w:pPr>
+        <w:pStyle w:val="ListParagraph"/>
+        <w:numPr>
+          <w:ilvl w:val="0"/>
+          <w:numId w:val="21"/>
+        </w:numPr>
+      </w:pPr>
+      <w:r>
+        <w:t>CachedTypeFields</w:t>
+      </w:r>
+    </w:p>
+    <w:p>
+      <w:pPr>
+        <w:pStyle w:val="ListParagraph"/>
+        <w:numPr>
+          <w:ilvl w:val="1"/>
+          <w:numId w:val="21"/>
+        </w:numPr>
+      </w:pPr>
+      <w:r>
+        <w:t>Defined as mentioned above.</w:t>
+      </w:r>
+    </w:p>
+    <w:p>
+      <w:pPr>
+        <w:pStyle w:val="ListParagraph"/>
+        <w:numPr>
+          <w:ilvl w:val="1"/>
+          <w:numId w:val="21"/>
+        </w:numPr>
+      </w:pPr>
+      <w:r>
+        <w:t xml:space="preserve">Used in InvokeExpr.EmitProto, </w:t>
+      </w:r>
+    </w:p>
+    <w:p>
+      <w:pPr>
+        <w:pStyle w:val="ListParagraph"/>
+        <w:numPr>
+          <w:ilvl w:val="0"/>
+          <w:numId w:val="21"/>
+        </w:numPr>
+      </w:pPr>
+      <w:r>
+        <w:t>VarCallSites</w:t>
+      </w:r>
+    </w:p>
+    <w:p>
+      <w:pPr>
+        <w:pStyle w:val="ListParagraph"/>
+        <w:numPr>
+          <w:ilvl w:val="1"/>
+          <w:numId w:val="21"/>
+        </w:numPr>
+      </w:pPr>
+      <w:r>
+        <w:t>IPersistentVector of Vars</w:t>
+      </w:r>
+    </w:p>
+    <w:p>
+      <w:pPr>
+        <w:pStyle w:val="ListParagraph"/>
+        <w:numPr>
+          <w:ilvl w:val="1"/>
+          <w:numId w:val="21"/>
+        </w:numPr>
+      </w:pPr>
+      <w:r>
+        <w:t>Added to by Compiler.RegisterVarCallsite</w:t>
+      </w:r>
+    </w:p>
+    <w:p>
+      <w:pPr>
+        <w:pStyle w:val="ListParagraph"/>
+        <w:numPr>
+          <w:ilvl w:val="1"/>
+          <w:numId w:val="21"/>
+        </w:numPr>
+      </w:pPr>
+      <w:r>
+        <w:t>Does not appear to be used at this point.</w:t>
+      </w:r>
+    </w:p>
+    <w:p>
+      <w:pPr>
+        <w:pStyle w:val="ListParagraph"/>
+        <w:numPr>
+          <w:ilvl w:val="0"/>
+          <w:numId w:val="21"/>
+        </w:numPr>
+      </w:pPr>
+      <w:r>
+        <w:t>ThunkFields</w:t>
+      </w:r>
+    </w:p>
+    <w:p>
+      <w:pPr>
+        <w:pStyle w:val="ListParagraph"/>
+        <w:numPr>
+          <w:ilvl w:val="1"/>
+          <w:numId w:val="21"/>
+        </w:numPr>
+      </w:pPr>
+      <w:r>
+        <w:t>List of FieldBuilders</w:t>
+      </w:r>
+    </w:p>
+    <w:p>
+      <w:pPr>
+        <w:pStyle w:val="ListParagraph"/>
+        <w:numPr>
+          <w:ilvl w:val="1"/>
+          <w:numId w:val="21"/>
+        </w:numPr>
+      </w:pPr>
+      <w:r>
+        <w:t>Each fieldbuilder holds an ILookupThunk</w:t>
+      </w:r>
+    </w:p>
+    <w:p>
+      <w:pPr>
+        <w:pStyle w:val="ListParagraph"/>
+        <w:numPr>
+          <w:ilvl w:val="1"/>
+          <w:numId w:val="21"/>
+        </w:numPr>
+      </w:pPr>
+      <w:r>
+        <w:t>Populated by ObjExpr.EmitKeywordCallsiteDefs</w:t>
+      </w:r>
+    </w:p>
+    <w:p>
+      <w:pPr>
+        <w:pStyle w:val="ListParagraph"/>
+        <w:numPr>
+          <w:ilvl w:val="1"/>
+          <w:numId w:val="21"/>
+        </w:numPr>
+      </w:pPr>
+      <w:r>
+        <w:t>Used by ObjExpr.EmitKeywordCallsiteInits</w:t>
+      </w:r>
+    </w:p>
+    <w:p>
+      <w:pPr>
+        <w:pStyle w:val="ListParagraph"/>
+        <w:numPr>
+          <w:ilvl w:val="1"/>
+          <w:numId w:val="21"/>
+        </w:numPr>
+      </w:pPr>
+      <w:r>
+        <w:t>Used also by KeywordInvokeExpr.Emit</w:t>
+      </w:r>
+    </w:p>
+    <w:p>
+      <w:pPr>
+        <w:pStyle w:val="ListParagraph"/>
+        <w:numPr>
+          <w:ilvl w:val="1"/>
+          <w:numId w:val="21"/>
+        </w:numPr>
+      </w:pPr>
+      <w:r>
+        <w:t>Each field in use holds an ILookupThunk of type KeywordLookupSite</w:t>
+      </w:r>
+    </w:p>
+    <w:p>
+      <w:pPr>
+        <w:pStyle w:val="Heading3"/>
+      </w:pPr>
+      <w:r>
+        <w:t>NewInstanceExpr extras</w:t>
+      </w:r>
+    </w:p>
+    <w:p>
+      <w:pPr>
+        <w:pStyle w:val="ListParagraph"/>
+        <w:numPr>
+          <w:ilvl w:val="0"/>
+          <w:numId w:val="22"/>
+        </w:numPr>
+      </w:pPr>
+      <w:r>
+        <w:t>AltCtorDrops</w:t>
+      </w:r>
+    </w:p>
+    <w:p>
+      <w:pPr>
+        <w:pStyle w:val="ListParagraph"/>
+        <w:numPr>
+          <w:ilvl w:val="1"/>
+          <w:numId w:val="22"/>
+        </w:numPr>
+      </w:pPr>
+      <w:r>
+        <w:t>An int, counts the number of special fields</w:t>
+      </w:r>
+      <w:r>
+        <w:t xml:space="preserve"> needed for the constructor</w:t>
+      </w:r>
+    </w:p>
+    <w:p>
+      <w:pPr>
+        <w:pStyle w:val="ListParagraph"/>
+        <w:numPr>
+          <w:ilvl w:val="1"/>
+          <w:numId w:val="22"/>
+        </w:numPr>
+      </w:pPr>
+      <w:r>
+        <w:t>The special fields are __meta, __extMap, __hash, __hasheq.</w:t>
+      </w:r>
+    </w:p>
+    <w:p>
+      <w:pPr>
+        <w:pStyle w:val="ListParagraph"/>
+        <w:numPr>
+          <w:ilvl w:val="0"/>
+          <w:numId w:val="22"/>
+        </w:numPr>
+      </w:pPr>
+      <w:r>
+        <w:t>HintedFields</w:t>
+      </w:r>
+    </w:p>
+    <w:p>
+      <w:pPr>
+        <w:pStyle w:val="ListParagraph"/>
+        <w:numPr>
+          <w:ilvl w:val="1"/>
+          <w:numId w:val="22"/>
+        </w:numPr>
+      </w:pPr>
+      <w:r>
+        <w:t>Whichever special fields are being defined</w:t>
+      </w:r>
+    </w:p>
+    <w:p>
+      <w:pPr>
+        <w:pStyle w:val="ListParagraph"/>
+        <w:numPr>
+          <w:ilvl w:val="1"/>
+          <w:numId w:val="22"/>
+        </w:numPr>
+      </w:pPr>
+      <w:r>
+        <w:t>A lot of special casing for constructor generation and the like regarding these</w:t>
+      </w:r>
+    </w:p>
     <w:p/>
+    <w:p>
+      <w:pPr>
+        <w:pStyle w:val="Heading2"/>
+      </w:pPr>
+      <w:r>
+        <w:lastRenderedPageBreak/>
+        <w:t>FnExpr</w:t>
+      </w:r>
+    </w:p>
+    <w:p>
+      <w:pPr>
+        <w:pStyle w:val="ListParagraph"/>
+        <w:numPr>
+          <w:ilvl w:val="0"/>
+          <w:numId w:val="23"/>
+        </w:numPr>
+      </w:pPr>
+      <w:r>
+        <w:t>_variadicMethod</w:t>
+      </w:r>
+    </w:p>
+    <w:p>
+      <w:pPr>
+        <w:pStyle w:val="ListParagraph"/>
+        <w:numPr>
+          <w:ilvl w:val="0"/>
+          <w:numId w:val="23"/>
+        </w:numPr>
+      </w:pPr>
+      <w:r>
+        <w:t>VaridiadicMethod</w:t>
+      </w:r>
+    </w:p>
+    <w:p>
+      <w:pPr>
+        <w:pStyle w:val="ListParagraph"/>
+        <w:numPr>
+          <w:ilvl w:val="0"/>
+          <w:numId w:val="23"/>
+        </w:numPr>
+      </w:pPr>
+      <w:r>
+        <w:t>IsVariadic</w:t>
+      </w:r>
+    </w:p>
+    <w:p>
+      <w:pPr>
+        <w:pStyle w:val="ListParagraph"/>
+        <w:numPr>
+          <w:ilvl w:val="1"/>
+          <w:numId w:val="23"/>
+        </w:numPr>
+      </w:pPr>
+      <w:r>
+        <w:t>Holds the variadic method definition, if  there is one</w:t>
+      </w:r>
+    </w:p>
+    <w:p>
+      <w:pPr>
+        <w:pStyle w:val="ListParagraph"/>
+        <w:numPr>
+          <w:ilvl w:val="1"/>
+          <w:numId w:val="23"/>
+        </w:numPr>
+      </w:pPr>
+      <w:r>
+        <w:t>Special code gen for this method</w:t>
+      </w:r>
+    </w:p>
+    <w:p>
+      <w:pPr>
+        <w:pStyle w:val="ListParagraph"/>
+        <w:numPr>
+          <w:ilvl w:val="0"/>
+          <w:numId w:val="23"/>
+        </w:numPr>
+      </w:pPr>
+      <w:r>
+        <w:t>_hasMeta</w:t>
+      </w:r>
+    </w:p>
+    <w:p>
+      <w:pPr>
+        <w:pStyle w:val="ListParagraph"/>
+        <w:numPr>
+          <w:ilvl w:val="0"/>
+          <w:numId w:val="23"/>
+        </w:numPr>
+      </w:pPr>
+      <w:r>
+        <w:t>SupportsMeta</w:t>
+      </w:r>
+    </w:p>
+    <w:p>
+      <w:pPr>
+        <w:pStyle w:val="ListParagraph"/>
+        <w:numPr>
+          <w:ilvl w:val="1"/>
+          <w:numId w:val="23"/>
+        </w:numPr>
+      </w:pPr>
+      <w:r>
+        <w:t>True if there is metadata on the form defining the function after deleting source location info</w:t>
+      </w:r>
+    </w:p>
+    <w:p>
+      <w:pPr>
+        <w:pStyle w:val="ListParagraph"/>
+        <w:numPr>
+          <w:ilvl w:val="0"/>
+          <w:numId w:val="23"/>
+        </w:numPr>
+      </w:pPr>
+      <w:r>
+        <w:t>_hasEnclosingMethod</w:t>
+      </w:r>
+    </w:p>
+    <w:p>
+      <w:pPr>
+        <w:pStyle w:val="ListParagraph"/>
+        <w:numPr>
+          <w:ilvl w:val="1"/>
+          <w:numId w:val="23"/>
+        </w:numPr>
+      </w:pPr>
+      <w:r>
+        <w:t>True if there is an enclosing method.</w:t>
+      </w:r>
+    </w:p>
+    <w:p>
+      <w:pPr>
+        <w:pStyle w:val="ListParagraph"/>
+        <w:numPr>
+          <w:ilvl w:val="1"/>
+          <w:numId w:val="23"/>
+        </w:numPr>
+      </w:pPr>
+      <w:r>
+        <w:t>Used to determine if CanBeDirect.</w:t>
+      </w:r>
+    </w:p>
+    <w:p>
+      <w:pPr>
+        <w:pStyle w:val="ListParagraph"/>
+        <w:numPr>
+          <w:ilvl w:val="0"/>
+          <w:numId w:val="23"/>
+        </w:numPr>
+      </w:pPr>
+      <w:r>
+        <w:t>_dynMethodMapKey</w:t>
+      </w:r>
+    </w:p>
+    <w:p>
+      <w:pPr>
+        <w:pStyle w:val="ListParagraph"/>
+        <w:numPr>
+          <w:ilvl w:val="0"/>
+          <w:numId w:val="23"/>
+        </w:numPr>
+      </w:pPr>
+      <w:r>
+        <w:t>DynMethodMapKey</w:t>
+      </w:r>
+    </w:p>
+    <w:p>
+      <w:pPr>
+        <w:pStyle w:val="ListParagraph"/>
+        <w:numPr>
+          <w:ilvl w:val="1"/>
+          <w:numId w:val="23"/>
+        </w:numPr>
+      </w:pPr>
+      <w:r>
+        <w:t>Int  -- RT.nextID()</w:t>
+      </w:r>
+    </w:p>
+    <w:p>
+      <w:pPr>
+        <w:pStyle w:val="ListParagraph"/>
+        <w:numPr>
+          <w:ilvl w:val="1"/>
+          <w:numId w:val="23"/>
+        </w:numPr>
+      </w:pPr>
+      <w:r>
+        <w:t>Doesn’t appear to be used.</w:t>
+      </w:r>
+    </w:p>
+    <w:p>
+      <w:pPr>
+        <w:pStyle w:val="ListParagraph"/>
+        <w:numPr>
+          <w:ilvl w:val="0"/>
+          <w:numId w:val="23"/>
+        </w:numPr>
+      </w:pPr>
+      <w:r>
+        <w:t>_cachedType</w:t>
+      </w:r>
+    </w:p>
+    <w:p>
+      <w:pPr>
+        <w:pStyle w:val="ListParagraph"/>
+        <w:numPr>
+          <w:ilvl w:val="1"/>
+          <w:numId w:val="23"/>
+        </w:numPr>
+      </w:pPr>
+      <w:r>
+        <w:t>Used in FnExpr.ClrType – also set there</w:t>
+      </w:r>
+    </w:p>
+    <w:p>
+      <w:pPr>
+        <w:pStyle w:val="ListParagraph"/>
+        <w:numPr>
+          <w:ilvl w:val="1"/>
+          <w:numId w:val="23"/>
+        </w:numPr>
+      </w:pPr>
+      <w:r>
+        <w:t>Set to other _tag if it is a type or AFunction</w:t>
+      </w:r>
+    </w:p>
+    <w:p>
+      <w:pPr>
+        <w:pStyle w:val="Heading3"/>
+      </w:pPr>
+      <w:r>
+        <w:t>NewInstanceExpr</w:t>
+      </w:r>
+    </w:p>
+    <w:p>
+      <w:pPr>
+        <w:pStyle w:val="ListParagraph"/>
+        <w:numPr>
+          <w:ilvl w:val="0"/>
+          <w:numId w:val="24"/>
+        </w:numPr>
+      </w:pPr>
+      <w:r>
+        <w:t>_methodMap</w:t>
+      </w:r>
+    </w:p>
+    <w:p>
+      <w:pPr>
+        <w:pStyle w:val="ListParagraph"/>
+        <w:numPr>
+          <w:ilvl w:val="0"/>
+          <w:numId w:val="24"/>
+        </w:numPr>
+      </w:pPr>
+      <w:r>
+        <w:t>MethodMap</w:t>
+      </w:r>
+    </w:p>
+    <w:p>
+      <w:pPr>
+        <w:pStyle w:val="ListParagraph"/>
+        <w:numPr>
+          <w:ilvl w:val="1"/>
+          <w:numId w:val="24"/>
+        </w:numPr>
+      </w:pPr>
+      <w:r>
+        <w:t>Contains the ‘overrideable` methods</w:t>
+      </w:r>
+    </w:p>
+    <w:p>
+      <w:pPr>
+        <w:pStyle w:val="ListParagraph"/>
+        <w:numPr>
+          <w:ilvl w:val="1"/>
+          <w:numId w:val="24"/>
+        </w:numPr>
+      </w:pPr>
+      <w:r>
+        <w:t>Overrideable if public or protected, not static, not final</w:t>
+      </w:r>
+    </w:p>
+    <w:p>
+      <w:pPr>
+        <w:pStyle w:val="ListParagraph"/>
+        <w:numPr>
+          <w:ilvl w:val="1"/>
+          <w:numId w:val="24"/>
+        </w:numPr>
+      </w:pPr>
+      <w:r>
+        <w:t>Used to determine if we need to emit a dummy method</w:t>
+      </w:r>
+    </w:p>
     <w:p/>
     <w:sectPr>
       <w:pgSz w:w="12240" w:h="15840"/>
@@ -12646,6 +14374,232 @@
     </w:lvl>
   </w:abstractNum>
   <w:abstractNum w:abstractNumId="3" w15:restartNumberingAfterBreak="0">
+    <w:nsid w:val="0E5201C3"/>
+    <w:multiLevelType w:val="hybridMultilevel"/>
+    <w:tmpl w:val="88C6BEC8"/>
+    <w:lvl w:ilvl="0" w:tplc="04090001">
+      <w:start w:val="1"/>
+      <w:numFmt w:val="bullet"/>
+      <w:lvlText w:val=""/>
+      <w:lvlJc w:val="left"/>
+      <w:pPr>
+        <w:ind w:left="720" w:hanging="360"/>
+      </w:pPr>
+      <w:rPr>
+        <w:rFonts w:ascii="Symbol" w:hAnsi="Symbol" w:hint="default"/>
+      </w:rPr>
+    </w:lvl>
+    <w:lvl w:ilvl="1" w:tplc="04090003">
+      <w:start w:val="1"/>
+      <w:numFmt w:val="bullet"/>
+      <w:lvlText w:val="o"/>
+      <w:lvlJc w:val="left"/>
+      <w:pPr>
+        <w:ind w:left="1440" w:hanging="360"/>
+      </w:pPr>
+      <w:rPr>
+        <w:rFonts w:ascii="Courier New" w:hAnsi="Courier New" w:cs="Courier New" w:hint="default"/>
+      </w:rPr>
+    </w:lvl>
+    <w:lvl w:ilvl="2" w:tplc="04090005" w:tentative="1">
+      <w:start w:val="1"/>
+      <w:numFmt w:val="bullet"/>
+      <w:lvlText w:val=""/>
+      <w:lvlJc w:val="left"/>
+      <w:pPr>
+        <w:ind w:left="2160" w:hanging="360"/>
+      </w:pPr>
+      <w:rPr>
+        <w:rFonts w:ascii="Wingdings" w:hAnsi="Wingdings" w:hint="default"/>
+      </w:rPr>
+    </w:lvl>
+    <w:lvl w:ilvl="3" w:tplc="04090001" w:tentative="1">
+      <w:start w:val="1"/>
+      <w:numFmt w:val="bullet"/>
+      <w:lvlText w:val=""/>
+      <w:lvlJc w:val="left"/>
+      <w:pPr>
+        <w:ind w:left="2880" w:hanging="360"/>
+      </w:pPr>
+      <w:rPr>
+        <w:rFonts w:ascii="Symbol" w:hAnsi="Symbol" w:hint="default"/>
+      </w:rPr>
+    </w:lvl>
+    <w:lvl w:ilvl="4" w:tplc="04090003" w:tentative="1">
+      <w:start w:val="1"/>
+      <w:numFmt w:val="bullet"/>
+      <w:lvlText w:val="o"/>
+      <w:lvlJc w:val="left"/>
+      <w:pPr>
+        <w:ind w:left="3600" w:hanging="360"/>
+      </w:pPr>
+      <w:rPr>
+        <w:rFonts w:ascii="Courier New" w:hAnsi="Courier New" w:cs="Courier New" w:hint="default"/>
+      </w:rPr>
+    </w:lvl>
+    <w:lvl w:ilvl="5" w:tplc="04090005" w:tentative="1">
+      <w:start w:val="1"/>
+      <w:numFmt w:val="bullet"/>
+      <w:lvlText w:val=""/>
+      <w:lvlJc w:val="left"/>
+      <w:pPr>
+        <w:ind w:left="4320" w:hanging="360"/>
+      </w:pPr>
+      <w:rPr>
+        <w:rFonts w:ascii="Wingdings" w:hAnsi="Wingdings" w:hint="default"/>
+      </w:rPr>
+    </w:lvl>
+    <w:lvl w:ilvl="6" w:tplc="04090001" w:tentative="1">
+      <w:start w:val="1"/>
+      <w:numFmt w:val="bullet"/>
+      <w:lvlText w:val=""/>
+      <w:lvlJc w:val="left"/>
+      <w:pPr>
+        <w:ind w:left="5040" w:hanging="360"/>
+      </w:pPr>
+      <w:rPr>
+        <w:rFonts w:ascii="Symbol" w:hAnsi="Symbol" w:hint="default"/>
+      </w:rPr>
+    </w:lvl>
+    <w:lvl w:ilvl="7" w:tplc="04090003" w:tentative="1">
+      <w:start w:val="1"/>
+      <w:numFmt w:val="bullet"/>
+      <w:lvlText w:val="o"/>
+      <w:lvlJc w:val="left"/>
+      <w:pPr>
+        <w:ind w:left="5760" w:hanging="360"/>
+      </w:pPr>
+      <w:rPr>
+        <w:rFonts w:ascii="Courier New" w:hAnsi="Courier New" w:cs="Courier New" w:hint="default"/>
+      </w:rPr>
+    </w:lvl>
+    <w:lvl w:ilvl="8" w:tplc="04090005" w:tentative="1">
+      <w:start w:val="1"/>
+      <w:numFmt w:val="bullet"/>
+      <w:lvlText w:val=""/>
+      <w:lvlJc w:val="left"/>
+      <w:pPr>
+        <w:ind w:left="6480" w:hanging="360"/>
+      </w:pPr>
+      <w:rPr>
+        <w:rFonts w:ascii="Wingdings" w:hAnsi="Wingdings" w:hint="default"/>
+      </w:rPr>
+    </w:lvl>
+  </w:abstractNum>
+  <w:abstractNum w:abstractNumId="4" w15:restartNumberingAfterBreak="0">
+    <w:nsid w:val="23BB6632"/>
+    <w:multiLevelType w:val="hybridMultilevel"/>
+    <w:tmpl w:val="BC2ECE38"/>
+    <w:lvl w:ilvl="0" w:tplc="04090001">
+      <w:start w:val="1"/>
+      <w:numFmt w:val="bullet"/>
+      <w:lvlText w:val=""/>
+      <w:lvlJc w:val="left"/>
+      <w:pPr>
+        <w:ind w:left="720" w:hanging="360"/>
+      </w:pPr>
+      <w:rPr>
+        <w:rFonts w:ascii="Symbol" w:hAnsi="Symbol" w:hint="default"/>
+      </w:rPr>
+    </w:lvl>
+    <w:lvl w:ilvl="1" w:tplc="04090003">
+      <w:start w:val="1"/>
+      <w:numFmt w:val="bullet"/>
+      <w:lvlText w:val="o"/>
+      <w:lvlJc w:val="left"/>
+      <w:pPr>
+        <w:ind w:left="1440" w:hanging="360"/>
+      </w:pPr>
+      <w:rPr>
+        <w:rFonts w:ascii="Courier New" w:hAnsi="Courier New" w:cs="Courier New" w:hint="default"/>
+      </w:rPr>
+    </w:lvl>
+    <w:lvl w:ilvl="2" w:tplc="04090005" w:tentative="1">
+      <w:start w:val="1"/>
+      <w:numFmt w:val="bullet"/>
+      <w:lvlText w:val=""/>
+      <w:lvlJc w:val="left"/>
+      <w:pPr>
+        <w:ind w:left="2160" w:hanging="360"/>
+      </w:pPr>
+      <w:rPr>
+        <w:rFonts w:ascii="Wingdings" w:hAnsi="Wingdings" w:hint="default"/>
+      </w:rPr>
+    </w:lvl>
+    <w:lvl w:ilvl="3" w:tplc="04090001" w:tentative="1">
+      <w:start w:val="1"/>
+      <w:numFmt w:val="bullet"/>
+      <w:lvlText w:val=""/>
+      <w:lvlJc w:val="left"/>
+      <w:pPr>
+        <w:ind w:left="2880" w:hanging="360"/>
+      </w:pPr>
+      <w:rPr>
+        <w:rFonts w:ascii="Symbol" w:hAnsi="Symbol" w:hint="default"/>
+      </w:rPr>
+    </w:lvl>
+    <w:lvl w:ilvl="4" w:tplc="04090003" w:tentative="1">
+      <w:start w:val="1"/>
+      <w:numFmt w:val="bullet"/>
+      <w:lvlText w:val="o"/>
+      <w:lvlJc w:val="left"/>
+      <w:pPr>
+        <w:ind w:left="3600" w:hanging="360"/>
+      </w:pPr>
+      <w:rPr>
+        <w:rFonts w:ascii="Courier New" w:hAnsi="Courier New" w:cs="Courier New" w:hint="default"/>
+      </w:rPr>
+    </w:lvl>
+    <w:lvl w:ilvl="5" w:tplc="04090005" w:tentative="1">
+      <w:start w:val="1"/>
+      <w:numFmt w:val="bullet"/>
+      <w:lvlText w:val=""/>
+      <w:lvlJc w:val="left"/>
+      <w:pPr>
+        <w:ind w:left="4320" w:hanging="360"/>
+      </w:pPr>
+      <w:rPr>
+        <w:rFonts w:ascii="Wingdings" w:hAnsi="Wingdings" w:hint="default"/>
+      </w:rPr>
+    </w:lvl>
+    <w:lvl w:ilvl="6" w:tplc="04090001" w:tentative="1">
+      <w:start w:val="1"/>
+      <w:numFmt w:val="bullet"/>
+      <w:lvlText w:val=""/>
+      <w:lvlJc w:val="left"/>
+      <w:pPr>
+        <w:ind w:left="5040" w:hanging="360"/>
+      </w:pPr>
+      <w:rPr>
+        <w:rFonts w:ascii="Symbol" w:hAnsi="Symbol" w:hint="default"/>
+      </w:rPr>
+    </w:lvl>
+    <w:lvl w:ilvl="7" w:tplc="04090003" w:tentative="1">
+      <w:start w:val="1"/>
+      <w:numFmt w:val="bullet"/>
+      <w:lvlText w:val="o"/>
+      <w:lvlJc w:val="left"/>
+      <w:pPr>
+        <w:ind w:left="5760" w:hanging="360"/>
+      </w:pPr>
+      <w:rPr>
+        <w:rFonts w:ascii="Courier New" w:hAnsi="Courier New" w:cs="Courier New" w:hint="default"/>
+      </w:rPr>
+    </w:lvl>
+    <w:lvl w:ilvl="8" w:tplc="04090005" w:tentative="1">
+      <w:start w:val="1"/>
+      <w:numFmt w:val="bullet"/>
+      <w:lvlText w:val=""/>
+      <w:lvlJc w:val="left"/>
+      <w:pPr>
+        <w:ind w:left="6480" w:hanging="360"/>
+      </w:pPr>
+      <w:rPr>
+        <w:rFonts w:ascii="Wingdings" w:hAnsi="Wingdings" w:hint="default"/>
+      </w:rPr>
+    </w:lvl>
+  </w:abstractNum>
+  <w:abstractNum w:abstractNumId="5" w15:restartNumberingAfterBreak="0">
     <w:nsid w:val="24E80E9D"/>
     <w:multiLevelType w:val="hybridMultilevel"/>
     <w:tmpl w:val="C38A2F28"/>
@@ -12758,7 +14712,233 @@
       </w:rPr>
     </w:lvl>
   </w:abstractNum>
-  <w:abstractNum w:abstractNumId="4" w15:restartNumberingAfterBreak="0">
+  <w:abstractNum w:abstractNumId="6" w15:restartNumberingAfterBreak="0">
+    <w:nsid w:val="252E0154"/>
+    <w:multiLevelType w:val="hybridMultilevel"/>
+    <w:tmpl w:val="563A55AE"/>
+    <w:lvl w:ilvl="0" w:tplc="04090001">
+      <w:start w:val="1"/>
+      <w:numFmt w:val="bullet"/>
+      <w:lvlText w:val=""/>
+      <w:lvlJc w:val="left"/>
+      <w:pPr>
+        <w:ind w:left="720" w:hanging="360"/>
+      </w:pPr>
+      <w:rPr>
+        <w:rFonts w:ascii="Symbol" w:hAnsi="Symbol" w:hint="default"/>
+      </w:rPr>
+    </w:lvl>
+    <w:lvl w:ilvl="1" w:tplc="04090003">
+      <w:start w:val="1"/>
+      <w:numFmt w:val="bullet"/>
+      <w:lvlText w:val="o"/>
+      <w:lvlJc w:val="left"/>
+      <w:pPr>
+        <w:ind w:left="1440" w:hanging="360"/>
+      </w:pPr>
+      <w:rPr>
+        <w:rFonts w:ascii="Courier New" w:hAnsi="Courier New" w:cs="Courier New" w:hint="default"/>
+      </w:rPr>
+    </w:lvl>
+    <w:lvl w:ilvl="2" w:tplc="04090005" w:tentative="1">
+      <w:start w:val="1"/>
+      <w:numFmt w:val="bullet"/>
+      <w:lvlText w:val=""/>
+      <w:lvlJc w:val="left"/>
+      <w:pPr>
+        <w:ind w:left="2160" w:hanging="360"/>
+      </w:pPr>
+      <w:rPr>
+        <w:rFonts w:ascii="Wingdings" w:hAnsi="Wingdings" w:hint="default"/>
+      </w:rPr>
+    </w:lvl>
+    <w:lvl w:ilvl="3" w:tplc="04090001" w:tentative="1">
+      <w:start w:val="1"/>
+      <w:numFmt w:val="bullet"/>
+      <w:lvlText w:val=""/>
+      <w:lvlJc w:val="left"/>
+      <w:pPr>
+        <w:ind w:left="2880" w:hanging="360"/>
+      </w:pPr>
+      <w:rPr>
+        <w:rFonts w:ascii="Symbol" w:hAnsi="Symbol" w:hint="default"/>
+      </w:rPr>
+    </w:lvl>
+    <w:lvl w:ilvl="4" w:tplc="04090003" w:tentative="1">
+      <w:start w:val="1"/>
+      <w:numFmt w:val="bullet"/>
+      <w:lvlText w:val="o"/>
+      <w:lvlJc w:val="left"/>
+      <w:pPr>
+        <w:ind w:left="3600" w:hanging="360"/>
+      </w:pPr>
+      <w:rPr>
+        <w:rFonts w:ascii="Courier New" w:hAnsi="Courier New" w:cs="Courier New" w:hint="default"/>
+      </w:rPr>
+    </w:lvl>
+    <w:lvl w:ilvl="5" w:tplc="04090005" w:tentative="1">
+      <w:start w:val="1"/>
+      <w:numFmt w:val="bullet"/>
+      <w:lvlText w:val=""/>
+      <w:lvlJc w:val="left"/>
+      <w:pPr>
+        <w:ind w:left="4320" w:hanging="360"/>
+      </w:pPr>
+      <w:rPr>
+        <w:rFonts w:ascii="Wingdings" w:hAnsi="Wingdings" w:hint="default"/>
+      </w:rPr>
+    </w:lvl>
+    <w:lvl w:ilvl="6" w:tplc="04090001" w:tentative="1">
+      <w:start w:val="1"/>
+      <w:numFmt w:val="bullet"/>
+      <w:lvlText w:val=""/>
+      <w:lvlJc w:val="left"/>
+      <w:pPr>
+        <w:ind w:left="5040" w:hanging="360"/>
+      </w:pPr>
+      <w:rPr>
+        <w:rFonts w:ascii="Symbol" w:hAnsi="Symbol" w:hint="default"/>
+      </w:rPr>
+    </w:lvl>
+    <w:lvl w:ilvl="7" w:tplc="04090003" w:tentative="1">
+      <w:start w:val="1"/>
+      <w:numFmt w:val="bullet"/>
+      <w:lvlText w:val="o"/>
+      <w:lvlJc w:val="left"/>
+      <w:pPr>
+        <w:ind w:left="5760" w:hanging="360"/>
+      </w:pPr>
+      <w:rPr>
+        <w:rFonts w:ascii="Courier New" w:hAnsi="Courier New" w:cs="Courier New" w:hint="default"/>
+      </w:rPr>
+    </w:lvl>
+    <w:lvl w:ilvl="8" w:tplc="04090005" w:tentative="1">
+      <w:start w:val="1"/>
+      <w:numFmt w:val="bullet"/>
+      <w:lvlText w:val=""/>
+      <w:lvlJc w:val="left"/>
+      <w:pPr>
+        <w:ind w:left="6480" w:hanging="360"/>
+      </w:pPr>
+      <w:rPr>
+        <w:rFonts w:ascii="Wingdings" w:hAnsi="Wingdings" w:hint="default"/>
+      </w:rPr>
+    </w:lvl>
+  </w:abstractNum>
+  <w:abstractNum w:abstractNumId="7" w15:restartNumberingAfterBreak="0">
+    <w:nsid w:val="29042A17"/>
+    <w:multiLevelType w:val="hybridMultilevel"/>
+    <w:tmpl w:val="F796E1B4"/>
+    <w:lvl w:ilvl="0" w:tplc="04090001">
+      <w:start w:val="1"/>
+      <w:numFmt w:val="bullet"/>
+      <w:lvlText w:val=""/>
+      <w:lvlJc w:val="left"/>
+      <w:pPr>
+        <w:ind w:left="720" w:hanging="360"/>
+      </w:pPr>
+      <w:rPr>
+        <w:rFonts w:ascii="Symbol" w:hAnsi="Symbol" w:hint="default"/>
+      </w:rPr>
+    </w:lvl>
+    <w:lvl w:ilvl="1" w:tplc="04090003" w:tentative="1">
+      <w:start w:val="1"/>
+      <w:numFmt w:val="bullet"/>
+      <w:lvlText w:val="o"/>
+      <w:lvlJc w:val="left"/>
+      <w:pPr>
+        <w:ind w:left="1440" w:hanging="360"/>
+      </w:pPr>
+      <w:rPr>
+        <w:rFonts w:ascii="Courier New" w:hAnsi="Courier New" w:cs="Courier New" w:hint="default"/>
+      </w:rPr>
+    </w:lvl>
+    <w:lvl w:ilvl="2" w:tplc="04090005" w:tentative="1">
+      <w:start w:val="1"/>
+      <w:numFmt w:val="bullet"/>
+      <w:lvlText w:val=""/>
+      <w:lvlJc w:val="left"/>
+      <w:pPr>
+        <w:ind w:left="2160" w:hanging="360"/>
+      </w:pPr>
+      <w:rPr>
+        <w:rFonts w:ascii="Wingdings" w:hAnsi="Wingdings" w:hint="default"/>
+      </w:rPr>
+    </w:lvl>
+    <w:lvl w:ilvl="3" w:tplc="04090001" w:tentative="1">
+      <w:start w:val="1"/>
+      <w:numFmt w:val="bullet"/>
+      <w:lvlText w:val=""/>
+      <w:lvlJc w:val="left"/>
+      <w:pPr>
+        <w:ind w:left="2880" w:hanging="360"/>
+      </w:pPr>
+      <w:rPr>
+        <w:rFonts w:ascii="Symbol" w:hAnsi="Symbol" w:hint="default"/>
+      </w:rPr>
+    </w:lvl>
+    <w:lvl w:ilvl="4" w:tplc="04090003" w:tentative="1">
+      <w:start w:val="1"/>
+      <w:numFmt w:val="bullet"/>
+      <w:lvlText w:val="o"/>
+      <w:lvlJc w:val="left"/>
+      <w:pPr>
+        <w:ind w:left="3600" w:hanging="360"/>
+      </w:pPr>
+      <w:rPr>
+        <w:rFonts w:ascii="Courier New" w:hAnsi="Courier New" w:cs="Courier New" w:hint="default"/>
+      </w:rPr>
+    </w:lvl>
+    <w:lvl w:ilvl="5" w:tplc="04090005" w:tentative="1">
+      <w:start w:val="1"/>
+      <w:numFmt w:val="bullet"/>
+      <w:lvlText w:val=""/>
+      <w:lvlJc w:val="left"/>
+      <w:pPr>
+        <w:ind w:left="4320" w:hanging="360"/>
+      </w:pPr>
+      <w:rPr>
+        <w:rFonts w:ascii="Wingdings" w:hAnsi="Wingdings" w:hint="default"/>
+      </w:rPr>
+    </w:lvl>
+    <w:lvl w:ilvl="6" w:tplc="04090001" w:tentative="1">
+      <w:start w:val="1"/>
+      <w:numFmt w:val="bullet"/>
+      <w:lvlText w:val=""/>
+      <w:lvlJc w:val="left"/>
+      <w:pPr>
+        <w:ind w:left="5040" w:hanging="360"/>
+      </w:pPr>
+      <w:rPr>
+        <w:rFonts w:ascii="Symbol" w:hAnsi="Symbol" w:hint="default"/>
+      </w:rPr>
+    </w:lvl>
+    <w:lvl w:ilvl="7" w:tplc="04090003" w:tentative="1">
+      <w:start w:val="1"/>
+      <w:numFmt w:val="bullet"/>
+      <w:lvlText w:val="o"/>
+      <w:lvlJc w:val="left"/>
+      <w:pPr>
+        <w:ind w:left="5760" w:hanging="360"/>
+      </w:pPr>
+      <w:rPr>
+        <w:rFonts w:ascii="Courier New" w:hAnsi="Courier New" w:cs="Courier New" w:hint="default"/>
+      </w:rPr>
+    </w:lvl>
+    <w:lvl w:ilvl="8" w:tplc="04090005" w:tentative="1">
+      <w:start w:val="1"/>
+      <w:numFmt w:val="bullet"/>
+      <w:lvlText w:val=""/>
+      <w:lvlJc w:val="left"/>
+      <w:pPr>
+        <w:ind w:left="6480" w:hanging="360"/>
+      </w:pPr>
+      <w:rPr>
+        <w:rFonts w:ascii="Wingdings" w:hAnsi="Wingdings" w:hint="default"/>
+      </w:rPr>
+    </w:lvl>
+  </w:abstractNum>
+  <w:abstractNum w:abstractNumId="8" w15:restartNumberingAfterBreak="0">
     <w:nsid w:val="2FA16066"/>
     <w:multiLevelType w:val="hybridMultilevel"/>
     <w:tmpl w:val="F796C080"/>
@@ -12871,7 +15051,7 @@
       </w:rPr>
     </w:lvl>
   </w:abstractNum>
-  <w:abstractNum w:abstractNumId="5" w15:restartNumberingAfterBreak="0">
+  <w:abstractNum w:abstractNumId="9" w15:restartNumberingAfterBreak="0">
     <w:nsid w:val="353F63CD"/>
     <w:multiLevelType w:val="hybridMultilevel"/>
     <w:tmpl w:val="1C1E0D04"/>
@@ -12984,7 +15164,7 @@
       </w:rPr>
     </w:lvl>
   </w:abstractNum>
-  <w:abstractNum w:abstractNumId="6" w15:restartNumberingAfterBreak="0">
+  <w:abstractNum w:abstractNumId="10" w15:restartNumberingAfterBreak="0">
     <w:nsid w:val="35B108B1"/>
     <w:multiLevelType w:val="hybridMultilevel"/>
     <w:tmpl w:val="5E00A124"/>
@@ -13097,7 +15277,7 @@
       </w:rPr>
     </w:lvl>
   </w:abstractNum>
-  <w:abstractNum w:abstractNumId="7" w15:restartNumberingAfterBreak="0">
+  <w:abstractNum w:abstractNumId="11" w15:restartNumberingAfterBreak="0">
     <w:nsid w:val="36F21C1E"/>
     <w:multiLevelType w:val="hybridMultilevel"/>
     <w:tmpl w:val="B07E6080"/>
@@ -13210,7 +15390,7 @@
       </w:rPr>
     </w:lvl>
   </w:abstractNum>
-  <w:abstractNum w:abstractNumId="8" w15:restartNumberingAfterBreak="0">
+  <w:abstractNum w:abstractNumId="12" w15:restartNumberingAfterBreak="0">
     <w:nsid w:val="372724FD"/>
     <w:multiLevelType w:val="hybridMultilevel"/>
     <w:tmpl w:val="6828201C"/>
@@ -13323,7 +15503,7 @@
       </w:rPr>
     </w:lvl>
   </w:abstractNum>
-  <w:abstractNum w:abstractNumId="9" w15:restartNumberingAfterBreak="0">
+  <w:abstractNum w:abstractNumId="13" w15:restartNumberingAfterBreak="0">
     <w:nsid w:val="38D924D1"/>
     <w:multiLevelType w:val="hybridMultilevel"/>
     <w:tmpl w:val="53D223CC"/>
@@ -13436,7 +15616,346 @@
       </w:rPr>
     </w:lvl>
   </w:abstractNum>
-  <w:abstractNum w:abstractNumId="10" w15:restartNumberingAfterBreak="0">
+  <w:abstractNum w:abstractNumId="14" w15:restartNumberingAfterBreak="0">
+    <w:nsid w:val="3BB30096"/>
+    <w:multiLevelType w:val="hybridMultilevel"/>
+    <w:tmpl w:val="64940FDE"/>
+    <w:lvl w:ilvl="0" w:tplc="04090001">
+      <w:start w:val="1"/>
+      <w:numFmt w:val="bullet"/>
+      <w:lvlText w:val=""/>
+      <w:lvlJc w:val="left"/>
+      <w:pPr>
+        <w:ind w:left="720" w:hanging="360"/>
+      </w:pPr>
+      <w:rPr>
+        <w:rFonts w:ascii="Symbol" w:hAnsi="Symbol" w:hint="default"/>
+      </w:rPr>
+    </w:lvl>
+    <w:lvl w:ilvl="1" w:tplc="04090003">
+      <w:start w:val="1"/>
+      <w:numFmt w:val="bullet"/>
+      <w:lvlText w:val="o"/>
+      <w:lvlJc w:val="left"/>
+      <w:pPr>
+        <w:ind w:left="1440" w:hanging="360"/>
+      </w:pPr>
+      <w:rPr>
+        <w:rFonts w:ascii="Courier New" w:hAnsi="Courier New" w:cs="Courier New" w:hint="default"/>
+      </w:rPr>
+    </w:lvl>
+    <w:lvl w:ilvl="2" w:tplc="04090005" w:tentative="1">
+      <w:start w:val="1"/>
+      <w:numFmt w:val="bullet"/>
+      <w:lvlText w:val=""/>
+      <w:lvlJc w:val="left"/>
+      <w:pPr>
+        <w:ind w:left="2160" w:hanging="360"/>
+      </w:pPr>
+      <w:rPr>
+        <w:rFonts w:ascii="Wingdings" w:hAnsi="Wingdings" w:hint="default"/>
+      </w:rPr>
+    </w:lvl>
+    <w:lvl w:ilvl="3" w:tplc="04090001" w:tentative="1">
+      <w:start w:val="1"/>
+      <w:numFmt w:val="bullet"/>
+      <w:lvlText w:val=""/>
+      <w:lvlJc w:val="left"/>
+      <w:pPr>
+        <w:ind w:left="2880" w:hanging="360"/>
+      </w:pPr>
+      <w:rPr>
+        <w:rFonts w:ascii="Symbol" w:hAnsi="Symbol" w:hint="default"/>
+      </w:rPr>
+    </w:lvl>
+    <w:lvl w:ilvl="4" w:tplc="04090003" w:tentative="1">
+      <w:start w:val="1"/>
+      <w:numFmt w:val="bullet"/>
+      <w:lvlText w:val="o"/>
+      <w:lvlJc w:val="left"/>
+      <w:pPr>
+        <w:ind w:left="3600" w:hanging="360"/>
+      </w:pPr>
+      <w:rPr>
+        <w:rFonts w:ascii="Courier New" w:hAnsi="Courier New" w:cs="Courier New" w:hint="default"/>
+      </w:rPr>
+    </w:lvl>
+    <w:lvl w:ilvl="5" w:tplc="04090005" w:tentative="1">
+      <w:start w:val="1"/>
+      <w:numFmt w:val="bullet"/>
+      <w:lvlText w:val=""/>
+      <w:lvlJc w:val="left"/>
+      <w:pPr>
+        <w:ind w:left="4320" w:hanging="360"/>
+      </w:pPr>
+      <w:rPr>
+        <w:rFonts w:ascii="Wingdings" w:hAnsi="Wingdings" w:hint="default"/>
+      </w:rPr>
+    </w:lvl>
+    <w:lvl w:ilvl="6" w:tplc="04090001" w:tentative="1">
+      <w:start w:val="1"/>
+      <w:numFmt w:val="bullet"/>
+      <w:lvlText w:val=""/>
+      <w:lvlJc w:val="left"/>
+      <w:pPr>
+        <w:ind w:left="5040" w:hanging="360"/>
+      </w:pPr>
+      <w:rPr>
+        <w:rFonts w:ascii="Symbol" w:hAnsi="Symbol" w:hint="default"/>
+      </w:rPr>
+    </w:lvl>
+    <w:lvl w:ilvl="7" w:tplc="04090003" w:tentative="1">
+      <w:start w:val="1"/>
+      <w:numFmt w:val="bullet"/>
+      <w:lvlText w:val="o"/>
+      <w:lvlJc w:val="left"/>
+      <w:pPr>
+        <w:ind w:left="5760" w:hanging="360"/>
+      </w:pPr>
+      <w:rPr>
+        <w:rFonts w:ascii="Courier New" w:hAnsi="Courier New" w:cs="Courier New" w:hint="default"/>
+      </w:rPr>
+    </w:lvl>
+    <w:lvl w:ilvl="8" w:tplc="04090005" w:tentative="1">
+      <w:start w:val="1"/>
+      <w:numFmt w:val="bullet"/>
+      <w:lvlText w:val=""/>
+      <w:lvlJc w:val="left"/>
+      <w:pPr>
+        <w:ind w:left="6480" w:hanging="360"/>
+      </w:pPr>
+      <w:rPr>
+        <w:rFonts w:ascii="Wingdings" w:hAnsi="Wingdings" w:hint="default"/>
+      </w:rPr>
+    </w:lvl>
+  </w:abstractNum>
+  <w:abstractNum w:abstractNumId="15" w15:restartNumberingAfterBreak="0">
+    <w:nsid w:val="3F573567"/>
+    <w:multiLevelType w:val="hybridMultilevel"/>
+    <w:tmpl w:val="D73834D6"/>
+    <w:lvl w:ilvl="0" w:tplc="04090001">
+      <w:start w:val="1"/>
+      <w:numFmt w:val="bullet"/>
+      <w:lvlText w:val=""/>
+      <w:lvlJc w:val="left"/>
+      <w:pPr>
+        <w:ind w:left="720" w:hanging="360"/>
+      </w:pPr>
+      <w:rPr>
+        <w:rFonts w:ascii="Symbol" w:hAnsi="Symbol" w:hint="default"/>
+      </w:rPr>
+    </w:lvl>
+    <w:lvl w:ilvl="1" w:tplc="04090003">
+      <w:start w:val="1"/>
+      <w:numFmt w:val="bullet"/>
+      <w:lvlText w:val="o"/>
+      <w:lvlJc w:val="left"/>
+      <w:pPr>
+        <w:ind w:left="1440" w:hanging="360"/>
+      </w:pPr>
+      <w:rPr>
+        <w:rFonts w:ascii="Courier New" w:hAnsi="Courier New" w:cs="Courier New" w:hint="default"/>
+      </w:rPr>
+    </w:lvl>
+    <w:lvl w:ilvl="2" w:tplc="04090005" w:tentative="1">
+      <w:start w:val="1"/>
+      <w:numFmt w:val="bullet"/>
+      <w:lvlText w:val=""/>
+      <w:lvlJc w:val="left"/>
+      <w:pPr>
+        <w:ind w:left="2160" w:hanging="360"/>
+      </w:pPr>
+      <w:rPr>
+        <w:rFonts w:ascii="Wingdings" w:hAnsi="Wingdings" w:hint="default"/>
+      </w:rPr>
+    </w:lvl>
+    <w:lvl w:ilvl="3" w:tplc="04090001" w:tentative="1">
+      <w:start w:val="1"/>
+      <w:numFmt w:val="bullet"/>
+      <w:lvlText w:val=""/>
+      <w:lvlJc w:val="left"/>
+      <w:pPr>
+        <w:ind w:left="2880" w:hanging="360"/>
+      </w:pPr>
+      <w:rPr>
+        <w:rFonts w:ascii="Symbol" w:hAnsi="Symbol" w:hint="default"/>
+      </w:rPr>
+    </w:lvl>
+    <w:lvl w:ilvl="4" w:tplc="04090003" w:tentative="1">
+      <w:start w:val="1"/>
+      <w:numFmt w:val="bullet"/>
+      <w:lvlText w:val="o"/>
+      <w:lvlJc w:val="left"/>
+      <w:pPr>
+        <w:ind w:left="3600" w:hanging="360"/>
+      </w:pPr>
+      <w:rPr>
+        <w:rFonts w:ascii="Courier New" w:hAnsi="Courier New" w:cs="Courier New" w:hint="default"/>
+      </w:rPr>
+    </w:lvl>
+    <w:lvl w:ilvl="5" w:tplc="04090005" w:tentative="1">
+      <w:start w:val="1"/>
+      <w:numFmt w:val="bullet"/>
+      <w:lvlText w:val=""/>
+      <w:lvlJc w:val="left"/>
+      <w:pPr>
+        <w:ind w:left="4320" w:hanging="360"/>
+      </w:pPr>
+      <w:rPr>
+        <w:rFonts w:ascii="Wingdings" w:hAnsi="Wingdings" w:hint="default"/>
+      </w:rPr>
+    </w:lvl>
+    <w:lvl w:ilvl="6" w:tplc="04090001" w:tentative="1">
+      <w:start w:val="1"/>
+      <w:numFmt w:val="bullet"/>
+      <w:lvlText w:val=""/>
+      <w:lvlJc w:val="left"/>
+      <w:pPr>
+        <w:ind w:left="5040" w:hanging="360"/>
+      </w:pPr>
+      <w:rPr>
+        <w:rFonts w:ascii="Symbol" w:hAnsi="Symbol" w:hint="default"/>
+      </w:rPr>
+    </w:lvl>
+    <w:lvl w:ilvl="7" w:tplc="04090003" w:tentative="1">
+      <w:start w:val="1"/>
+      <w:numFmt w:val="bullet"/>
+      <w:lvlText w:val="o"/>
+      <w:lvlJc w:val="left"/>
+      <w:pPr>
+        <w:ind w:left="5760" w:hanging="360"/>
+      </w:pPr>
+      <w:rPr>
+        <w:rFonts w:ascii="Courier New" w:hAnsi="Courier New" w:cs="Courier New" w:hint="default"/>
+      </w:rPr>
+    </w:lvl>
+    <w:lvl w:ilvl="8" w:tplc="04090005" w:tentative="1">
+      <w:start w:val="1"/>
+      <w:numFmt w:val="bullet"/>
+      <w:lvlText w:val=""/>
+      <w:lvlJc w:val="left"/>
+      <w:pPr>
+        <w:ind w:left="6480" w:hanging="360"/>
+      </w:pPr>
+      <w:rPr>
+        <w:rFonts w:ascii="Wingdings" w:hAnsi="Wingdings" w:hint="default"/>
+      </w:rPr>
+    </w:lvl>
+  </w:abstractNum>
+  <w:abstractNum w:abstractNumId="16" w15:restartNumberingAfterBreak="0">
+    <w:nsid w:val="4A7D6E81"/>
+    <w:multiLevelType w:val="hybridMultilevel"/>
+    <w:tmpl w:val="0E6805EE"/>
+    <w:lvl w:ilvl="0" w:tplc="04090001">
+      <w:start w:val="1"/>
+      <w:numFmt w:val="bullet"/>
+      <w:lvlText w:val=""/>
+      <w:lvlJc w:val="left"/>
+      <w:pPr>
+        <w:ind w:left="720" w:hanging="360"/>
+      </w:pPr>
+      <w:rPr>
+        <w:rFonts w:ascii="Symbol" w:hAnsi="Symbol" w:hint="default"/>
+      </w:rPr>
+    </w:lvl>
+    <w:lvl w:ilvl="1" w:tplc="04090003">
+      <w:start w:val="1"/>
+      <w:numFmt w:val="bullet"/>
+      <w:lvlText w:val="o"/>
+      <w:lvlJc w:val="left"/>
+      <w:pPr>
+        <w:ind w:left="1440" w:hanging="360"/>
+      </w:pPr>
+      <w:rPr>
+        <w:rFonts w:ascii="Courier New" w:hAnsi="Courier New" w:cs="Courier New" w:hint="default"/>
+      </w:rPr>
+    </w:lvl>
+    <w:lvl w:ilvl="2" w:tplc="04090005" w:tentative="1">
+      <w:start w:val="1"/>
+      <w:numFmt w:val="bullet"/>
+      <w:lvlText w:val=""/>
+      <w:lvlJc w:val="left"/>
+      <w:pPr>
+        <w:ind w:left="2160" w:hanging="360"/>
+      </w:pPr>
+      <w:rPr>
+        <w:rFonts w:ascii="Wingdings" w:hAnsi="Wingdings" w:hint="default"/>
+      </w:rPr>
+    </w:lvl>
+    <w:lvl w:ilvl="3" w:tplc="04090001" w:tentative="1">
+      <w:start w:val="1"/>
+      <w:numFmt w:val="bullet"/>
+      <w:lvlText w:val=""/>
+      <w:lvlJc w:val="left"/>
+      <w:pPr>
+        <w:ind w:left="2880" w:hanging="360"/>
+      </w:pPr>
+      <w:rPr>
+        <w:rFonts w:ascii="Symbol" w:hAnsi="Symbol" w:hint="default"/>
+      </w:rPr>
+    </w:lvl>
+    <w:lvl w:ilvl="4" w:tplc="04090003" w:tentative="1">
+      <w:start w:val="1"/>
+      <w:numFmt w:val="bullet"/>
+      <w:lvlText w:val="o"/>
+      <w:lvlJc w:val="left"/>
+      <w:pPr>
+        <w:ind w:left="3600" w:hanging="360"/>
+      </w:pPr>
+      <w:rPr>
+        <w:rFonts w:ascii="Courier New" w:hAnsi="Courier New" w:cs="Courier New" w:hint="default"/>
+      </w:rPr>
+    </w:lvl>
+    <w:lvl w:ilvl="5" w:tplc="04090005" w:tentative="1">
+      <w:start w:val="1"/>
+      <w:numFmt w:val="bullet"/>
+      <w:lvlText w:val=""/>
+      <w:lvlJc w:val="left"/>
+      <w:pPr>
+        <w:ind w:left="4320" w:hanging="360"/>
+      </w:pPr>
+      <w:rPr>
+        <w:rFonts w:ascii="Wingdings" w:hAnsi="Wingdings" w:hint="default"/>
+      </w:rPr>
+    </w:lvl>
+    <w:lvl w:ilvl="6" w:tplc="04090001" w:tentative="1">
+      <w:start w:val="1"/>
+      <w:numFmt w:val="bullet"/>
+      <w:lvlText w:val=""/>
+      <w:lvlJc w:val="left"/>
+      <w:pPr>
+        <w:ind w:left="5040" w:hanging="360"/>
+      </w:pPr>
+      <w:rPr>
+        <w:rFonts w:ascii="Symbol" w:hAnsi="Symbol" w:hint="default"/>
+      </w:rPr>
+    </w:lvl>
+    <w:lvl w:ilvl="7" w:tplc="04090003" w:tentative="1">
+      <w:start w:val="1"/>
+      <w:numFmt w:val="bullet"/>
+      <w:lvlText w:val="o"/>
+      <w:lvlJc w:val="left"/>
+      <w:pPr>
+        <w:ind w:left="5760" w:hanging="360"/>
+      </w:pPr>
+      <w:rPr>
+        <w:rFonts w:ascii="Courier New" w:hAnsi="Courier New" w:cs="Courier New" w:hint="default"/>
+      </w:rPr>
+    </w:lvl>
+    <w:lvl w:ilvl="8" w:tplc="04090005" w:tentative="1">
+      <w:start w:val="1"/>
+      <w:numFmt w:val="bullet"/>
+      <w:lvlText w:val=""/>
+      <w:lvlJc w:val="left"/>
+      <w:pPr>
+        <w:ind w:left="6480" w:hanging="360"/>
+      </w:pPr>
+      <w:rPr>
+        <w:rFonts w:ascii="Wingdings" w:hAnsi="Wingdings" w:hint="default"/>
+      </w:rPr>
+    </w:lvl>
+  </w:abstractNum>
+  <w:abstractNum w:abstractNumId="17" w15:restartNumberingAfterBreak="0">
     <w:nsid w:val="50284443"/>
     <w:multiLevelType w:val="hybridMultilevel"/>
     <w:tmpl w:val="FEA25186"/>
@@ -13549,7 +16068,7 @@
       </w:rPr>
     </w:lvl>
   </w:abstractNum>
-  <w:abstractNum w:abstractNumId="11" w15:restartNumberingAfterBreak="0">
+  <w:abstractNum w:abstractNumId="18" w15:restartNumberingAfterBreak="0">
     <w:nsid w:val="613E407A"/>
     <w:multiLevelType w:val="hybridMultilevel"/>
     <w:tmpl w:val="AD62232E"/>
@@ -13662,7 +16181,233 @@
       </w:rPr>
     </w:lvl>
   </w:abstractNum>
-  <w:abstractNum w:abstractNumId="12" w15:restartNumberingAfterBreak="0">
+  <w:abstractNum w:abstractNumId="19" w15:restartNumberingAfterBreak="0">
+    <w:nsid w:val="61677C78"/>
+    <w:multiLevelType w:val="hybridMultilevel"/>
+    <w:tmpl w:val="A036CE9C"/>
+    <w:lvl w:ilvl="0" w:tplc="04090001">
+      <w:start w:val="1"/>
+      <w:numFmt w:val="bullet"/>
+      <w:lvlText w:val=""/>
+      <w:lvlJc w:val="left"/>
+      <w:pPr>
+        <w:ind w:left="720" w:hanging="360"/>
+      </w:pPr>
+      <w:rPr>
+        <w:rFonts w:ascii="Symbol" w:hAnsi="Symbol" w:hint="default"/>
+      </w:rPr>
+    </w:lvl>
+    <w:lvl w:ilvl="1" w:tplc="04090003">
+      <w:start w:val="1"/>
+      <w:numFmt w:val="bullet"/>
+      <w:lvlText w:val="o"/>
+      <w:lvlJc w:val="left"/>
+      <w:pPr>
+        <w:ind w:left="1440" w:hanging="360"/>
+      </w:pPr>
+      <w:rPr>
+        <w:rFonts w:ascii="Courier New" w:hAnsi="Courier New" w:cs="Courier New" w:hint="default"/>
+      </w:rPr>
+    </w:lvl>
+    <w:lvl w:ilvl="2" w:tplc="04090005" w:tentative="1">
+      <w:start w:val="1"/>
+      <w:numFmt w:val="bullet"/>
+      <w:lvlText w:val=""/>
+      <w:lvlJc w:val="left"/>
+      <w:pPr>
+        <w:ind w:left="2160" w:hanging="360"/>
+      </w:pPr>
+      <w:rPr>
+        <w:rFonts w:ascii="Wingdings" w:hAnsi="Wingdings" w:hint="default"/>
+      </w:rPr>
+    </w:lvl>
+    <w:lvl w:ilvl="3" w:tplc="04090001" w:tentative="1">
+      <w:start w:val="1"/>
+      <w:numFmt w:val="bullet"/>
+      <w:lvlText w:val=""/>
+      <w:lvlJc w:val="left"/>
+      <w:pPr>
+        <w:ind w:left="2880" w:hanging="360"/>
+      </w:pPr>
+      <w:rPr>
+        <w:rFonts w:ascii="Symbol" w:hAnsi="Symbol" w:hint="default"/>
+      </w:rPr>
+    </w:lvl>
+    <w:lvl w:ilvl="4" w:tplc="04090003" w:tentative="1">
+      <w:start w:val="1"/>
+      <w:numFmt w:val="bullet"/>
+      <w:lvlText w:val="o"/>
+      <w:lvlJc w:val="left"/>
+      <w:pPr>
+        <w:ind w:left="3600" w:hanging="360"/>
+      </w:pPr>
+      <w:rPr>
+        <w:rFonts w:ascii="Courier New" w:hAnsi="Courier New" w:cs="Courier New" w:hint="default"/>
+      </w:rPr>
+    </w:lvl>
+    <w:lvl w:ilvl="5" w:tplc="04090005" w:tentative="1">
+      <w:start w:val="1"/>
+      <w:numFmt w:val="bullet"/>
+      <w:lvlText w:val=""/>
+      <w:lvlJc w:val="left"/>
+      <w:pPr>
+        <w:ind w:left="4320" w:hanging="360"/>
+      </w:pPr>
+      <w:rPr>
+        <w:rFonts w:ascii="Wingdings" w:hAnsi="Wingdings" w:hint="default"/>
+      </w:rPr>
+    </w:lvl>
+    <w:lvl w:ilvl="6" w:tplc="04090001" w:tentative="1">
+      <w:start w:val="1"/>
+      <w:numFmt w:val="bullet"/>
+      <w:lvlText w:val=""/>
+      <w:lvlJc w:val="left"/>
+      <w:pPr>
+        <w:ind w:left="5040" w:hanging="360"/>
+      </w:pPr>
+      <w:rPr>
+        <w:rFonts w:ascii="Symbol" w:hAnsi="Symbol" w:hint="default"/>
+      </w:rPr>
+    </w:lvl>
+    <w:lvl w:ilvl="7" w:tplc="04090003" w:tentative="1">
+      <w:start w:val="1"/>
+      <w:numFmt w:val="bullet"/>
+      <w:lvlText w:val="o"/>
+      <w:lvlJc w:val="left"/>
+      <w:pPr>
+        <w:ind w:left="5760" w:hanging="360"/>
+      </w:pPr>
+      <w:rPr>
+        <w:rFonts w:ascii="Courier New" w:hAnsi="Courier New" w:cs="Courier New" w:hint="default"/>
+      </w:rPr>
+    </w:lvl>
+    <w:lvl w:ilvl="8" w:tplc="04090005" w:tentative="1">
+      <w:start w:val="1"/>
+      <w:numFmt w:val="bullet"/>
+      <w:lvlText w:val=""/>
+      <w:lvlJc w:val="left"/>
+      <w:pPr>
+        <w:ind w:left="6480" w:hanging="360"/>
+      </w:pPr>
+      <w:rPr>
+        <w:rFonts w:ascii="Wingdings" w:hAnsi="Wingdings" w:hint="default"/>
+      </w:rPr>
+    </w:lvl>
+  </w:abstractNum>
+  <w:abstractNum w:abstractNumId="20" w15:restartNumberingAfterBreak="0">
+    <w:nsid w:val="6DE81AFF"/>
+    <w:multiLevelType w:val="hybridMultilevel"/>
+    <w:tmpl w:val="A1606FD0"/>
+    <w:lvl w:ilvl="0" w:tplc="04090001">
+      <w:start w:val="1"/>
+      <w:numFmt w:val="bullet"/>
+      <w:lvlText w:val=""/>
+      <w:lvlJc w:val="left"/>
+      <w:pPr>
+        <w:ind w:left="720" w:hanging="360"/>
+      </w:pPr>
+      <w:rPr>
+        <w:rFonts w:ascii="Symbol" w:hAnsi="Symbol" w:hint="default"/>
+      </w:rPr>
+    </w:lvl>
+    <w:lvl w:ilvl="1" w:tplc="04090003">
+      <w:start w:val="1"/>
+      <w:numFmt w:val="bullet"/>
+      <w:lvlText w:val="o"/>
+      <w:lvlJc w:val="left"/>
+      <w:pPr>
+        <w:ind w:left="1440" w:hanging="360"/>
+      </w:pPr>
+      <w:rPr>
+        <w:rFonts w:ascii="Courier New" w:hAnsi="Courier New" w:cs="Courier New" w:hint="default"/>
+      </w:rPr>
+    </w:lvl>
+    <w:lvl w:ilvl="2" w:tplc="04090005" w:tentative="1">
+      <w:start w:val="1"/>
+      <w:numFmt w:val="bullet"/>
+      <w:lvlText w:val=""/>
+      <w:lvlJc w:val="left"/>
+      <w:pPr>
+        <w:ind w:left="2160" w:hanging="360"/>
+      </w:pPr>
+      <w:rPr>
+        <w:rFonts w:ascii="Wingdings" w:hAnsi="Wingdings" w:hint="default"/>
+      </w:rPr>
+    </w:lvl>
+    <w:lvl w:ilvl="3" w:tplc="04090001" w:tentative="1">
+      <w:start w:val="1"/>
+      <w:numFmt w:val="bullet"/>
+      <w:lvlText w:val=""/>
+      <w:lvlJc w:val="left"/>
+      <w:pPr>
+        <w:ind w:left="2880" w:hanging="360"/>
+      </w:pPr>
+      <w:rPr>
+        <w:rFonts w:ascii="Symbol" w:hAnsi="Symbol" w:hint="default"/>
+      </w:rPr>
+    </w:lvl>
+    <w:lvl w:ilvl="4" w:tplc="04090003" w:tentative="1">
+      <w:start w:val="1"/>
+      <w:numFmt w:val="bullet"/>
+      <w:lvlText w:val="o"/>
+      <w:lvlJc w:val="left"/>
+      <w:pPr>
+        <w:ind w:left="3600" w:hanging="360"/>
+      </w:pPr>
+      <w:rPr>
+        <w:rFonts w:ascii="Courier New" w:hAnsi="Courier New" w:cs="Courier New" w:hint="default"/>
+      </w:rPr>
+    </w:lvl>
+    <w:lvl w:ilvl="5" w:tplc="04090005" w:tentative="1">
+      <w:start w:val="1"/>
+      <w:numFmt w:val="bullet"/>
+      <w:lvlText w:val=""/>
+      <w:lvlJc w:val="left"/>
+      <w:pPr>
+        <w:ind w:left="4320" w:hanging="360"/>
+      </w:pPr>
+      <w:rPr>
+        <w:rFonts w:ascii="Wingdings" w:hAnsi="Wingdings" w:hint="default"/>
+      </w:rPr>
+    </w:lvl>
+    <w:lvl w:ilvl="6" w:tplc="04090001" w:tentative="1">
+      <w:start w:val="1"/>
+      <w:numFmt w:val="bullet"/>
+      <w:lvlText w:val=""/>
+      <w:lvlJc w:val="left"/>
+      <w:pPr>
+        <w:ind w:left="5040" w:hanging="360"/>
+      </w:pPr>
+      <w:rPr>
+        <w:rFonts w:ascii="Symbol" w:hAnsi="Symbol" w:hint="default"/>
+      </w:rPr>
+    </w:lvl>
+    <w:lvl w:ilvl="7" w:tplc="04090003" w:tentative="1">
+      <w:start w:val="1"/>
+      <w:numFmt w:val="bullet"/>
+      <w:lvlText w:val="o"/>
+      <w:lvlJc w:val="left"/>
+      <w:pPr>
+        <w:ind w:left="5760" w:hanging="360"/>
+      </w:pPr>
+      <w:rPr>
+        <w:rFonts w:ascii="Courier New" w:hAnsi="Courier New" w:cs="Courier New" w:hint="default"/>
+      </w:rPr>
+    </w:lvl>
+    <w:lvl w:ilvl="8" w:tplc="04090005" w:tentative="1">
+      <w:start w:val="1"/>
+      <w:numFmt w:val="bullet"/>
+      <w:lvlText w:val=""/>
+      <w:lvlJc w:val="left"/>
+      <w:pPr>
+        <w:ind w:left="6480" w:hanging="360"/>
+      </w:pPr>
+      <w:rPr>
+        <w:rFonts w:ascii="Wingdings" w:hAnsi="Wingdings" w:hint="default"/>
+      </w:rPr>
+    </w:lvl>
+  </w:abstractNum>
+  <w:abstractNum w:abstractNumId="21" w15:restartNumberingAfterBreak="0">
     <w:nsid w:val="743E3062"/>
     <w:multiLevelType w:val="hybridMultilevel"/>
     <w:tmpl w:val="ABEACF4A"/>
@@ -13775,7 +16520,7 @@
       </w:rPr>
     </w:lvl>
   </w:abstractNum>
-  <w:abstractNum w:abstractNumId="13" w15:restartNumberingAfterBreak="0">
+  <w:abstractNum w:abstractNumId="22" w15:restartNumberingAfterBreak="0">
     <w:nsid w:val="775D037E"/>
     <w:multiLevelType w:val="hybridMultilevel"/>
     <w:tmpl w:val="2E9447AE"/>
@@ -13888,7 +16633,7 @@
       </w:rPr>
     </w:lvl>
   </w:abstractNum>
-  <w:abstractNum w:abstractNumId="14" w15:restartNumberingAfterBreak="0">
+  <w:abstractNum w:abstractNumId="23" w15:restartNumberingAfterBreak="0">
     <w:nsid w:val="7A6C5A9D"/>
     <w:multiLevelType w:val="hybridMultilevel"/>
     <w:tmpl w:val="E1FAD9AC"/>
@@ -14002,16 +16747,16 @@
     </w:lvl>
   </w:abstractNum>
   <w:num w:numId="1" w16cid:durableId="2092040216">
-    <w:abstractNumId w:val="7"/>
+    <w:abstractNumId w:val="11"/>
   </w:num>
   <w:num w:numId="2" w16cid:durableId="1118570834">
-    <w:abstractNumId w:val="9"/>
+    <w:abstractNumId w:val="13"/>
   </w:num>
   <w:num w:numId="3" w16cid:durableId="2073577879">
-    <w:abstractNumId w:val="14"/>
+    <w:abstractNumId w:val="23"/>
   </w:num>
   <w:num w:numId="4" w16cid:durableId="1438022743">
-    <w:abstractNumId w:val="11"/>
+    <w:abstractNumId w:val="18"/>
   </w:num>
   <w:num w:numId="5" w16cid:durableId="1123305079">
     <w:abstractNumId w:val="2"/>
@@ -14020,31 +16765,58 @@
     <w:abstractNumId w:val="0"/>
   </w:num>
   <w:num w:numId="7" w16cid:durableId="1301422900">
-    <w:abstractNumId w:val="6"/>
+    <w:abstractNumId w:val="10"/>
   </w:num>
   <w:num w:numId="8" w16cid:durableId="1601376000">
-    <w:abstractNumId w:val="3"/>
+    <w:abstractNumId w:val="5"/>
   </w:num>
   <w:num w:numId="9" w16cid:durableId="566959602">
-    <w:abstractNumId w:val="13"/>
+    <w:abstractNumId w:val="22"/>
   </w:num>
   <w:num w:numId="10" w16cid:durableId="1179849236">
-    <w:abstractNumId w:val="4"/>
+    <w:abstractNumId w:val="8"/>
   </w:num>
   <w:num w:numId="11" w16cid:durableId="1373724045">
-    <w:abstractNumId w:val="5"/>
+    <w:abstractNumId w:val="9"/>
   </w:num>
   <w:num w:numId="12" w16cid:durableId="1639215108">
     <w:abstractNumId w:val="1"/>
   </w:num>
   <w:num w:numId="13" w16cid:durableId="681783632">
+    <w:abstractNumId w:val="21"/>
+  </w:num>
+  <w:num w:numId="14" w16cid:durableId="1810591409">
+    <w:abstractNumId w:val="17"/>
+  </w:num>
+  <w:num w:numId="15" w16cid:durableId="1042365741">
     <w:abstractNumId w:val="12"/>
   </w:num>
-  <w:num w:numId="14" w16cid:durableId="1810591409">
-    <w:abstractNumId w:val="10"/>
+  <w:num w:numId="16" w16cid:durableId="279381794">
+    <w:abstractNumId w:val="19"/>
   </w:num>
-  <w:num w:numId="15" w16cid:durableId="1042365741">
-    <w:abstractNumId w:val="8"/>
+  <w:num w:numId="17" w16cid:durableId="326447347">
+    <w:abstractNumId w:val="3"/>
+  </w:num>
+  <w:num w:numId="18" w16cid:durableId="55203396">
+    <w:abstractNumId w:val="6"/>
+  </w:num>
+  <w:num w:numId="19" w16cid:durableId="301036789">
+    <w:abstractNumId w:val="7"/>
+  </w:num>
+  <w:num w:numId="20" w16cid:durableId="953169648">
+    <w:abstractNumId w:val="16"/>
+  </w:num>
+  <w:num w:numId="21" w16cid:durableId="912007967">
+    <w:abstractNumId w:val="4"/>
+  </w:num>
+  <w:num w:numId="22" w16cid:durableId="696079386">
+    <w:abstractNumId w:val="14"/>
+  </w:num>
+  <w:num w:numId="23" w16cid:durableId="2103598017">
+    <w:abstractNumId w:val="15"/>
+  </w:num>
+  <w:num w:numId="24" w16cid:durableId="1968586231">
+    <w:abstractNumId w:val="20"/>
   </w:num>
 </w:numbering>
 </file>
@@ -14499,7 +17271,6 @@
     <w:next w:val="Normal"/>
     <w:link w:val="Heading3Char"/>
     <w:uiPriority w:val="9"/>
-    <w:semiHidden/>
     <w:unhideWhenUsed/>
     <w:qFormat/>
     <w:rsid w:val="00A66759"/>
@@ -14651,7 +17422,6 @@
   <w:style w:type="character" w:default="1" w:styleId="DefaultParagraphFont">
     <w:name w:val="Default Paragraph Font"/>
     <w:uiPriority w:val="1"/>
-    <w:semiHidden/>
     <w:unhideWhenUsed/>
   </w:style>
   <w:style w:type="table" w:default="1" w:styleId="TableNormal">
@@ -14706,7 +17476,6 @@
     <w:basedOn w:val="DefaultParagraphFont"/>
     <w:link w:val="Heading3"/>
     <w:uiPriority w:val="9"/>
-    <w:semiHidden/>
     <w:rsid w:val="00A66759"/>
     <w:rPr>
       <w:rFonts w:eastAsiaTheme="majorEastAsia" w:cstheme="majorBidi"/>

</xml_diff>